<commit_message>
[SAFRAN-1240] E-BookStore - Fix Graal template due to M2Doc 4.0.0 and regenerate docx samples
</commit_message>
<xml_diff>
--- a/samples/plugins/org.obeonetwork.is.samples/contents/E-BookStore/documentation/doc-src/E-BookStore_Cinematic_template.generated.docx
+++ b/samples/plugins/org.obeonetwork.is.samples/contents/E-BookStore/documentation/doc-src/E-BookStore_Cinematic_template.generated.docx
@@ -892,13 +892,6 @@
       </w:tr>
     </w:tbl>
     <w:p>
-      <w:pPr>
-        <w:pStyle w:val="western"/>
-        <w:spacing w:after="240"/>
-        <w:rPr>
-          <w:highlight w:val="green"/>
-        </w:rPr>
-      </w:pPr>
       <w:pPr>
         <w:pStyle w:val="western"/>
         <w:spacing w:after="240"/>
@@ -2058,12 +2051,12 @@
                     <w:drawing>
                       <wp:inline distT="0" distR="0" distB="0" distL="0">
                         <wp:extent cx="203200" cy="203200"/>
-                        <wp:docPr id="0" name="Drawing 0" descr="file:/C:/Users/VINCEN~1/AppData/Local/Temp/CinematicRoot__47-1sBVIEeetFdz5pzgWAw17144564055225945493.png"/>
+                        <wp:docPr id="0" name="Drawing 0" descr="file:/tmp/CinematicRoot__47-1sBVIEeetFdz5pzgWAw11353336565241744010.png"/>
                         <a:graphic xmlns:a="http://schemas.openxmlformats.org/drawingml/2006/main">
                           <a:graphicData uri="http://schemas.openxmlformats.org/drawingml/2006/picture">
                             <pic:pic xmlns:pic="http://schemas.openxmlformats.org/drawingml/2006/picture">
                               <pic:nvPicPr>
-                                <pic:cNvPr id="0" name="Picture 0" descr="file:/C:/Users/VINCEN~1/AppData/Local/Temp/CinematicRoot__47-1sBVIEeetFdz5pzgWAw17144564055225945493.png"/>
+                                <pic:cNvPr id="0" name="Picture 0" descr="file:/tmp/CinematicRoot__47-1sBVIEeetFdz5pzgWAw11353336565241744010.png"/>
                                 <pic:cNvPicPr>
                                   <a:picLocks noChangeAspect="true"/>
                                 </pic:cNvPicPr>
@@ -2124,12 +2117,12 @@
                     <w:drawing>
                       <wp:inline distT="0" distR="0" distB="0" distL="0">
                         <wp:extent cx="203200" cy="203200"/>
-                        <wp:docPr id="1" name="Drawing 1" descr="file:/C:/Users/VINCEN~1/AppData/Local/Temp/Package__48qyPBVIEeetFdz5pzgWAw3156353484320960543.png"/>
+                        <wp:docPr id="1" name="Drawing 1" descr="file:/tmp/Package__48qyPBVIEeetFdz5pzgWAw7872905843181545527.png"/>
                         <a:graphic xmlns:a="http://schemas.openxmlformats.org/drawingml/2006/main">
                           <a:graphicData uri="http://schemas.openxmlformats.org/drawingml/2006/picture">
                             <pic:pic xmlns:pic="http://schemas.openxmlformats.org/drawingml/2006/picture">
                               <pic:nvPicPr>
-                                <pic:cNvPr id="0" name="Picture 1" descr="file:/C:/Users/VINCEN~1/AppData/Local/Temp/Package__48qyPBVIEeetFdz5pzgWAw3156353484320960543.png"/>
+                                <pic:cNvPr id="0" name="Picture 1" descr="file:/tmp/Package__48qyPBVIEeetFdz5pzgWAw7872905843181545527.png"/>
                                 <pic:cNvPicPr>
                                   <a:picLocks noChangeAspect="true"/>
                                 </pic:cNvPicPr>
@@ -2190,12 +2183,12 @@
                     <w:drawing>
                       <wp:inline distT="0" distR="0" distB="0" distL="0">
                         <wp:extent cx="203200" cy="203200"/>
-                        <wp:docPr id="2" name="Drawing 2" descr="file:/C:/Users/VINCEN~1/AppData/Local/Temp/ViewContainer__48gaJBVIEeetFdz5pzgWAw1517716564837058667.png"/>
+                        <wp:docPr id="2" name="Drawing 2" descr="file:/tmp/ViewContainer__48gaJBVIEeetFdz5pzgWAw15355073053068983889.png"/>
                         <a:graphic xmlns:a="http://schemas.openxmlformats.org/drawingml/2006/main">
                           <a:graphicData uri="http://schemas.openxmlformats.org/drawingml/2006/picture">
                             <pic:pic xmlns:pic="http://schemas.openxmlformats.org/drawingml/2006/picture">
                               <pic:nvPicPr>
-                                <pic:cNvPr id="0" name="Picture 2" descr="file:/C:/Users/VINCEN~1/AppData/Local/Temp/ViewContainer__48gaJBVIEeetFdz5pzgWAw1517716564837058667.png"/>
+                                <pic:cNvPr id="0" name="Picture 2" descr="file:/tmp/ViewContainer__48gaJBVIEeetFdz5pzgWAw15355073053068983889.png"/>
                                 <pic:cNvPicPr>
                                   <a:picLocks noChangeAspect="true"/>
                                 </pic:cNvPicPr>
@@ -2256,12 +2249,12 @@
                     <w:drawing>
                       <wp:inline distT="0" distR="0" distB="0" distL="0">
                         <wp:extent cx="203200" cy="203200"/>
-                        <wp:docPr id="3" name="Drawing 3" descr="file:/C:/Users/VINCEN~1/AppData/Local/Temp/ViewContainer__48qLRRVIEeetFdz5pzgWAw1287156450070298085.png"/>
+                        <wp:docPr id="3" name="Drawing 3" descr="file:/tmp/ViewContainer__48qLRRVIEeetFdz5pzgWAw363649048786183271.png"/>
                         <a:graphic xmlns:a="http://schemas.openxmlformats.org/drawingml/2006/main">
                           <a:graphicData uri="http://schemas.openxmlformats.org/drawingml/2006/picture">
                             <pic:pic xmlns:pic="http://schemas.openxmlformats.org/drawingml/2006/picture">
                               <pic:nvPicPr>
-                                <pic:cNvPr id="0" name="Picture 3" descr="file:/C:/Users/VINCEN~1/AppData/Local/Temp/ViewContainer__48qLRRVIEeetFdz5pzgWAw1287156450070298085.png"/>
+                                <pic:cNvPr id="0" name="Picture 3" descr="file:/tmp/ViewContainer__48qLRRVIEeetFdz5pzgWAw363649048786183271.png"/>
                                 <pic:cNvPicPr>
                                   <a:picLocks noChangeAspect="true"/>
                                 </pic:cNvPicPr>
@@ -2322,12 +2315,12 @@
                     <w:drawing>
                       <wp:inline distT="0" distR="0" distB="0" distL="0">
                         <wp:extent cx="203200" cy="203200"/>
-                        <wp:docPr id="4" name="Drawing 4" descr="file:/C:/Users/VINCEN~1/AppData/Local/Temp/Toolkit__IxeAcKLCEeuqs9mIRWXCLA11954182952407783501.png"/>
+                        <wp:docPr id="4" name="Drawing 4" descr="file:/tmp/Toolkit__IxeAcKLCEeuqs9mIRWXCLA5063673587357248721.png"/>
                         <a:graphic xmlns:a="http://schemas.openxmlformats.org/drawingml/2006/main">
                           <a:graphicData uri="http://schemas.openxmlformats.org/drawingml/2006/picture">
                             <pic:pic xmlns:pic="http://schemas.openxmlformats.org/drawingml/2006/picture">
                               <pic:nvPicPr>
-                                <pic:cNvPr id="0" name="Picture 4" descr="file:/C:/Users/VINCEN~1/AppData/Local/Temp/Toolkit__IxeAcKLCEeuqs9mIRWXCLA11954182952407783501.png"/>
+                                <pic:cNvPr id="0" name="Picture 4" descr="file:/tmp/Toolkit__IxeAcKLCEeuqs9mIRWXCLA5063673587357248721.png"/>
                                 <pic:cNvPicPr>
                                   <a:picLocks noChangeAspect="true"/>
                                 </pic:cNvPicPr>
@@ -2612,12 +2605,12 @@
                     <w:drawing>
                       <wp:inline distT="0" distR="0" distB="0" distL="0">
                         <wp:extent cx="203200" cy="203200"/>
-                        <wp:docPr id="5" name="Drawing 5" descr="file:/C:/Users/VINCEN~1/AppData/Local/Temp/ViewContainer__48gaJBVIEeetFdz5pzgWAw4002807766714603955.png"/>
+                        <wp:docPr id="5" name="Drawing 5" descr="file:/tmp/ViewContainer__48gaJBVIEeetFdz5pzgWAw7043107571246062328.png"/>
                         <a:graphic xmlns:a="http://schemas.openxmlformats.org/drawingml/2006/main">
                           <a:graphicData uri="http://schemas.openxmlformats.org/drawingml/2006/picture">
                             <pic:pic xmlns:pic="http://schemas.openxmlformats.org/drawingml/2006/picture">
                               <pic:nvPicPr>
-                                <pic:cNvPr id="0" name="Picture 5" descr="file:/C:/Users/VINCEN~1/AppData/Local/Temp/ViewContainer__48gaJBVIEeetFdz5pzgWAw4002807766714603955.png"/>
+                                <pic:cNvPr id="0" name="Picture 5" descr="file:/tmp/ViewContainer__48gaJBVIEeetFdz5pzgWAw7043107571246062328.png"/>
                                 <pic:cNvPicPr>
                                   <a:picLocks noChangeAspect="true"/>
                                 </pic:cNvPicPr>
@@ -2678,12 +2671,12 @@
                     <w:drawing>
                       <wp:inline distT="0" distR="0" distB="0" distL="0">
                         <wp:extent cx="203200" cy="203200"/>
-                        <wp:docPr id="6" name="Drawing 6" descr="file:/C:/Users/VINCEN~1/AppData/Local/Temp/ViewContainer__48jdcBVIEeetFdz5pzgWAw17105837199423155917.png"/>
+                        <wp:docPr id="6" name="Drawing 6" descr="file:/tmp/ViewContainer__48jdcBVIEeetFdz5pzgWAw15371829056021384825.png"/>
                         <a:graphic xmlns:a="http://schemas.openxmlformats.org/drawingml/2006/main">
                           <a:graphicData uri="http://schemas.openxmlformats.org/drawingml/2006/picture">
                             <pic:pic xmlns:pic="http://schemas.openxmlformats.org/drawingml/2006/picture">
                               <pic:nvPicPr>
-                                <pic:cNvPr id="0" name="Picture 6" descr="file:/C:/Users/VINCEN~1/AppData/Local/Temp/ViewContainer__48jdcBVIEeetFdz5pzgWAw17105837199423155917.png"/>
+                                <pic:cNvPr id="0" name="Picture 6" descr="file:/tmp/ViewContainer__48jdcBVIEeetFdz5pzgWAw15371829056021384825.png"/>
                                 <pic:cNvPicPr>
                                   <a:picLocks noChangeAspect="true"/>
                                 </pic:cNvPicPr>
@@ -2744,12 +2737,12 @@
                     <w:drawing>
                       <wp:inline distT="0" distR="0" distB="0" distL="0">
                         <wp:extent cx="203200" cy="203200"/>
-                        <wp:docPr id="7" name="Drawing 7" descr="file:/C:/Users/VINCEN~1/AppData/Local/Temp/ViewContainer__48qLIBVIEeetFdz5pzgWAw17778204956538552456.png"/>
+                        <wp:docPr id="7" name="Drawing 7" descr="file:/tmp/ViewContainer__48qLIBVIEeetFdz5pzgWAw11493395312212176430.png"/>
                         <a:graphic xmlns:a="http://schemas.openxmlformats.org/drawingml/2006/main">
                           <a:graphicData uri="http://schemas.openxmlformats.org/drawingml/2006/picture">
                             <pic:pic xmlns:pic="http://schemas.openxmlformats.org/drawingml/2006/picture">
                               <pic:nvPicPr>
-                                <pic:cNvPr id="0" name="Picture 7" descr="file:/C:/Users/VINCEN~1/AppData/Local/Temp/ViewContainer__48qLIBVIEeetFdz5pzgWAw17778204956538552456.png"/>
+                                <pic:cNvPr id="0" name="Picture 7" descr="file:/tmp/ViewContainer__48qLIBVIEeetFdz5pzgWAw11493395312212176430.png"/>
                                 <pic:cNvPicPr>
                                   <a:picLocks noChangeAspect="true"/>
                                 </pic:cNvPicPr>
@@ -2810,12 +2803,12 @@
                     <w:drawing>
                       <wp:inline distT="0" distR="0" distB="0" distL="0">
                         <wp:extent cx="203200" cy="203200"/>
-                        <wp:docPr id="8" name="Drawing 8" descr="file:/C:/Users/VINCEN~1/AppData/Local/Temp/ViewContainer__48qLLxVIEeetFdz5pzgWAw11123405822057238166.png"/>
+                        <wp:docPr id="8" name="Drawing 8" descr="file:/tmp/ViewContainer__48qLLxVIEeetFdz5pzgWAw10459336326838330845.png"/>
                         <a:graphic xmlns:a="http://schemas.openxmlformats.org/drawingml/2006/main">
                           <a:graphicData uri="http://schemas.openxmlformats.org/drawingml/2006/picture">
                             <pic:pic xmlns:pic="http://schemas.openxmlformats.org/drawingml/2006/picture">
                               <pic:nvPicPr>
-                                <pic:cNvPr id="0" name="Picture 8" descr="file:/C:/Users/VINCEN~1/AppData/Local/Temp/ViewContainer__48qLLxVIEeetFdz5pzgWAw11123405822057238166.png"/>
+                                <pic:cNvPr id="0" name="Picture 8" descr="file:/tmp/ViewContainer__48qLLxVIEeetFdz5pzgWAw10459336326838330845.png"/>
                                 <pic:cNvPicPr>
                                   <a:picLocks noChangeAspect="true"/>
                                 </pic:cNvPicPr>
@@ -2878,13 +2871,13 @@
               <w:t/>
               <w:drawing>
                 <wp:inline distT="0" distR="0" distB="0" distL="0">
-                  <wp:extent cx="5080000" cy="30480000"/>
-                  <wp:docPr id="9" name="Drawing 9" descr="file:/C:/Users/VINCEN~1/AppData/Local/Temp/HomePage%20View%20Container%20Mockup_copy-m2doc12361622658641639090.jpg"/>
+                  <wp:extent cx="5080000" cy="3365500"/>
+                  <wp:docPr id="9" name="Drawing 9" descr="file:/tmp/HomePage%20View%20Container%20Mockup_copy-m2doc12176188487080981016.jpg"/>
                   <a:graphic xmlns:a="http://schemas.openxmlformats.org/drawingml/2006/main">
                     <a:graphicData uri="http://schemas.openxmlformats.org/drawingml/2006/picture">
                       <pic:pic xmlns:pic="http://schemas.openxmlformats.org/drawingml/2006/picture">
                         <pic:nvPicPr>
-                          <pic:cNvPr id="0" name="Picture 9" descr="file:/C:/Users/VINCEN~1/AppData/Local/Temp/HomePage%20View%20Container%20Mockup_copy-m2doc12361622658641639090.jpg"/>
+                          <pic:cNvPr id="0" name="Picture 9" descr="file:/tmp/HomePage%20View%20Container%20Mockup_copy-m2doc12176188487080981016.jpg"/>
                           <pic:cNvPicPr>
                             <a:picLocks noChangeAspect="true"/>
                           </pic:cNvPicPr>
@@ -2898,7 +2891,7 @@
                         <pic:spPr>
                           <a:xfrm>
                             <a:off x="0" y="0"/>
-                            <a:ext cx="5080000" cy="30480000"/>
+                            <a:ext cx="5080000" cy="3365500"/>
                           </a:xfrm>
                           <a:prstGeom prst="rect">
                             <a:avLst/>
@@ -4536,12 +4529,12 @@
                     <w:drawing>
                       <wp:inline distT="0" distR="0" distB="0" distL="0">
                         <wp:extent cx="203200" cy="203200"/>
-                        <wp:docPr id="10" name="Drawing 10" descr="file:/C:/Users/VINCEN~1/AppData/Local/Temp/ViewContainer__48qLRRVIEeetFdz5pzgWAw666371060173909460.png"/>
+                        <wp:docPr id="10" name="Drawing 10" descr="file:/tmp/ViewContainer__48qLRRVIEeetFdz5pzgWAw1002355104101148279.png"/>
                         <a:graphic xmlns:a="http://schemas.openxmlformats.org/drawingml/2006/main">
                           <a:graphicData uri="http://schemas.openxmlformats.org/drawingml/2006/picture">
                             <pic:pic xmlns:pic="http://schemas.openxmlformats.org/drawingml/2006/picture">
                               <pic:nvPicPr>
-                                <pic:cNvPr id="0" name="Picture 10" descr="file:/C:/Users/VINCEN~1/AppData/Local/Temp/ViewContainer__48qLRRVIEeetFdz5pzgWAw666371060173909460.png"/>
+                                <pic:cNvPr id="0" name="Picture 10" descr="file:/tmp/ViewContainer__48qLRRVIEeetFdz5pzgWAw1002355104101148279.png"/>
                                 <pic:cNvPicPr>
                                   <a:picLocks noChangeAspect="true"/>
                                 </pic:cNvPicPr>
@@ -4604,19 +4597,19 @@
               <w:t/>
               <w:drawing>
                 <wp:inline distT="0" distR="0" distB="0" distL="0">
-                  <wp:extent cx="5080000" cy="30480000"/>
-                  <wp:docPr id="11" name="Drawing 11" descr="file:/C:/Users/VINCEN~1/AppData/Local/Temp/CreateAccount%20View%20Container%20Mockup_copy-m2doc3135457515376733349.jpg"/>
+                  <wp:extent cx="5080000" cy="3352800"/>
+                  <wp:docPr id="11" name="Drawing 11" descr="file:/tmp/CreateAccount%20View%20Container%20Mockup_copy-m2doc9653542254228849561.jpg"/>
                   <a:graphic xmlns:a="http://schemas.openxmlformats.org/drawingml/2006/main">
                     <a:graphicData uri="http://schemas.openxmlformats.org/drawingml/2006/picture">
                       <pic:pic xmlns:pic="http://schemas.openxmlformats.org/drawingml/2006/picture">
                         <pic:nvPicPr>
-                          <pic:cNvPr id="0" name="Picture 11" descr="file:/C:/Users/VINCEN~1/AppData/Local/Temp/CreateAccount%20View%20Container%20Mockup_copy-m2doc3135457515376733349.jpg"/>
+                          <pic:cNvPr id="0" name="Picture 11" descr="file:/tmp/CreateAccount%20View%20Container%20Mockup_copy-m2doc9653542254228849561.jpg"/>
                           <pic:cNvPicPr>
                             <a:picLocks noChangeAspect="true"/>
                           </pic:cNvPicPr>
                         </pic:nvPicPr>
                         <pic:blipFill>
-                          <a:blip r:embed="rId18"/>
+                          <a:blip r:embed="rId19"/>
                           <a:stretch>
                             <a:fillRect/>
                           </a:stretch>
@@ -4624,7 +4617,7 @@
                         <pic:spPr>
                           <a:xfrm>
                             <a:off x="0" y="0"/>
-                            <a:ext cx="5080000" cy="30480000"/>
+                            <a:ext cx="5080000" cy="3352800"/>
                           </a:xfrm>
                           <a:prstGeom prst="rect">
                             <a:avLst/>
@@ -7032,12 +7025,12 @@
                     <w:drawing>
                       <wp:inline distT="0" distR="0" distB="0" distL="0">
                         <wp:extent cx="203200" cy="203200"/>
-                        <wp:docPr id="12" name="Drawing 12" descr="file:/C:/Users/VINCEN~1/AppData/Local/Temp/Package__48qyPBVIEeetFdz5pzgWAw11053075683524729274.png"/>
+                        <wp:docPr id="12" name="Drawing 12" descr="file:/tmp/Package__48qyPBVIEeetFdz5pzgWAw12418580266353415706.png"/>
                         <a:graphic xmlns:a="http://schemas.openxmlformats.org/drawingml/2006/main">
                           <a:graphicData uri="http://schemas.openxmlformats.org/drawingml/2006/picture">
                             <pic:pic xmlns:pic="http://schemas.openxmlformats.org/drawingml/2006/picture">
                               <pic:nvPicPr>
-                                <pic:cNvPr id="0" name="Picture 12" descr="file:/C:/Users/VINCEN~1/AppData/Local/Temp/Package__48qyPBVIEeetFdz5pzgWAw11053075683524729274.png"/>
+                                <pic:cNvPr id="0" name="Picture 12" descr="file:/tmp/Package__48qyPBVIEeetFdz5pzgWAw12418580266353415706.png"/>
                                 <pic:cNvPicPr>
                                   <a:picLocks noChangeAspect="true"/>
                                 </pic:cNvPicPr>
@@ -7098,12 +7091,12 @@
                     <w:drawing>
                       <wp:inline distT="0" distR="0" distB="0" distL="0">
                         <wp:extent cx="203200" cy="203200"/>
-                        <wp:docPr id="13" name="Drawing 13" descr="file:/C:/Users/VINCEN~1/AppData/Local/Temp/ViewContainer__48vDrhVIEeetFdz5pzgWAw17181710075158820436.png"/>
+                        <wp:docPr id="13" name="Drawing 13" descr="file:/tmp/ViewContainer__48vDrhVIEeetFdz5pzgWAw4063899638983615070.png"/>
                         <a:graphic xmlns:a="http://schemas.openxmlformats.org/drawingml/2006/main">
                           <a:graphicData uri="http://schemas.openxmlformats.org/drawingml/2006/picture">
                             <pic:pic xmlns:pic="http://schemas.openxmlformats.org/drawingml/2006/picture">
                               <pic:nvPicPr>
-                                <pic:cNvPr id="0" name="Picture 13" descr="file:/C:/Users/VINCEN~1/AppData/Local/Temp/ViewContainer__48vDrhVIEeetFdz5pzgWAw17181710075158820436.png"/>
+                                <pic:cNvPr id="0" name="Picture 13" descr="file:/tmp/ViewContainer__48vDrhVIEeetFdz5pzgWAw4063899638983615070.png"/>
                                 <pic:cNvPicPr>
                                   <a:picLocks noChangeAspect="true"/>
                                 </pic:cNvPicPr>
@@ -7164,12 +7157,12 @@
                     <w:drawing>
                       <wp:inline distT="0" distR="0" distB="0" distL="0">
                         <wp:extent cx="203200" cy="203200"/>
-                        <wp:docPr id="14" name="Drawing 14" descr="file:/C:/Users/VINCEN~1/AppData/Local/Temp/ViewContainer__48vDwBVIEeetFdz5pzgWAw856987872261879362.png"/>
+                        <wp:docPr id="14" name="Drawing 14" descr="file:/tmp/ViewContainer__48vDwBVIEeetFdz5pzgWAw14995166363267004761.png"/>
                         <a:graphic xmlns:a="http://schemas.openxmlformats.org/drawingml/2006/main">
                           <a:graphicData uri="http://schemas.openxmlformats.org/drawingml/2006/picture">
                             <pic:pic xmlns:pic="http://schemas.openxmlformats.org/drawingml/2006/picture">
                               <pic:nvPicPr>
-                                <pic:cNvPr id="0" name="Picture 14" descr="file:/C:/Users/VINCEN~1/AppData/Local/Temp/ViewContainer__48vDwBVIEeetFdz5pzgWAw856987872261879362.png"/>
+                                <pic:cNvPr id="0" name="Picture 14" descr="file:/tmp/ViewContainer__48vDwBVIEeetFdz5pzgWAw14995166363267004761.png"/>
                                 <pic:cNvPicPr>
                                   <a:picLocks noChangeAspect="true"/>
                                 </pic:cNvPicPr>
@@ -7434,12 +7427,12 @@
                     <w:drawing>
                       <wp:inline distT="0" distR="0" distB="0" distL="0">
                         <wp:extent cx="203200" cy="203200"/>
-                        <wp:docPr id="15" name="Drawing 15" descr="file:/C:/Users/VINCEN~1/AppData/Local/Temp/ViewContainer__48vDrhVIEeetFdz5pzgWAw624733828137105454.png"/>
+                        <wp:docPr id="15" name="Drawing 15" descr="file:/tmp/ViewContainer__48vDrhVIEeetFdz5pzgWAw16191188910132853105.png"/>
                         <a:graphic xmlns:a="http://schemas.openxmlformats.org/drawingml/2006/main">
                           <a:graphicData uri="http://schemas.openxmlformats.org/drawingml/2006/picture">
                             <pic:pic xmlns:pic="http://schemas.openxmlformats.org/drawingml/2006/picture">
                               <pic:nvPicPr>
-                                <pic:cNvPr id="0" name="Picture 15" descr="file:/C:/Users/VINCEN~1/AppData/Local/Temp/ViewContainer__48vDrhVIEeetFdz5pzgWAw624733828137105454.png"/>
+                                <pic:cNvPr id="0" name="Picture 15" descr="file:/tmp/ViewContainer__48vDrhVIEeetFdz5pzgWAw16191188910132853105.png"/>
                                 <pic:cNvPicPr>
                                   <a:picLocks noChangeAspect="true"/>
                                 </pic:cNvPicPr>
@@ -9397,12 +9390,12 @@
                     <w:drawing>
                       <wp:inline distT="0" distR="0" distB="0" distL="0">
                         <wp:extent cx="203200" cy="203200"/>
-                        <wp:docPr id="16" name="Drawing 16" descr="file:/C:/Users/VINCEN~1/AppData/Local/Temp/ViewContainer__48vDwBVIEeetFdz5pzgWAw3571570655121555378.png"/>
+                        <wp:docPr id="16" name="Drawing 16" descr="file:/tmp/ViewContainer__48vDwBVIEeetFdz5pzgWAw2796940961685463619.png"/>
                         <a:graphic xmlns:a="http://schemas.openxmlformats.org/drawingml/2006/main">
                           <a:graphicData uri="http://schemas.openxmlformats.org/drawingml/2006/picture">
                             <pic:pic xmlns:pic="http://schemas.openxmlformats.org/drawingml/2006/picture">
                               <pic:nvPicPr>
-                                <pic:cNvPr id="0" name="Picture 16" descr="file:/C:/Users/VINCEN~1/AppData/Local/Temp/ViewContainer__48vDwBVIEeetFdz5pzgWAw3571570655121555378.png"/>
+                                <pic:cNvPr id="0" name="Picture 16" descr="file:/tmp/ViewContainer__48vDwBVIEeetFdz5pzgWAw2796940961685463619.png"/>
                                 <pic:cNvPicPr>
                                   <a:picLocks noChangeAspect="true"/>
                                 </pic:cNvPicPr>
@@ -11704,111 +11697,40 @@
     </w:p>
     <w:p>
       <w:r>
-        <w:t>{m:</w:t>
-      </w:r>
-      <w:r>
-        <w:t>rep</w:t>
-      </w:r>
-      <w:r>
-        <w:t>.oclAsType(viewpoint::DRepresentation)</w:t>
-      </w:r>
-      <w:r>
-        <w:t>.</w:t>
-      </w:r>
-      <w:r>
-        <w:t>asImage().</w:t>
-      </w:r>
-      <w:r>
-        <w:t>setConserveRatio(true).set</w:t>
-      </w:r>
-      <w:r>
-        <w:t>Width(</w:t>
-      </w:r>
-      <w:r>
-        <w:t>400</w:t>
-      </w:r>
-      <w:r>
-        <w:t>)</w:t>
-      </w:r>
-      <w:r>
-        <w:t xml:space="preserve">}</w:t>
-      </w:r>
-      <w:r>
-        <w:rPr>
-          <w:b w:val="on"/>
-          <w:color w:val="FF0000"/>
-        </w:rPr>
-        <w:t xml:space="preserve">    &lt;---setConserveRatio(org.obeonetwork.m2doc.element.MImage,java.lang.Boolean) with arguments [Image file:/C:/Users/VINCEN~1/AppData/Local/Temp/E-BookStore%20Package%20Diagram_copy-m2doc13952441087746102000.jpg, true] failed:
-	Can't conserve ratio: unknown ratio
-java.lang.IllegalStateException: Can't conserve ratio: unknown ratio
-	at org.obeonetwork.m2doc.element.impl.MImageImpl.setConserveRatio(MImageImpl.java:275)
-	at org.obeonetwork.m2doc.services.ImageServices.setConserveRatio(ImageServices.java:248)
-	at java.base/jdk.internal.reflect.NativeMethodAccessorImpl.invoke0(Native Method)
-	at java.base/jdk.internal.reflect.NativeMethodAccessorImpl.invoke(NativeMethodAccessorImpl.java:77)
-	at java.base/jdk.internal.reflect.DelegatingMethodAccessorImpl.invoke(DelegatingMethodAccessorImpl.java:43)
-	at java.base/java.lang.reflect.Method.invoke(Method.java:569)
-	at org.eclipse.acceleo.query.runtime.impl.JavaMethodService.internalInvoke(JavaMethodService.java:162)
-	at org.eclipse.acceleo.query.runtime.impl.AbstractService.invoke(AbstractService.java:135)
-	at org.eclipse.acceleo.query.runtime.impl.EvaluationServices.callService(EvaluationServices.java:129)
-	at org.eclipse.acceleo.query.runtime.impl.EvaluationServices.call(EvaluationServices.java:172)
-	at org.eclipse.acceleo.query.runtime.impl.EvaluationServices.callOrApply(EvaluationServices.java:208)
-	at org.eclipse.acceleo.query.parser.AstEvaluator.caseCall(AstEvaluator.java:189)
-	at org.eclipse.acceleo.query.ast.util.AstSwitch.doSwitch(AstSwitch.java:119)
-	at org.eclipse.emf.ecore.util.Switch.doSwitch(Switch.java:53)
-	at org.eclipse.emf.ecore.util.Switch.doSwitch(Switch.java:69)
-	at org.eclipse.acceleo.query.parser.AstEvaluator.caseCall(AstEvaluator.java:180)
-	at org.eclipse.acceleo.query.ast.util.AstSwitch.doSwitch(AstSwitch.java:119)
-	at org.eclipse.emf.ecore.util.Switch.doSwitch(Switch.java:53)
-	at org.eclipse.emf.ecore.util.Switch.doSwitch(Switch.java:69)
-	at org.eclipse.acceleo.query.parser.AstEvaluator.eval(AstEvaluator.java:109)
-	at org.eclipse.acceleo.query.runtime.impl.QueryEvaluationEngine.eval(QueryEvaluationEngine.java:52)
-	at org.obeonetwork.m2doc.generator.M2DocEvaluator.caseQuery(M2DocEvaluator.java:674)
-	at org.obeonetwork.m2doc.generator.M2DocEvaluator.caseQuery(M2DocEvaluator.java:1)
-	at org.obeonetwork.m2doc.template.util.TemplateSwitch.doSwitch(TemplateSwitch.java:186)
-	at org.eclipse.emf.ecore.util.Switch.doSwitch(Switch.java:53)
-	at org.eclipse.emf.ecore.util.Switch.doSwitch(Switch.java:69)
-	at org.obeonetwork.m2doc.generator.M2DocEvaluator.doSwitch(M2DocEvaluator.java:2124)
-	at org.obeonetwork.m2doc.generator.M2DocEvaluator.caseBlock(M2DocEvaluator.java:2349)
-	at org.obeonetwork.m2doc.generator.M2DocEvaluator.caseBlock(M2DocEvaluator.java:1)
-	at org.obeonetwork.m2doc.template.util.TemplateSwitch.doSwitch(TemplateSwitch.java:199)
-	at org.eclipse.emf.ecore.util.Switch.doSwitch(Switch.java:53)
-	at org.eclipse.emf.ecore.util.Switch.doSwitch(Switch.java:69)
-	at org.obeonetwork.m2doc.generator.M2DocEvaluator.doSwitch(M2DocEvaluator.java:2124)
-	at org.obeonetwork.m2doc.generator.M2DocEvaluator.caseRepetition(M2DocEvaluator.java:2108)
-	at org.obeonetwork.m2doc.generator.M2DocEvaluator.caseRepetition(M2DocEvaluator.java:1)
-	at org.obeonetwork.m2doc.template.util.TemplateSwitch.doSwitch(TemplateSwitch.java:147)
-	at org.eclipse.emf.ecore.util.Switch.doSwitch(Switch.java:53)
-	at org.eclipse.emf.ecore.util.Switch.doSwitch(Switch.java:69)
-	at org.obeonetwork.m2doc.generator.M2DocEvaluator.doSwitch(M2DocEvaluator.java:2124)
-	at org.obeonetwork.m2doc.generator.M2DocEvaluator.caseBlock(M2DocEvaluator.java:2349)
-	at org.obeonetwork.m2doc.generator.M2DocEvaluator.caseBlock(M2DocEvaluator.java:1)
-	at org.obeonetwork.m2doc.template.util.TemplateSwitch.doSwitch(TemplateSwitch.java:199)
-	at org.eclipse.emf.ecore.util.Switch.doSwitch(Switch.java:53)
-	at org.eclipse.emf.ecore.util.Switch.doSwitch(Switch.java:69)
-	at org.obeonetwork.m2doc.generator.M2DocEvaluator.doSwitch(M2DocEvaluator.java:2124)
-	at org.obeonetwork.m2doc.generator.M2DocEvaluator.caseDocumentTemplate(M2DocEvaluator.java:350)
-	at org.obeonetwork.m2doc.generator.M2DocEvaluator.caseDocumentTemplate(M2DocEvaluator.java:1)
-	at org.obeonetwork.m2doc.template.util.TemplateSwitch.doSwitch(TemplateSwitch.java:279)
-	at org.eclipse.emf.ecore.util.Switch.doSwitch(Switch.java:53)
-	at org.eclipse.emf.ecore.util.Switch.doSwitch(Switch.java:69)
-	at org.obeonetwork.m2doc.generator.M2DocEvaluator.doSwitch(M2DocEvaluator.java:2124)
-	at org.obeonetwork.m2doc.generator.M2DocEvaluator.generate(M2DocEvaluator.java:334)
-	at org.obeonetwork.m2doc.util.M2DocUtils.generate(M2DocUtils.java:912)
-	at org.obeonetwork.m2doc.genconf.GenconfUtils.generate(GenconfUtils.java:699)
-	at org.obeonetwork.m2doc.genconf.GenconfUtils.generate(GenconfUtils.java:623)
-	at org.obeonetwork.m2doc.genconf.editor.command.GenerateHandler$GenerateJob.runInWorkspace(GenerateHandler.java:87)
-	at org.eclipse.core.internal.resources.InternalWorkspaceJob.run(InternalWorkspaceJob.java:43)
-	at org.eclipse.core.internal.jobs.Worker.run(Worker.java:63)
-</w:t>
-        <w:br/>
-      </w:r>
-      <w:r>
-        <w:rPr>
-          <w:b w:val="on"/>
-          <w:color w:val="FFA500"/>
-        </w:rPr>
-        <w:t xml:space="preserve">    &lt;---Couldn't find the 'setWidth(org.eclipse.acceleo.query.runtime.impl.Nothing,java.lang.Integer)' service</w:t>
-        <w:br/>
+        <w:t/>
+        <w:drawing>
+          <wp:inline distT="0" distR="0" distB="0" distL="0">
+            <wp:extent cx="5080000" cy="2222500"/>
+            <wp:docPr id="17" name="Drawing 17" descr="file:/tmp/E-BookStore%20Package%20Diagram_copy-m2doc1009963335195314013.jpg"/>
+            <a:graphic xmlns:a="http://schemas.openxmlformats.org/drawingml/2006/main">
+              <a:graphicData uri="http://schemas.openxmlformats.org/drawingml/2006/picture">
+                <pic:pic xmlns:pic="http://schemas.openxmlformats.org/drawingml/2006/picture">
+                  <pic:nvPicPr>
+                    <pic:cNvPr id="0" name="Picture 17" descr="file:/tmp/E-BookStore%20Package%20Diagram_copy-m2doc1009963335195314013.jpg"/>
+                    <pic:cNvPicPr>
+                      <a:picLocks noChangeAspect="true"/>
+                    </pic:cNvPicPr>
+                  </pic:nvPicPr>
+                  <pic:blipFill>
+                    <a:blip r:embed="rId20"/>
+                    <a:stretch>
+                      <a:fillRect/>
+                    </a:stretch>
+                  </pic:blipFill>
+                  <pic:spPr>
+                    <a:xfrm>
+                      <a:off x="0" y="0"/>
+                      <a:ext cx="5080000" cy="2222500"/>
+                    </a:xfrm>
+                    <a:prstGeom prst="rect">
+                      <a:avLst/>
+                    </a:prstGeom>
+                  </pic:spPr>
+                </pic:pic>
+              </a:graphicData>
+            </a:graphic>
+          </wp:inline>
+        </w:drawing>
       </w:r>
     </w:p>
     <w:p>
@@ -11820,6 +11742,9 @@
       </w:r>
       <w:r>
         <w:t xml:space="preserve"> </w:t>
+      </w:r>
+      <w:r>
+        <w:t>E-BookStore Package Diagram</w:t>
       </w:r>
       <w:r>
         <w:t xml:space="preserve"> </w:t>
@@ -11959,19 +11884,19 @@
         <w:t/>
         <w:drawing>
           <wp:inline distT="0" distR="0" distB="0" distL="0">
-            <wp:extent cx="5080000" cy="2959100"/>
-            <wp:docPr id="17" name="Drawing 17" descr="file:/C:/Users/VINCEN~1/AppData/Local/Temp/Main%20Flow%20Diagram_copy-m2doc1394023003301986380.jpg"/>
+            <wp:extent cx="5080000" cy="2616200"/>
+            <wp:docPr id="18" name="Drawing 18" descr="file:/tmp/Main%20Flow%20Diagram_copy-m2doc10589499605456662408.jpg"/>
             <a:graphic xmlns:a="http://schemas.openxmlformats.org/drawingml/2006/main">
               <a:graphicData uri="http://schemas.openxmlformats.org/drawingml/2006/picture">
                 <pic:pic xmlns:pic="http://schemas.openxmlformats.org/drawingml/2006/picture">
                   <pic:nvPicPr>
-                    <pic:cNvPr id="0" name="Picture 17" descr="file:/C:/Users/VINCEN~1/AppData/Local/Temp/Main%20Flow%20Diagram_copy-m2doc1394023003301986380.jpg"/>
+                    <pic:cNvPr id="0" name="Picture 18" descr="file:/tmp/Main%20Flow%20Diagram_copy-m2doc10589499605456662408.jpg"/>
                     <pic:cNvPicPr>
                       <a:picLocks noChangeAspect="true"/>
                     </pic:cNvPicPr>
                   </pic:nvPicPr>
                   <pic:blipFill>
-                    <a:blip r:embed="rId19"/>
+                    <a:blip r:embed="rId21"/>
                     <a:stretch>
                       <a:fillRect/>
                     </a:stretch>
@@ -11979,7 +11904,7 @@
                   <pic:spPr>
                     <a:xfrm>
                       <a:off x="0" y="0"/>
-                      <a:ext cx="5080000" cy="2959100"/>
+                      <a:ext cx="5080000" cy="2616200"/>
                     </a:xfrm>
                     <a:prstGeom prst="rect">
                       <a:avLst/>
@@ -17570,19 +17495,19 @@
         <w:t/>
         <w:drawing>
           <wp:inline distT="0" distR="0" distB="0" distL="0">
-            <wp:extent cx="5080000" cy="3644900"/>
-            <wp:docPr id="18" name="Drawing 18" descr="file:/C:/Users/VINCEN~1/AppData/Local/Temp/Checkout%20Flow%20Diagram_copy-m2doc4712259000303150351.jpg"/>
+            <wp:extent cx="5080000" cy="4775200"/>
+            <wp:docPr id="19" name="Drawing 19" descr="file:/tmp/Checkout%20Flow%20Diagram_copy-m2doc13928194921208584653.jpg"/>
             <a:graphic xmlns:a="http://schemas.openxmlformats.org/drawingml/2006/main">
               <a:graphicData uri="http://schemas.openxmlformats.org/drawingml/2006/picture">
                 <pic:pic xmlns:pic="http://schemas.openxmlformats.org/drawingml/2006/picture">
                   <pic:nvPicPr>
-                    <pic:cNvPr id="0" name="Picture 18" descr="file:/C:/Users/VINCEN~1/AppData/Local/Temp/Checkout%20Flow%20Diagram_copy-m2doc4712259000303150351.jpg"/>
+                    <pic:cNvPr id="0" name="Picture 19" descr="file:/tmp/Checkout%20Flow%20Diagram_copy-m2doc13928194921208584653.jpg"/>
                     <pic:cNvPicPr>
                       <a:picLocks noChangeAspect="true"/>
                     </pic:cNvPicPr>
                   </pic:nvPicPr>
                   <pic:blipFill>
-                    <a:blip r:embed="rId20"/>
+                    <a:blip r:embed="rId22"/>
                     <a:stretch>
                       <a:fillRect/>
                     </a:stretch>
@@ -17590,7 +17515,7 @@
                   <pic:spPr>
                     <a:xfrm>
                       <a:off x="0" y="0"/>
-                      <a:ext cx="5080000" cy="3644900"/>
+                      <a:ext cx="5080000" cy="4775200"/>
                     </a:xfrm>
                     <a:prstGeom prst="rect">
                       <a:avLst/>
@@ -22371,12 +22296,12 @@
               <w:drawing>
                 <wp:inline distT="0" distR="0" distB="0" distL="0">
                   <wp:extent cx="203200" cy="203200"/>
-                  <wp:docPr id="19" name="Drawing 19" descr="file:/C:/Users/VINCEN~1/AppData/Local/Temp/ViewContainer__48gaJBVIEeetFdz5pzgWAw5798908861497253766.png"/>
+                  <wp:docPr id="20" name="Drawing 20" descr="file:/tmp/ViewContainer__48gaJBVIEeetFdz5pzgWAw600833693451756065.png"/>
                   <a:graphic xmlns:a="http://schemas.openxmlformats.org/drawingml/2006/main">
                     <a:graphicData uri="http://schemas.openxmlformats.org/drawingml/2006/picture">
                       <pic:pic xmlns:pic="http://schemas.openxmlformats.org/drawingml/2006/picture">
                         <pic:nvPicPr>
-                          <pic:cNvPr id="0" name="Picture 19" descr="file:/C:/Users/VINCEN~1/AppData/Local/Temp/ViewContainer__48gaJBVIEeetFdz5pzgWAw5798908861497253766.png"/>
+                          <pic:cNvPr id="0" name="Picture 20" descr="file:/tmp/ViewContainer__48gaJBVIEeetFdz5pzgWAw600833693451756065.png"/>
                           <pic:cNvPicPr>
                             <a:picLocks noChangeAspect="true"/>
                           </pic:cNvPicPr>
@@ -22431,12 +22356,12 @@
               <w:drawing>
                 <wp:inline distT="0" distR="0" distB="0" distL="0">
                   <wp:extent cx="203200" cy="203200"/>
-                  <wp:docPr id="20" name="Drawing 20" descr="file:/C:/Users/VINCEN~1/AppData/Local/Temp/ViewContainer__48jdcBVIEeetFdz5pzgWAw7162900665936149556.png"/>
+                  <wp:docPr id="21" name="Drawing 21" descr="file:/tmp/ViewContainer__48jdcBVIEeetFdz5pzgWAw10842737623758336518.png"/>
                   <a:graphic xmlns:a="http://schemas.openxmlformats.org/drawingml/2006/main">
                     <a:graphicData uri="http://schemas.openxmlformats.org/drawingml/2006/picture">
                       <pic:pic xmlns:pic="http://schemas.openxmlformats.org/drawingml/2006/picture">
                         <pic:nvPicPr>
-                          <pic:cNvPr id="0" name="Picture 20" descr="file:/C:/Users/VINCEN~1/AppData/Local/Temp/ViewContainer__48jdcBVIEeetFdz5pzgWAw7162900665936149556.png"/>
+                          <pic:cNvPr id="0" name="Picture 21" descr="file:/tmp/ViewContainer__48jdcBVIEeetFdz5pzgWAw10842737623758336518.png"/>
                           <pic:cNvPicPr>
                             <a:picLocks noChangeAspect="true"/>
                           </pic:cNvPicPr>
@@ -22491,12 +22416,12 @@
               <w:drawing>
                 <wp:inline distT="0" distR="0" distB="0" distL="0">
                   <wp:extent cx="203200" cy="203200"/>
-                  <wp:docPr id="21" name="Drawing 21" descr="file:/C:/Users/VINCEN~1/AppData/Local/Temp/ViewContainer__48qLIBVIEeetFdz5pzgWAw14058095818988130537.png"/>
+                  <wp:docPr id="22" name="Drawing 22" descr="file:/tmp/ViewContainer__48qLIBVIEeetFdz5pzgWAw4981420561559060790.png"/>
                   <a:graphic xmlns:a="http://schemas.openxmlformats.org/drawingml/2006/main">
                     <a:graphicData uri="http://schemas.openxmlformats.org/drawingml/2006/picture">
                       <pic:pic xmlns:pic="http://schemas.openxmlformats.org/drawingml/2006/picture">
                         <pic:nvPicPr>
-                          <pic:cNvPr id="0" name="Picture 21" descr="file:/C:/Users/VINCEN~1/AppData/Local/Temp/ViewContainer__48qLIBVIEeetFdz5pzgWAw14058095818988130537.png"/>
+                          <pic:cNvPr id="0" name="Picture 22" descr="file:/tmp/ViewContainer__48qLIBVIEeetFdz5pzgWAw4981420561559060790.png"/>
                           <pic:cNvPicPr>
                             <a:picLocks noChangeAspect="true"/>
                           </pic:cNvPicPr>
@@ -22551,12 +22476,12 @@
               <w:drawing>
                 <wp:inline distT="0" distR="0" distB="0" distL="0">
                   <wp:extent cx="203200" cy="203200"/>
-                  <wp:docPr id="22" name="Drawing 22" descr="file:/C:/Users/VINCEN~1/AppData/Local/Temp/ViewContainer__48qLLxVIEeetFdz5pzgWAw10960563154375970156.png"/>
+                  <wp:docPr id="23" name="Drawing 23" descr="file:/tmp/ViewContainer__48qLLxVIEeetFdz5pzgWAw2470240556484571616.png"/>
                   <a:graphic xmlns:a="http://schemas.openxmlformats.org/drawingml/2006/main">
                     <a:graphicData uri="http://schemas.openxmlformats.org/drawingml/2006/picture">
                       <pic:pic xmlns:pic="http://schemas.openxmlformats.org/drawingml/2006/picture">
                         <pic:nvPicPr>
-                          <pic:cNvPr id="0" name="Picture 22" descr="file:/C:/Users/VINCEN~1/AppData/Local/Temp/ViewContainer__48qLLxVIEeetFdz5pzgWAw10960563154375970156.png"/>
+                          <pic:cNvPr id="0" name="Picture 23" descr="file:/tmp/ViewContainer__48qLLxVIEeetFdz5pzgWAw2470240556484571616.png"/>
                           <pic:cNvPicPr>
                             <a:picLocks noChangeAspect="true"/>
                           </pic:cNvPicPr>
@@ -22611,18 +22536,18 @@
               <w:drawing>
                 <wp:inline distT="0" distR="0" distB="0" distL="0">
                   <wp:extent cx="203200" cy="177800"/>
-                  <wp:docPr id="23" name="Drawing 23" descr="file:/C:/Users/VINCEN~1/AppData/Local/Temp/ViewElement__48qLLBVIEeetFdz5pzgWAw6672255964802576347.png"/>
+                  <wp:docPr id="24" name="Drawing 24" descr="file:/tmp/ViewElement__48qLLBVIEeetFdz5pzgWAw16000420206872999462.png"/>
                   <a:graphic xmlns:a="http://schemas.openxmlformats.org/drawingml/2006/main">
                     <a:graphicData uri="http://schemas.openxmlformats.org/drawingml/2006/picture">
                       <pic:pic xmlns:pic="http://schemas.openxmlformats.org/drawingml/2006/picture">
                         <pic:nvPicPr>
-                          <pic:cNvPr id="0" name="Picture 23" descr="file:/C:/Users/VINCEN~1/AppData/Local/Temp/ViewElement__48qLLBVIEeetFdz5pzgWAw6672255964802576347.png"/>
+                          <pic:cNvPr id="0" name="Picture 24" descr="file:/tmp/ViewElement__48qLLBVIEeetFdz5pzgWAw16000420206872999462.png"/>
                           <pic:cNvPicPr>
                             <a:picLocks noChangeAspect="true"/>
                           </pic:cNvPicPr>
                         </pic:nvPicPr>
                         <pic:blipFill>
-                          <a:blip r:embed="rId21"/>
+                          <a:blip r:embed="rId23"/>
                           <a:stretch>
                             <a:fillRect/>
                           </a:stretch>
@@ -22718,12 +22643,12 @@
               <w:drawing>
                 <wp:inline distT="0" distR="0" distB="0" distL="0">
                   <wp:extent cx="203200" cy="203200"/>
-                  <wp:docPr id="24" name="Drawing 24" descr="file:/C:/Users/VINCEN~1/AppData/Local/Temp/ViewContainer__48qLRRVIEeetFdz5pzgWAw13504471398919129968.png"/>
+                  <wp:docPr id="25" name="Drawing 25" descr="file:/tmp/ViewContainer__48qLRRVIEeetFdz5pzgWAw17001092915427342643.png"/>
                   <a:graphic xmlns:a="http://schemas.openxmlformats.org/drawingml/2006/main">
                     <a:graphicData uri="http://schemas.openxmlformats.org/drawingml/2006/picture">
                       <pic:pic xmlns:pic="http://schemas.openxmlformats.org/drawingml/2006/picture">
                         <pic:nvPicPr>
-                          <pic:cNvPr id="0" name="Picture 24" descr="file:/C:/Users/VINCEN~1/AppData/Local/Temp/ViewContainer__48qLRRVIEeetFdz5pzgWAw13504471398919129968.png"/>
+                          <pic:cNvPr id="0" name="Picture 25" descr="file:/tmp/ViewContainer__48qLRRVIEeetFdz5pzgWAw17001092915427342643.png"/>
                           <pic:cNvPicPr>
                             <a:picLocks noChangeAspect="true"/>
                           </pic:cNvPicPr>
@@ -22778,18 +22703,18 @@
               <w:drawing>
                 <wp:inline distT="0" distR="0" distB="0" distL="0">
                   <wp:extent cx="203200" cy="177800"/>
-                  <wp:docPr id="25" name="Drawing 25" descr="file:/C:/Users/VINCEN~1/AppData/Local/Temp/ViewElement__48qLRxVIEeetFdz5pzgWAw4711514322786483391.png"/>
+                  <wp:docPr id="26" name="Drawing 26" descr="file:/tmp/ViewElement__48qLRxVIEeetFdz5pzgWAw3634249319757339997.png"/>
                   <a:graphic xmlns:a="http://schemas.openxmlformats.org/drawingml/2006/main">
                     <a:graphicData uri="http://schemas.openxmlformats.org/drawingml/2006/picture">
                       <pic:pic xmlns:pic="http://schemas.openxmlformats.org/drawingml/2006/picture">
                         <pic:nvPicPr>
-                          <pic:cNvPr id="0" name="Picture 25" descr="file:/C:/Users/VINCEN~1/AppData/Local/Temp/ViewElement__48qLRxVIEeetFdz5pzgWAw4711514322786483391.png"/>
+                          <pic:cNvPr id="0" name="Picture 26" descr="file:/tmp/ViewElement__48qLRxVIEeetFdz5pzgWAw3634249319757339997.png"/>
                           <pic:cNvPicPr>
                             <a:picLocks noChangeAspect="true"/>
                           </pic:cNvPicPr>
                         </pic:nvPicPr>
                         <pic:blipFill>
-                          <a:blip r:embed="rId22"/>
+                          <a:blip r:embed="rId24"/>
                           <a:stretch>
                             <a:fillRect/>
                           </a:stretch>
@@ -22838,18 +22763,18 @@
               <w:drawing>
                 <wp:inline distT="0" distR="0" distB="0" distL="0">
                   <wp:extent cx="203200" cy="203200"/>
-                  <wp:docPr id="26" name="Drawing 26" descr="file:/C:/Users/VINCEN~1/AppData/Local/Temp/ViewElement__48qyMBVIEeetFdz5pzgWAw11354197390629624720.png"/>
+                  <wp:docPr id="27" name="Drawing 27" descr="file:/tmp/ViewElement__48qyMBVIEeetFdz5pzgWAw15949297441565367965.png"/>
                   <a:graphic xmlns:a="http://schemas.openxmlformats.org/drawingml/2006/main">
                     <a:graphicData uri="http://schemas.openxmlformats.org/drawingml/2006/picture">
                       <pic:pic xmlns:pic="http://schemas.openxmlformats.org/drawingml/2006/picture">
                         <pic:nvPicPr>
-                          <pic:cNvPr id="0" name="Picture 26" descr="file:/C:/Users/VINCEN~1/AppData/Local/Temp/ViewElement__48qyMBVIEeetFdz5pzgWAw11354197390629624720.png"/>
+                          <pic:cNvPr id="0" name="Picture 27" descr="file:/tmp/ViewElement__48qyMBVIEeetFdz5pzgWAw15949297441565367965.png"/>
                           <pic:cNvPicPr>
                             <a:picLocks noChangeAspect="true"/>
                           </pic:cNvPicPr>
                         </pic:nvPicPr>
                         <pic:blipFill>
-                          <a:blip r:embed="rId23"/>
+                          <a:blip r:embed="rId25"/>
                           <a:stretch>
                             <a:fillRect/>
                           </a:stretch>
@@ -22898,18 +22823,18 @@
               <w:drawing>
                 <wp:inline distT="0" distR="0" distB="0" distL="0">
                   <wp:extent cx="203200" cy="177800"/>
-                  <wp:docPr id="27" name="Drawing 27" descr="file:/C:/Users/VINCEN~1/AppData/Local/Temp/ViewElement__48qyMhVIEeetFdz5pzgWAw8268436747127107137.png"/>
+                  <wp:docPr id="28" name="Drawing 28" descr="file:/tmp/ViewElement__48qyMhVIEeetFdz5pzgWAw11156659566119111707.png"/>
                   <a:graphic xmlns:a="http://schemas.openxmlformats.org/drawingml/2006/main">
                     <a:graphicData uri="http://schemas.openxmlformats.org/drawingml/2006/picture">
                       <pic:pic xmlns:pic="http://schemas.openxmlformats.org/drawingml/2006/picture">
                         <pic:nvPicPr>
-                          <pic:cNvPr id="0" name="Picture 27" descr="file:/C:/Users/VINCEN~1/AppData/Local/Temp/ViewElement__48qyMhVIEeetFdz5pzgWAw8268436747127107137.png"/>
+                          <pic:cNvPr id="0" name="Picture 28" descr="file:/tmp/ViewElement__48qyMhVIEeetFdz5pzgWAw11156659566119111707.png"/>
                           <pic:cNvPicPr>
                             <a:picLocks noChangeAspect="true"/>
                           </pic:cNvPicPr>
                         </pic:nvPicPr>
                         <pic:blipFill>
-                          <a:blip r:embed="rId22"/>
+                          <a:blip r:embed="rId24"/>
                           <a:stretch>
                             <a:fillRect/>
                           </a:stretch>
@@ -22958,18 +22883,18 @@
               <w:drawing>
                 <wp:inline distT="0" distR="0" distB="0" distL="0">
                   <wp:extent cx="203200" cy="190500"/>
-                  <wp:docPr id="28" name="Drawing 28" descr="file:/C:/Users/VINCEN~1/AppData/Local/Temp/ViewElement__48qyNBVIEeetFdz5pzgWAw6910777907982343335.png"/>
+                  <wp:docPr id="29" name="Drawing 29" descr="file:/tmp/ViewElement__48qyNBVIEeetFdz5pzgWAw17124269529029826541.png"/>
                   <a:graphic xmlns:a="http://schemas.openxmlformats.org/drawingml/2006/main">
                     <a:graphicData uri="http://schemas.openxmlformats.org/drawingml/2006/picture">
                       <pic:pic xmlns:pic="http://schemas.openxmlformats.org/drawingml/2006/picture">
                         <pic:nvPicPr>
-                          <pic:cNvPr id="0" name="Picture 28" descr="file:/C:/Users/VINCEN~1/AppData/Local/Temp/ViewElement__48qyNBVIEeetFdz5pzgWAw6910777907982343335.png"/>
+                          <pic:cNvPr id="0" name="Picture 29" descr="file:/tmp/ViewElement__48qyNBVIEeetFdz5pzgWAw17124269529029826541.png"/>
                           <pic:cNvPicPr>
                             <a:picLocks noChangeAspect="true"/>
                           </pic:cNvPicPr>
                         </pic:nvPicPr>
                         <pic:blipFill>
-                          <a:blip r:embed="rId24"/>
+                          <a:blip r:embed="rId26"/>
                           <a:stretch>
                             <a:fillRect/>
                           </a:stretch>
@@ -23018,18 +22943,18 @@
               <w:drawing>
                 <wp:inline distT="0" distR="0" distB="0" distL="0">
                   <wp:extent cx="203200" cy="190500"/>
-                  <wp:docPr id="29" name="Drawing 29" descr="file:/C:/Users/VINCEN~1/AppData/Local/Temp/ViewElement__48qyOBVIEeetFdz5pzgWAw9720499816463816472.png"/>
+                  <wp:docPr id="30" name="Drawing 30" descr="file:/tmp/ViewElement__48qyOBVIEeetFdz5pzgWAw8386266495909962100.png"/>
                   <a:graphic xmlns:a="http://schemas.openxmlformats.org/drawingml/2006/main">
                     <a:graphicData uri="http://schemas.openxmlformats.org/drawingml/2006/picture">
                       <pic:pic xmlns:pic="http://schemas.openxmlformats.org/drawingml/2006/picture">
                         <pic:nvPicPr>
-                          <pic:cNvPr id="0" name="Picture 29" descr="file:/C:/Users/VINCEN~1/AppData/Local/Temp/ViewElement__48qyOBVIEeetFdz5pzgWAw9720499816463816472.png"/>
+                          <pic:cNvPr id="0" name="Picture 30" descr="file:/tmp/ViewElement__48qyOBVIEeetFdz5pzgWAw8386266495909962100.png"/>
                           <pic:cNvPicPr>
                             <a:picLocks noChangeAspect="true"/>
                           </pic:cNvPicPr>
                         </pic:nvPicPr>
                         <pic:blipFill>
-                          <a:blip r:embed="rId24"/>
+                          <a:blip r:embed="rId26"/>
                           <a:stretch>
                             <a:fillRect/>
                           </a:stretch>
@@ -23125,12 +23050,12 @@
               <w:drawing>
                 <wp:inline distT="0" distR="0" distB="0" distL="0">
                   <wp:extent cx="203200" cy="203200"/>
-                  <wp:docPr id="30" name="Drawing 30" descr="file:/C:/Users/VINCEN~1/AppData/Local/Temp/ViewContainer__48gaJBVIEeetFdz5pzgWAw5083039534828988762.png"/>
+                  <wp:docPr id="31" name="Drawing 31" descr="file:/tmp/ViewContainer__48gaJBVIEeetFdz5pzgWAw1989786519872882759.png"/>
                   <a:graphic xmlns:a="http://schemas.openxmlformats.org/drawingml/2006/main">
                     <a:graphicData uri="http://schemas.openxmlformats.org/drawingml/2006/picture">
                       <pic:pic xmlns:pic="http://schemas.openxmlformats.org/drawingml/2006/picture">
                         <pic:nvPicPr>
-                          <pic:cNvPr id="0" name="Picture 30" descr="file:/C:/Users/VINCEN~1/AppData/Local/Temp/ViewContainer__48gaJBVIEeetFdz5pzgWAw5083039534828988762.png"/>
+                          <pic:cNvPr id="0" name="Picture 31" descr="file:/tmp/ViewContainer__48gaJBVIEeetFdz5pzgWAw1989786519872882759.png"/>
                           <pic:cNvPicPr>
                             <a:picLocks noChangeAspect="true"/>
                           </pic:cNvPicPr>
@@ -23185,12 +23110,12 @@
               <w:drawing>
                 <wp:inline distT="0" distR="0" distB="0" distL="0">
                   <wp:extent cx="203200" cy="203200"/>
-                  <wp:docPr id="31" name="Drawing 31" descr="file:/C:/Users/VINCEN~1/AppData/Local/Temp/ViewContainer__48jdcBVIEeetFdz5pzgWAw2073333068480098875.png"/>
+                  <wp:docPr id="32" name="Drawing 32" descr="file:/tmp/ViewContainer__48jdcBVIEeetFdz5pzgWAw8971646848075081010.png"/>
                   <a:graphic xmlns:a="http://schemas.openxmlformats.org/drawingml/2006/main">
                     <a:graphicData uri="http://schemas.openxmlformats.org/drawingml/2006/picture">
                       <pic:pic xmlns:pic="http://schemas.openxmlformats.org/drawingml/2006/picture">
                         <pic:nvPicPr>
-                          <pic:cNvPr id="0" name="Picture 31" descr="file:/C:/Users/VINCEN~1/AppData/Local/Temp/ViewContainer__48jdcBVIEeetFdz5pzgWAw2073333068480098875.png"/>
+                          <pic:cNvPr id="0" name="Picture 32" descr="file:/tmp/ViewContainer__48jdcBVIEeetFdz5pzgWAw8971646848075081010.png"/>
                           <pic:cNvPicPr>
                             <a:picLocks noChangeAspect="true"/>
                           </pic:cNvPicPr>
@@ -23245,12 +23170,12 @@
               <w:drawing>
                 <wp:inline distT="0" distR="0" distB="0" distL="0">
                   <wp:extent cx="203200" cy="203200"/>
-                  <wp:docPr id="32" name="Drawing 32" descr="file:/C:/Users/VINCEN~1/AppData/Local/Temp/ViewContainer__48qLIBVIEeetFdz5pzgWAw8392306332171249975.png"/>
+                  <wp:docPr id="33" name="Drawing 33" descr="file:/tmp/ViewContainer__48qLIBVIEeetFdz5pzgWAw2182143249353881776.png"/>
                   <a:graphic xmlns:a="http://schemas.openxmlformats.org/drawingml/2006/main">
                     <a:graphicData uri="http://schemas.openxmlformats.org/drawingml/2006/picture">
                       <pic:pic xmlns:pic="http://schemas.openxmlformats.org/drawingml/2006/picture">
                         <pic:nvPicPr>
-                          <pic:cNvPr id="0" name="Picture 32" descr="file:/C:/Users/VINCEN~1/AppData/Local/Temp/ViewContainer__48qLIBVIEeetFdz5pzgWAw8392306332171249975.png"/>
+                          <pic:cNvPr id="0" name="Picture 33" descr="file:/tmp/ViewContainer__48qLIBVIEeetFdz5pzgWAw2182143249353881776.png"/>
                           <pic:cNvPicPr>
                             <a:picLocks noChangeAspect="true"/>
                           </pic:cNvPicPr>
@@ -23305,12 +23230,12 @@
               <w:drawing>
                 <wp:inline distT="0" distR="0" distB="0" distL="0">
                   <wp:extent cx="203200" cy="203200"/>
-                  <wp:docPr id="33" name="Drawing 33" descr="file:/C:/Users/VINCEN~1/AppData/Local/Temp/ViewContainer__48qLLxVIEeetFdz5pzgWAw2352151597774268536.png"/>
+                  <wp:docPr id="34" name="Drawing 34" descr="file:/tmp/ViewContainer__48qLLxVIEeetFdz5pzgWAw2993624666611948614.png"/>
                   <a:graphic xmlns:a="http://schemas.openxmlformats.org/drawingml/2006/main">
                     <a:graphicData uri="http://schemas.openxmlformats.org/drawingml/2006/picture">
                       <pic:pic xmlns:pic="http://schemas.openxmlformats.org/drawingml/2006/picture">
                         <pic:nvPicPr>
-                          <pic:cNvPr id="0" name="Picture 33" descr="file:/C:/Users/VINCEN~1/AppData/Local/Temp/ViewContainer__48qLLxVIEeetFdz5pzgWAw2352151597774268536.png"/>
+                          <pic:cNvPr id="0" name="Picture 34" descr="file:/tmp/ViewContainer__48qLLxVIEeetFdz5pzgWAw2993624666611948614.png"/>
                           <pic:cNvPicPr>
                             <a:picLocks noChangeAspect="true"/>
                           </pic:cNvPicPr>
@@ -23365,18 +23290,18 @@
               <w:drawing>
                 <wp:inline distT="0" distR="0" distB="0" distL="0">
                   <wp:extent cx="203200" cy="177800"/>
-                  <wp:docPr id="34" name="Drawing 34" descr="file:/C:/Users/VINCEN~1/AppData/Local/Temp/ViewElement__48qLLBVIEeetFdz5pzgWAw6584748144990355243.png"/>
+                  <wp:docPr id="35" name="Drawing 35" descr="file:/tmp/ViewElement__48qLLBVIEeetFdz5pzgWAw13965493424913402775.png"/>
                   <a:graphic xmlns:a="http://schemas.openxmlformats.org/drawingml/2006/main">
                     <a:graphicData uri="http://schemas.openxmlformats.org/drawingml/2006/picture">
                       <pic:pic xmlns:pic="http://schemas.openxmlformats.org/drawingml/2006/picture">
                         <pic:nvPicPr>
-                          <pic:cNvPr id="0" name="Picture 34" descr="file:/C:/Users/VINCEN~1/AppData/Local/Temp/ViewElement__48qLLBVIEeetFdz5pzgWAw6584748144990355243.png"/>
+                          <pic:cNvPr id="0" name="Picture 35" descr="file:/tmp/ViewElement__48qLLBVIEeetFdz5pzgWAw13965493424913402775.png"/>
                           <pic:cNvPicPr>
                             <a:picLocks noChangeAspect="true"/>
                           </pic:cNvPicPr>
                         </pic:nvPicPr>
                         <pic:blipFill>
-                          <a:blip r:embed="rId21"/>
+                          <a:blip r:embed="rId23"/>
                           <a:stretch>
                             <a:fillRect/>
                           </a:stretch>
@@ -23472,12 +23397,12 @@
               <w:drawing>
                 <wp:inline distT="0" distR="0" distB="0" distL="0">
                   <wp:extent cx="203200" cy="203200"/>
-                  <wp:docPr id="35" name="Drawing 35" descr="file:/C:/Users/VINCEN~1/AppData/Local/Temp/ViewContainer__48jdcBVIEeetFdz5pzgWAw10941000657205513243.png"/>
+                  <wp:docPr id="36" name="Drawing 36" descr="file:/tmp/ViewContainer__48jdcBVIEeetFdz5pzgWAw11334277363925259317.png"/>
                   <a:graphic xmlns:a="http://schemas.openxmlformats.org/drawingml/2006/main">
                     <a:graphicData uri="http://schemas.openxmlformats.org/drawingml/2006/picture">
                       <pic:pic xmlns:pic="http://schemas.openxmlformats.org/drawingml/2006/picture">
                         <pic:nvPicPr>
-                          <pic:cNvPr id="0" name="Picture 35" descr="file:/C:/Users/VINCEN~1/AppData/Local/Temp/ViewContainer__48jdcBVIEeetFdz5pzgWAw10941000657205513243.png"/>
+                          <pic:cNvPr id="0" name="Picture 36" descr="file:/tmp/ViewContainer__48jdcBVIEeetFdz5pzgWAw11334277363925259317.png"/>
                           <pic:cNvPicPr>
                             <a:picLocks noChangeAspect="true"/>
                           </pic:cNvPicPr>
@@ -23532,18 +23457,18 @@
               <w:drawing>
                 <wp:inline distT="0" distR="0" distB="0" distL="0">
                   <wp:extent cx="203200" cy="190500"/>
-                  <wp:docPr id="36" name="Drawing 36" descr="file:/C:/Users/VINCEN~1/AppData/Local/Temp/ViewElement__48jdchVIEeetFdz5pzgWAw2074143660803172082.png"/>
+                  <wp:docPr id="37" name="Drawing 37" descr="file:/tmp/ViewElement__48jdchVIEeetFdz5pzgWAw3205550766330513007.png"/>
                   <a:graphic xmlns:a="http://schemas.openxmlformats.org/drawingml/2006/main">
                     <a:graphicData uri="http://schemas.openxmlformats.org/drawingml/2006/picture">
                       <pic:pic xmlns:pic="http://schemas.openxmlformats.org/drawingml/2006/picture">
                         <pic:nvPicPr>
-                          <pic:cNvPr id="0" name="Picture 36" descr="file:/C:/Users/VINCEN~1/AppData/Local/Temp/ViewElement__48jdchVIEeetFdz5pzgWAw2074143660803172082.png"/>
+                          <pic:cNvPr id="0" name="Picture 37" descr="file:/tmp/ViewElement__48jdchVIEeetFdz5pzgWAw3205550766330513007.png"/>
                           <pic:cNvPicPr>
                             <a:picLocks noChangeAspect="true"/>
                           </pic:cNvPicPr>
                         </pic:nvPicPr>
                         <pic:blipFill>
-                          <a:blip r:embed="rId25"/>
+                          <a:blip r:embed="rId27"/>
                           <a:stretch>
                             <a:fillRect/>
                           </a:stretch>
@@ -23592,18 +23517,18 @@
               <w:drawing>
                 <wp:inline distT="0" distR="0" distB="0" distL="0">
                   <wp:extent cx="203200" cy="190500"/>
-                  <wp:docPr id="37" name="Drawing 37" descr="file:/C:/Users/VINCEN~1/AppData/Local/Temp/ViewElement__48jddBVIEeetFdz5pzgWAw7170765601147177009.png"/>
+                  <wp:docPr id="38" name="Drawing 38" descr="file:/tmp/ViewElement__48jddBVIEeetFdz5pzgWAw5292431979156140475.png"/>
                   <a:graphic xmlns:a="http://schemas.openxmlformats.org/drawingml/2006/main">
                     <a:graphicData uri="http://schemas.openxmlformats.org/drawingml/2006/picture">
                       <pic:pic xmlns:pic="http://schemas.openxmlformats.org/drawingml/2006/picture">
                         <pic:nvPicPr>
-                          <pic:cNvPr id="0" name="Picture 37" descr="file:/C:/Users/VINCEN~1/AppData/Local/Temp/ViewElement__48jddBVIEeetFdz5pzgWAw7170765601147177009.png"/>
+                          <pic:cNvPr id="0" name="Picture 38" descr="file:/tmp/ViewElement__48jddBVIEeetFdz5pzgWAw5292431979156140475.png"/>
                           <pic:cNvPicPr>
                             <a:picLocks noChangeAspect="true"/>
                           </pic:cNvPicPr>
                         </pic:nvPicPr>
                         <pic:blipFill>
-                          <a:blip r:embed="rId25"/>
+                          <a:blip r:embed="rId27"/>
                           <a:stretch>
                             <a:fillRect/>
                           </a:stretch>
@@ -23652,18 +23577,18 @@
               <w:drawing>
                 <wp:inline distT="0" distR="0" distB="0" distL="0">
                   <wp:extent cx="203200" cy="177800"/>
-                  <wp:docPr id="38" name="Drawing 38" descr="file:/C:/Users/VINCEN~1/AppData/Local/Temp/ViewElement__48jddhVIEeetFdz5pzgWAw6535514476352715104.png"/>
+                  <wp:docPr id="39" name="Drawing 39" descr="file:/tmp/ViewElement__48jddhVIEeetFdz5pzgWAw1423926008512154495.png"/>
                   <a:graphic xmlns:a="http://schemas.openxmlformats.org/drawingml/2006/main">
                     <a:graphicData uri="http://schemas.openxmlformats.org/drawingml/2006/picture">
                       <pic:pic xmlns:pic="http://schemas.openxmlformats.org/drawingml/2006/picture">
                         <pic:nvPicPr>
-                          <pic:cNvPr id="0" name="Picture 38" descr="file:/C:/Users/VINCEN~1/AppData/Local/Temp/ViewElement__48jddhVIEeetFdz5pzgWAw6535514476352715104.png"/>
+                          <pic:cNvPr id="0" name="Picture 39" descr="file:/tmp/ViewElement__48jddhVIEeetFdz5pzgWAw1423926008512154495.png"/>
                           <pic:cNvPicPr>
                             <a:picLocks noChangeAspect="true"/>
                           </pic:cNvPicPr>
                         </pic:nvPicPr>
                         <pic:blipFill>
-                          <a:blip r:embed="rId22"/>
+                          <a:blip r:embed="rId24"/>
                           <a:stretch>
                             <a:fillRect/>
                           </a:stretch>
@@ -23712,18 +23637,18 @@
               <w:drawing>
                 <wp:inline distT="0" distR="0" distB="0" distL="0">
                   <wp:extent cx="203200" cy="190500"/>
-                  <wp:docPr id="39" name="Drawing 39" descr="file:/C:/Users/VINCEN~1/AppData/Local/Temp/ViewElement__48jdeBVIEeetFdz5pzgWAw14650054486698867853.png"/>
+                  <wp:docPr id="40" name="Drawing 40" descr="file:/tmp/ViewElement__48jdeBVIEeetFdz5pzgWAw12096986594521713914.png"/>
                   <a:graphic xmlns:a="http://schemas.openxmlformats.org/drawingml/2006/main">
                     <a:graphicData uri="http://schemas.openxmlformats.org/drawingml/2006/picture">
                       <pic:pic xmlns:pic="http://schemas.openxmlformats.org/drawingml/2006/picture">
                         <pic:nvPicPr>
-                          <pic:cNvPr id="0" name="Picture 39" descr="file:/C:/Users/VINCEN~1/AppData/Local/Temp/ViewElement__48jdeBVIEeetFdz5pzgWAw14650054486698867853.png"/>
+                          <pic:cNvPr id="0" name="Picture 40" descr="file:/tmp/ViewElement__48jdeBVIEeetFdz5pzgWAw12096986594521713914.png"/>
                           <pic:cNvPicPr>
                             <a:picLocks noChangeAspect="true"/>
                           </pic:cNvPicPr>
                         </pic:nvPicPr>
                         <pic:blipFill>
-                          <a:blip r:embed="rId24"/>
+                          <a:blip r:embed="rId26"/>
                           <a:stretch>
                             <a:fillRect/>
                           </a:stretch>
@@ -23819,12 +23744,12 @@
               <w:drawing>
                 <wp:inline distT="0" distR="0" distB="0" distL="0">
                   <wp:extent cx="203200" cy="203200"/>
-                  <wp:docPr id="40" name="Drawing 40" descr="file:/C:/Users/VINCEN~1/AppData/Local/Temp/ViewContainer__48qLIBVIEeetFdz5pzgWAw5922162148928859356.png"/>
+                  <wp:docPr id="41" name="Drawing 41" descr="file:/tmp/ViewContainer__48qLIBVIEeetFdz5pzgWAw6812335369467113674.png"/>
                   <a:graphic xmlns:a="http://schemas.openxmlformats.org/drawingml/2006/main">
                     <a:graphicData uri="http://schemas.openxmlformats.org/drawingml/2006/picture">
                       <pic:pic xmlns:pic="http://schemas.openxmlformats.org/drawingml/2006/picture">
                         <pic:nvPicPr>
-                          <pic:cNvPr id="0" name="Picture 40" descr="file:/C:/Users/VINCEN~1/AppData/Local/Temp/ViewContainer__48qLIBVIEeetFdz5pzgWAw5922162148928859356.png"/>
+                          <pic:cNvPr id="0" name="Picture 41" descr="file:/tmp/ViewContainer__48qLIBVIEeetFdz5pzgWAw6812335369467113674.png"/>
                           <pic:cNvPicPr>
                             <a:picLocks noChangeAspect="true"/>
                           </pic:cNvPicPr>
@@ -23879,12 +23804,419 @@
               <w:drawing>
                 <wp:inline distT="0" distR="0" distB="0" distL="0">
                   <wp:extent cx="203200" cy="190500"/>
-                  <wp:docPr id="41" name="Drawing 41" descr="file:/C:/Users/VINCEN~1/AppData/Local/Temp/ViewElement__48qLIhVIEeetFdz5pzgWAw7659769738720335864.png"/>
+                  <wp:docPr id="42" name="Drawing 42" descr="file:/tmp/ViewElement__48qLIhVIEeetFdz5pzgWAw5441020397193791578.png"/>
                   <a:graphic xmlns:a="http://schemas.openxmlformats.org/drawingml/2006/main">
                     <a:graphicData uri="http://schemas.openxmlformats.org/drawingml/2006/picture">
                       <pic:pic xmlns:pic="http://schemas.openxmlformats.org/drawingml/2006/picture">
                         <pic:nvPicPr>
-                          <pic:cNvPr id="0" name="Picture 41" descr="file:/C:/Users/VINCEN~1/AppData/Local/Temp/ViewElement__48qLIhVIEeetFdz5pzgWAw7659769738720335864.png"/>
+                          <pic:cNvPr id="0" name="Picture 42" descr="file:/tmp/ViewElement__48qLIhVIEeetFdz5pzgWAw5441020397193791578.png"/>
+                          <pic:cNvPicPr>
+                            <a:picLocks noChangeAspect="true"/>
+                          </pic:cNvPicPr>
+                        </pic:nvPicPr>
+                        <pic:blipFill>
+                          <a:blip r:embed="rId28"/>
+                          <a:stretch>
+                            <a:fillRect/>
+                          </a:stretch>
+                        </pic:blipFill>
+                        <pic:spPr>
+                          <a:xfrm>
+                            <a:off x="0" y="0"/>
+                            <a:ext cx="203200" cy="190500"/>
+                          </a:xfrm>
+                          <a:prstGeom prst="rect">
+                            <a:avLst/>
+                          </a:prstGeom>
+                        </pic:spPr>
+                      </pic:pic>
+                    </a:graphicData>
+                  </a:graphic>
+                </wp:inline>
+              </w:drawing>
+            </w:r>
+            <w:r>
+              <w:rPr>
+                <w:sz w:val="20"/>
+              </w:rPr>
+              <w:t xml:space="preserve">  </w:t>
+            </w:r>
+            <w:r>
+              <w:rPr>
+                <w:sz w:val="20"/>
+              </w:rPr>
+              <w:t>bookImage</w:t>
+            </w:r>
+          </w:p>
+        </w:tc>
+      </w:tr>
+      <w:tr>
+        <w:tc>
+          <w:tcPr>
+            <w:shd w:color="auto" w:val="clear" w:fill="fde6c3"/>
+          </w:tcPr>
+          <w:p>
+            <w:pPr>
+              <w:spacing w:before="0" w:after="0"/>
+            </w:pPr>
+            <w:r>
+              <w:t/>
+              <w:drawing>
+                <wp:inline distT="0" distR="0" distB="0" distL="0">
+                  <wp:extent cx="203200" cy="190500"/>
+                  <wp:docPr id="43" name="Drawing 43" descr="file:/tmp/ViewElement__48qLJBVIEeetFdz5pzgWAw1060081422236175899.png"/>
+                  <a:graphic xmlns:a="http://schemas.openxmlformats.org/drawingml/2006/main">
+                    <a:graphicData uri="http://schemas.openxmlformats.org/drawingml/2006/picture">
+                      <pic:pic xmlns:pic="http://schemas.openxmlformats.org/drawingml/2006/picture">
+                        <pic:nvPicPr>
+                          <pic:cNvPr id="0" name="Picture 43" descr="file:/tmp/ViewElement__48qLJBVIEeetFdz5pzgWAw1060081422236175899.png"/>
+                          <pic:cNvPicPr>
+                            <a:picLocks noChangeAspect="true"/>
+                          </pic:cNvPicPr>
+                        </pic:nvPicPr>
+                        <pic:blipFill>
+                          <a:blip r:embed="rId29"/>
+                          <a:stretch>
+                            <a:fillRect/>
+                          </a:stretch>
+                        </pic:blipFill>
+                        <pic:spPr>
+                          <a:xfrm>
+                            <a:off x="0" y="0"/>
+                            <a:ext cx="203200" cy="190500"/>
+                          </a:xfrm>
+                          <a:prstGeom prst="rect">
+                            <a:avLst/>
+                          </a:prstGeom>
+                        </pic:spPr>
+                      </pic:pic>
+                    </a:graphicData>
+                  </a:graphic>
+                </wp:inline>
+              </w:drawing>
+            </w:r>
+            <w:r>
+              <w:rPr>
+                <w:sz w:val="20"/>
+              </w:rPr>
+              <w:t xml:space="preserve">  </w:t>
+            </w:r>
+            <w:r>
+              <w:rPr>
+                <w:sz w:val="20"/>
+              </w:rPr>
+              <w:t>bookTitle</w:t>
+            </w:r>
+          </w:p>
+        </w:tc>
+      </w:tr>
+      <w:tr>
+        <w:tc>
+          <w:tcPr>
+            <w:shd w:color="auto" w:val="clear" w:fill="fde6c3"/>
+          </w:tcPr>
+          <w:p>
+            <w:pPr>
+              <w:spacing w:before="0" w:after="0"/>
+            </w:pPr>
+            <w:r>
+              <w:t/>
+              <w:drawing>
+                <wp:inline distT="0" distR="0" distB="0" distL="0">
+                  <wp:extent cx="203200" cy="190500"/>
+                  <wp:docPr id="44" name="Drawing 44" descr="file:/tmp/ViewElement__48qLJhVIEeetFdz5pzgWAw12195297123182887082.png"/>
+                  <a:graphic xmlns:a="http://schemas.openxmlformats.org/drawingml/2006/main">
+                    <a:graphicData uri="http://schemas.openxmlformats.org/drawingml/2006/picture">
+                      <pic:pic xmlns:pic="http://schemas.openxmlformats.org/drawingml/2006/picture">
+                        <pic:nvPicPr>
+                          <pic:cNvPr id="0" name="Picture 44" descr="file:/tmp/ViewElement__48qLJhVIEeetFdz5pzgWAw12195297123182887082.png"/>
+                          <pic:cNvPicPr>
+                            <a:picLocks noChangeAspect="true"/>
+                          </pic:cNvPicPr>
+                        </pic:nvPicPr>
+                        <pic:blipFill>
+                          <a:blip r:embed="rId29"/>
+                          <a:stretch>
+                            <a:fillRect/>
+                          </a:stretch>
+                        </pic:blipFill>
+                        <pic:spPr>
+                          <a:xfrm>
+                            <a:off x="0" y="0"/>
+                            <a:ext cx="203200" cy="190500"/>
+                          </a:xfrm>
+                          <a:prstGeom prst="rect">
+                            <a:avLst/>
+                          </a:prstGeom>
+                        </pic:spPr>
+                      </pic:pic>
+                    </a:graphicData>
+                  </a:graphic>
+                </wp:inline>
+              </w:drawing>
+            </w:r>
+            <w:r>
+              <w:rPr>
+                <w:sz w:val="20"/>
+              </w:rPr>
+              <w:t xml:space="preserve">  </w:t>
+            </w:r>
+            <w:r>
+              <w:rPr>
+                <w:sz w:val="20"/>
+              </w:rPr>
+              <w:t>author</w:t>
+            </w:r>
+          </w:p>
+        </w:tc>
+      </w:tr>
+      <w:tr>
+        <w:tc>
+          <w:tcPr>
+            <w:shd w:color="auto" w:val="clear" w:fill="fde6c3"/>
+          </w:tcPr>
+          <w:p>
+            <w:pPr>
+              <w:spacing w:before="0" w:after="0"/>
+            </w:pPr>
+            <w:r>
+              <w:t/>
+              <w:drawing>
+                <wp:inline distT="0" distR="0" distB="0" distL="0">
+                  <wp:extent cx="203200" cy="177800"/>
+                  <wp:docPr id="45" name="Drawing 45" descr="file:/tmp/ViewElement__48qLKBVIEeetFdz5pzgWAw15095945313471581228.png"/>
+                  <a:graphic xmlns:a="http://schemas.openxmlformats.org/drawingml/2006/main">
+                    <a:graphicData uri="http://schemas.openxmlformats.org/drawingml/2006/picture">
+                      <pic:pic xmlns:pic="http://schemas.openxmlformats.org/drawingml/2006/picture">
+                        <pic:nvPicPr>
+                          <pic:cNvPr id="0" name="Picture 45" descr="file:/tmp/ViewElement__48qLKBVIEeetFdz5pzgWAw15095945313471581228.png"/>
+                          <pic:cNvPicPr>
+                            <a:picLocks noChangeAspect="true"/>
+                          </pic:cNvPicPr>
+                        </pic:nvPicPr>
+                        <pic:blipFill>
+                          <a:blip r:embed="rId23"/>
+                          <a:stretch>
+                            <a:fillRect/>
+                          </a:stretch>
+                        </pic:blipFill>
+                        <pic:spPr>
+                          <a:xfrm>
+                            <a:off x="0" y="0"/>
+                            <a:ext cx="203200" cy="177800"/>
+                          </a:xfrm>
+                          <a:prstGeom prst="rect">
+                            <a:avLst/>
+                          </a:prstGeom>
+                        </pic:spPr>
+                      </pic:pic>
+                    </a:graphicData>
+                  </a:graphic>
+                </wp:inline>
+              </w:drawing>
+            </w:r>
+            <w:r>
+              <w:rPr>
+                <w:sz w:val="20"/>
+              </w:rPr>
+              <w:t xml:space="preserve">  </w:t>
+            </w:r>
+            <w:r>
+              <w:rPr>
+                <w:sz w:val="20"/>
+              </w:rPr>
+              <w:t>addToCart</w:t>
+            </w:r>
+          </w:p>
+        </w:tc>
+      </w:tr>
+    </w:tbl>
+    <w:p>
+      <w:r>
+        <w:t/>
+      </w:r>
+    </w:p>
+    <w:p>
+      <w:pPr>
+        <w:rPr>
+          <w:i/>
+          <w:u w:val="single"/>
+        </w:rPr>
+      </w:pPr>
+      <w:r>
+        <w:rPr>
+          <w:i/>
+          <w:u w:val="single"/>
+        </w:rPr>
+        <w:t>Panel</w:t>
+      </w:r>
+      <w:r>
+        <w:rPr>
+          <w:i/>
+          <w:u w:val="single"/>
+        </w:rPr>
+        <w:t xml:space="preserve"> : </w:t>
+      </w:r>
+      <w:r>
+        <w:rPr>
+          <w:i/>
+          <w:u w:val="single"/>
+        </w:rPr>
+        <w:t>ShoppingCart</w:t>
+      </w:r>
+    </w:p>
+    <w:tbl>
+      <w:tblPr>
+        <w:tblW w:w="0" w:type="auto"/>
+        <w:tblBorders>
+          <w:top w:val="single"/>
+          <w:left w:val="single"/>
+          <w:bottom w:val="single"/>
+          <w:right w:val="single"/>
+          <w:insideH w:val="single"/>
+          <w:insideV w:val="single"/>
+        </w:tblBorders>
+      </w:tblPr>
+      <w:tr>
+        <w:tc>
+          <w:tcPr>
+            <w:shd w:color="auto" w:val="clear" w:fill="fdce89"/>
+          </w:tcPr>
+          <w:p>
+            <w:pPr>
+              <w:spacing w:before="0" w:after="0"/>
+            </w:pPr>
+            <w:r>
+              <w:t/>
+              <w:drawing>
+                <wp:inline distT="0" distR="0" distB="0" distL="0">
+                  <wp:extent cx="203200" cy="203200"/>
+                  <wp:docPr id="46" name="Drawing 46" descr="file:/tmp/ViewContainer__48qLLxVIEeetFdz5pzgWAw4540089721807842812.png"/>
+                  <a:graphic xmlns:a="http://schemas.openxmlformats.org/drawingml/2006/main">
+                    <a:graphicData uri="http://schemas.openxmlformats.org/drawingml/2006/picture">
+                      <pic:pic xmlns:pic="http://schemas.openxmlformats.org/drawingml/2006/picture">
+                        <pic:nvPicPr>
+                          <pic:cNvPr id="0" name="Picture 46" descr="file:/tmp/ViewContainer__48qLLxVIEeetFdz5pzgWAw4540089721807842812.png"/>
+                          <pic:cNvPicPr>
+                            <a:picLocks noChangeAspect="true"/>
+                          </pic:cNvPicPr>
+                        </pic:nvPicPr>
+                        <pic:blipFill>
+                          <a:blip r:embed="rId16"/>
+                          <a:stretch>
+                            <a:fillRect/>
+                          </a:stretch>
+                        </pic:blipFill>
+                        <pic:spPr>
+                          <a:xfrm>
+                            <a:off x="0" y="0"/>
+                            <a:ext cx="203200" cy="203200"/>
+                          </a:xfrm>
+                          <a:prstGeom prst="rect">
+                            <a:avLst/>
+                          </a:prstGeom>
+                        </pic:spPr>
+                      </pic:pic>
+                    </a:graphicData>
+                  </a:graphic>
+                </wp:inline>
+              </w:drawing>
+            </w:r>
+            <w:r>
+              <w:rPr>
+                <w:sz w:val="20"/>
+              </w:rPr>
+              <w:t xml:space="preserve">  </w:t>
+            </w:r>
+            <w:r>
+              <w:rPr>
+                <w:sz w:val="20"/>
+              </w:rPr>
+              <w:t>ShoppingCart</w:t>
+            </w:r>
+          </w:p>
+        </w:tc>
+      </w:tr>
+      <w:tr>
+        <w:tc>
+          <w:tcPr>
+            <w:shd w:color="auto" w:val="clear" w:fill="fde6c3"/>
+          </w:tcPr>
+          <w:p>
+            <w:pPr>
+              <w:spacing w:before="0" w:after="0"/>
+            </w:pPr>
+            <w:r>
+              <w:t/>
+              <w:drawing>
+                <wp:inline distT="0" distR="0" distB="0" distL="0">
+                  <wp:extent cx="203200" cy="203200"/>
+                  <wp:docPr id="47" name="Drawing 47" descr="file:/tmp/ViewContainer__48qLMRVIEeetFdz5pzgWAw10389678464156520121.png"/>
+                  <a:graphic xmlns:a="http://schemas.openxmlformats.org/drawingml/2006/main">
+                    <a:graphicData uri="http://schemas.openxmlformats.org/drawingml/2006/picture">
+                      <pic:pic xmlns:pic="http://schemas.openxmlformats.org/drawingml/2006/picture">
+                        <pic:nvPicPr>
+                          <pic:cNvPr id="0" name="Picture 47" descr="file:/tmp/ViewContainer__48qLMRVIEeetFdz5pzgWAw10389678464156520121.png"/>
+                          <pic:cNvPicPr>
+                            <a:picLocks noChangeAspect="true"/>
+                          </pic:cNvPicPr>
+                        </pic:nvPicPr>
+                        <pic:blipFill>
+                          <a:blip r:embed="rId17"/>
+                          <a:stretch>
+                            <a:fillRect/>
+                          </a:stretch>
+                        </pic:blipFill>
+                        <pic:spPr>
+                          <a:xfrm>
+                            <a:off x="0" y="0"/>
+                            <a:ext cx="203200" cy="203200"/>
+                          </a:xfrm>
+                          <a:prstGeom prst="rect">
+                            <a:avLst/>
+                          </a:prstGeom>
+                        </pic:spPr>
+                      </pic:pic>
+                    </a:graphicData>
+                  </a:graphic>
+                </wp:inline>
+              </w:drawing>
+            </w:r>
+            <w:r>
+              <w:rPr>
+                <w:sz w:val="20"/>
+              </w:rPr>
+              <w:t xml:space="preserve">  </w:t>
+            </w:r>
+            <w:r>
+              <w:rPr>
+                <w:sz w:val="20"/>
+              </w:rPr>
+              <w:t>CartLines</w:t>
+            </w:r>
+          </w:p>
+        </w:tc>
+      </w:tr>
+      <w:tr>
+        <w:tc>
+          <w:tcPr>
+            <w:shd w:color="auto" w:val="clear" w:fill="fde6c3"/>
+          </w:tcPr>
+          <w:p>
+            <w:pPr>
+              <w:spacing w:before="0" w:after="0"/>
+            </w:pPr>
+            <w:r>
+              <w:t/>
+              <w:drawing>
+                <wp:inline distT="0" distR="0" distB="0" distL="0">
+                  <wp:extent cx="203200" cy="190500"/>
+                  <wp:docPr id="48" name="Drawing 48" descr="file:/tmp/ViewElement__48qLPxVIEeetFdz5pzgWAw715354606584276310.png"/>
+                  <a:graphic xmlns:a="http://schemas.openxmlformats.org/drawingml/2006/main">
+                    <a:graphicData uri="http://schemas.openxmlformats.org/drawingml/2006/picture">
+                      <pic:pic xmlns:pic="http://schemas.openxmlformats.org/drawingml/2006/picture">
+                        <pic:nvPicPr>
+                          <pic:cNvPr id="0" name="Picture 48" descr="file:/tmp/ViewElement__48qLPxVIEeetFdz5pzgWAw715354606584276310.png"/>
                           <pic:cNvPicPr>
                             <a:picLocks noChangeAspect="true"/>
                           </pic:cNvPicPr>
@@ -23920,187 +24252,7 @@
               <w:rPr>
                 <w:sz w:val="20"/>
               </w:rPr>
-              <w:t>bookImage</w:t>
-            </w:r>
-          </w:p>
-        </w:tc>
-      </w:tr>
-      <w:tr>
-        <w:tc>
-          <w:tcPr>
-            <w:shd w:color="auto" w:val="clear" w:fill="fde6c3"/>
-          </w:tcPr>
-          <w:p>
-            <w:pPr>
-              <w:spacing w:before="0" w:after="0"/>
-            </w:pPr>
-            <w:r>
-              <w:t/>
-              <w:drawing>
-                <wp:inline distT="0" distR="0" distB="0" distL="0">
-                  <wp:extent cx="203200" cy="190500"/>
-                  <wp:docPr id="42" name="Drawing 42" descr="file:/C:/Users/VINCEN~1/AppData/Local/Temp/ViewElement__48qLJBVIEeetFdz5pzgWAw14142061960592560927.png"/>
-                  <a:graphic xmlns:a="http://schemas.openxmlformats.org/drawingml/2006/main">
-                    <a:graphicData uri="http://schemas.openxmlformats.org/drawingml/2006/picture">
-                      <pic:pic xmlns:pic="http://schemas.openxmlformats.org/drawingml/2006/picture">
-                        <pic:nvPicPr>
-                          <pic:cNvPr id="0" name="Picture 42" descr="file:/C:/Users/VINCEN~1/AppData/Local/Temp/ViewElement__48qLJBVIEeetFdz5pzgWAw14142061960592560927.png"/>
-                          <pic:cNvPicPr>
-                            <a:picLocks noChangeAspect="true"/>
-                          </pic:cNvPicPr>
-                        </pic:nvPicPr>
-                        <pic:blipFill>
-                          <a:blip r:embed="rId27"/>
-                          <a:stretch>
-                            <a:fillRect/>
-                          </a:stretch>
-                        </pic:blipFill>
-                        <pic:spPr>
-                          <a:xfrm>
-                            <a:off x="0" y="0"/>
-                            <a:ext cx="203200" cy="190500"/>
-                          </a:xfrm>
-                          <a:prstGeom prst="rect">
-                            <a:avLst/>
-                          </a:prstGeom>
-                        </pic:spPr>
-                      </pic:pic>
-                    </a:graphicData>
-                  </a:graphic>
-                </wp:inline>
-              </w:drawing>
-            </w:r>
-            <w:r>
-              <w:rPr>
-                <w:sz w:val="20"/>
-              </w:rPr>
-              <w:t xml:space="preserve">  </w:t>
-            </w:r>
-            <w:r>
-              <w:rPr>
-                <w:sz w:val="20"/>
-              </w:rPr>
-              <w:t>bookTitle</w:t>
-            </w:r>
-          </w:p>
-        </w:tc>
-      </w:tr>
-      <w:tr>
-        <w:tc>
-          <w:tcPr>
-            <w:shd w:color="auto" w:val="clear" w:fill="fde6c3"/>
-          </w:tcPr>
-          <w:p>
-            <w:pPr>
-              <w:spacing w:before="0" w:after="0"/>
-            </w:pPr>
-            <w:r>
-              <w:t/>
-              <w:drawing>
-                <wp:inline distT="0" distR="0" distB="0" distL="0">
-                  <wp:extent cx="203200" cy="190500"/>
-                  <wp:docPr id="43" name="Drawing 43" descr="file:/C:/Users/VINCEN~1/AppData/Local/Temp/ViewElement__48qLJhVIEeetFdz5pzgWAw1311683124345103452.png"/>
-                  <a:graphic xmlns:a="http://schemas.openxmlformats.org/drawingml/2006/main">
-                    <a:graphicData uri="http://schemas.openxmlformats.org/drawingml/2006/picture">
-                      <pic:pic xmlns:pic="http://schemas.openxmlformats.org/drawingml/2006/picture">
-                        <pic:nvPicPr>
-                          <pic:cNvPr id="0" name="Picture 43" descr="file:/C:/Users/VINCEN~1/AppData/Local/Temp/ViewElement__48qLJhVIEeetFdz5pzgWAw1311683124345103452.png"/>
-                          <pic:cNvPicPr>
-                            <a:picLocks noChangeAspect="true"/>
-                          </pic:cNvPicPr>
-                        </pic:nvPicPr>
-                        <pic:blipFill>
-                          <a:blip r:embed="rId27"/>
-                          <a:stretch>
-                            <a:fillRect/>
-                          </a:stretch>
-                        </pic:blipFill>
-                        <pic:spPr>
-                          <a:xfrm>
-                            <a:off x="0" y="0"/>
-                            <a:ext cx="203200" cy="190500"/>
-                          </a:xfrm>
-                          <a:prstGeom prst="rect">
-                            <a:avLst/>
-                          </a:prstGeom>
-                        </pic:spPr>
-                      </pic:pic>
-                    </a:graphicData>
-                  </a:graphic>
-                </wp:inline>
-              </w:drawing>
-            </w:r>
-            <w:r>
-              <w:rPr>
-                <w:sz w:val="20"/>
-              </w:rPr>
-              <w:t xml:space="preserve">  </w:t>
-            </w:r>
-            <w:r>
-              <w:rPr>
-                <w:sz w:val="20"/>
-              </w:rPr>
-              <w:t>author</w:t>
-            </w:r>
-          </w:p>
-        </w:tc>
-      </w:tr>
-      <w:tr>
-        <w:tc>
-          <w:tcPr>
-            <w:shd w:color="auto" w:val="clear" w:fill="fde6c3"/>
-          </w:tcPr>
-          <w:p>
-            <w:pPr>
-              <w:spacing w:before="0" w:after="0"/>
-            </w:pPr>
-            <w:r>
-              <w:t/>
-              <w:drawing>
-                <wp:inline distT="0" distR="0" distB="0" distL="0">
-                  <wp:extent cx="203200" cy="177800"/>
-                  <wp:docPr id="44" name="Drawing 44" descr="file:/C:/Users/VINCEN~1/AppData/Local/Temp/ViewElement__48qLKBVIEeetFdz5pzgWAw5794912303907489851.png"/>
-                  <a:graphic xmlns:a="http://schemas.openxmlformats.org/drawingml/2006/main">
-                    <a:graphicData uri="http://schemas.openxmlformats.org/drawingml/2006/picture">
-                      <pic:pic xmlns:pic="http://schemas.openxmlformats.org/drawingml/2006/picture">
-                        <pic:nvPicPr>
-                          <pic:cNvPr id="0" name="Picture 44" descr="file:/C:/Users/VINCEN~1/AppData/Local/Temp/ViewElement__48qLKBVIEeetFdz5pzgWAw5794912303907489851.png"/>
-                          <pic:cNvPicPr>
-                            <a:picLocks noChangeAspect="true"/>
-                          </pic:cNvPicPr>
-                        </pic:nvPicPr>
-                        <pic:blipFill>
-                          <a:blip r:embed="rId21"/>
-                          <a:stretch>
-                            <a:fillRect/>
-                          </a:stretch>
-                        </pic:blipFill>
-                        <pic:spPr>
-                          <a:xfrm>
-                            <a:off x="0" y="0"/>
-                            <a:ext cx="203200" cy="177800"/>
-                          </a:xfrm>
-                          <a:prstGeom prst="rect">
-                            <a:avLst/>
-                          </a:prstGeom>
-                        </pic:spPr>
-                      </pic:pic>
-                    </a:graphicData>
-                  </a:graphic>
-                </wp:inline>
-              </w:drawing>
-            </w:r>
-            <w:r>
-              <w:rPr>
-                <w:sz w:val="20"/>
-              </w:rPr>
-              <w:t xml:space="preserve">  </w:t>
-            </w:r>
-            <w:r>
-              <w:rPr>
-                <w:sz w:val="20"/>
-              </w:rPr>
-              <w:t>addToCart</w:t>
+              <w:t>checkout</w:t>
             </w:r>
           </w:p>
         </w:tc>
@@ -24123,7 +24275,7 @@
           <w:i/>
           <w:u w:val="single"/>
         </w:rPr>
-        <w:t>Panel</w:t>
+        <w:t>Table</w:t>
       </w:r>
       <w:r>
         <w:rPr>
@@ -24137,7 +24289,7 @@
           <w:i/>
           <w:u w:val="single"/>
         </w:rPr>
-        <w:t>ShoppingCart</w:t>
+        <w:t>CartLines</w:t>
       </w:r>
     </w:p>
     <w:tbl>
@@ -24166,72 +24318,12 @@
               <w:drawing>
                 <wp:inline distT="0" distR="0" distB="0" distL="0">
                   <wp:extent cx="203200" cy="203200"/>
-                  <wp:docPr id="45" name="Drawing 45" descr="file:/C:/Users/VINCEN~1/AppData/Local/Temp/ViewContainer__48qLLxVIEeetFdz5pzgWAw2311552721664126153.png"/>
+                  <wp:docPr id="49" name="Drawing 49" descr="file:/tmp/ViewContainer__48qLMRVIEeetFdz5pzgWAw14813556707818446984.png"/>
                   <a:graphic xmlns:a="http://schemas.openxmlformats.org/drawingml/2006/main">
                     <a:graphicData uri="http://schemas.openxmlformats.org/drawingml/2006/picture">
                       <pic:pic xmlns:pic="http://schemas.openxmlformats.org/drawingml/2006/picture">
                         <pic:nvPicPr>
-                          <pic:cNvPr id="0" name="Picture 45" descr="file:/C:/Users/VINCEN~1/AppData/Local/Temp/ViewContainer__48qLLxVIEeetFdz5pzgWAw2311552721664126153.png"/>
-                          <pic:cNvPicPr>
-                            <a:picLocks noChangeAspect="true"/>
-                          </pic:cNvPicPr>
-                        </pic:nvPicPr>
-                        <pic:blipFill>
-                          <a:blip r:embed="rId16"/>
-                          <a:stretch>
-                            <a:fillRect/>
-                          </a:stretch>
-                        </pic:blipFill>
-                        <pic:spPr>
-                          <a:xfrm>
-                            <a:off x="0" y="0"/>
-                            <a:ext cx="203200" cy="203200"/>
-                          </a:xfrm>
-                          <a:prstGeom prst="rect">
-                            <a:avLst/>
-                          </a:prstGeom>
-                        </pic:spPr>
-                      </pic:pic>
-                    </a:graphicData>
-                  </a:graphic>
-                </wp:inline>
-              </w:drawing>
-            </w:r>
-            <w:r>
-              <w:rPr>
-                <w:sz w:val="20"/>
-              </w:rPr>
-              <w:t xml:space="preserve">  </w:t>
-            </w:r>
-            <w:r>
-              <w:rPr>
-                <w:sz w:val="20"/>
-              </w:rPr>
-              <w:t>ShoppingCart</w:t>
-            </w:r>
-          </w:p>
-        </w:tc>
-      </w:tr>
-      <w:tr>
-        <w:tc>
-          <w:tcPr>
-            <w:shd w:color="auto" w:val="clear" w:fill="fde6c3"/>
-          </w:tcPr>
-          <w:p>
-            <w:pPr>
-              <w:spacing w:before="0" w:after="0"/>
-            </w:pPr>
-            <w:r>
-              <w:t/>
-              <w:drawing>
-                <wp:inline distT="0" distR="0" distB="0" distL="0">
-                  <wp:extent cx="203200" cy="203200"/>
-                  <wp:docPr id="46" name="Drawing 46" descr="file:/C:/Users/VINCEN~1/AppData/Local/Temp/ViewContainer__48qLMRVIEeetFdz5pzgWAw14139858638033978772.png"/>
-                  <a:graphic xmlns:a="http://schemas.openxmlformats.org/drawingml/2006/main">
-                    <a:graphicData uri="http://schemas.openxmlformats.org/drawingml/2006/picture">
-                      <pic:pic xmlns:pic="http://schemas.openxmlformats.org/drawingml/2006/picture">
-                        <pic:nvPicPr>
-                          <pic:cNvPr id="0" name="Picture 46" descr="file:/C:/Users/VINCEN~1/AppData/Local/Temp/ViewContainer__48qLMRVIEeetFdz5pzgWAw14139858638033978772.png"/>
+                          <pic:cNvPr id="0" name="Picture 49" descr="file:/tmp/ViewContainer__48qLMRVIEeetFdz5pzgWAw14813556707818446984.png"/>
                           <pic:cNvPicPr>
                             <a:picLocks noChangeAspect="true"/>
                           </pic:cNvPicPr>
@@ -24286,18 +24378,18 @@
               <w:drawing>
                 <wp:inline distT="0" distR="0" distB="0" distL="0">
                   <wp:extent cx="203200" cy="190500"/>
-                  <wp:docPr id="47" name="Drawing 47" descr="file:/C:/Users/VINCEN~1/AppData/Local/Temp/ViewElement__48qLPxVIEeetFdz5pzgWAw15171983462830818678.png"/>
+                  <wp:docPr id="50" name="Drawing 50" descr="file:/tmp/ViewElement__48qLMxVIEeetFdz5pzgWAw14456814438461675351.png"/>
                   <a:graphic xmlns:a="http://schemas.openxmlformats.org/drawingml/2006/main">
                     <a:graphicData uri="http://schemas.openxmlformats.org/drawingml/2006/picture">
                       <pic:pic xmlns:pic="http://schemas.openxmlformats.org/drawingml/2006/picture">
                         <pic:nvPicPr>
-                          <pic:cNvPr id="0" name="Picture 47" descr="file:/C:/Users/VINCEN~1/AppData/Local/Temp/ViewElement__48qLPxVIEeetFdz5pzgWAw15171983462830818678.png"/>
+                          <pic:cNvPr id="0" name="Picture 50" descr="file:/tmp/ViewElement__48qLMxVIEeetFdz5pzgWAw14456814438461675351.png"/>
                           <pic:cNvPicPr>
                             <a:picLocks noChangeAspect="true"/>
                           </pic:cNvPicPr>
                         </pic:nvPicPr>
                         <pic:blipFill>
-                          <a:blip r:embed="rId24"/>
+                          <a:blip r:embed="rId29"/>
                           <a:stretch>
                             <a:fillRect/>
                           </a:stretch>
@@ -24327,62 +24419,15 @@
               <w:rPr>
                 <w:sz w:val="20"/>
               </w:rPr>
-              <w:t>checkout</w:t>
-            </w:r>
-          </w:p>
-        </w:tc>
-      </w:tr>
-    </w:tbl>
-    <w:p>
-      <w:r>
-        <w:t/>
-      </w:r>
-    </w:p>
-    <w:p>
-      <w:pPr>
-        <w:rPr>
-          <w:i/>
-          <w:u w:val="single"/>
-        </w:rPr>
-      </w:pPr>
-      <w:r>
-        <w:rPr>
-          <w:i/>
-          <w:u w:val="single"/>
-        </w:rPr>
-        <w:t>Table</w:t>
-      </w:r>
-      <w:r>
-        <w:rPr>
-          <w:i/>
-          <w:u w:val="single"/>
-        </w:rPr>
-        <w:t xml:space="preserve"> : </w:t>
-      </w:r>
-      <w:r>
-        <w:rPr>
-          <w:i/>
-          <w:u w:val="single"/>
-        </w:rPr>
-        <w:t>CartLines</w:t>
-      </w:r>
-    </w:p>
-    <w:tbl>
-      <w:tblPr>
-        <w:tblW w:w="0" w:type="auto"/>
-        <w:tblBorders>
-          <w:top w:val="single"/>
-          <w:left w:val="single"/>
-          <w:bottom w:val="single"/>
-          <w:right w:val="single"/>
-          <w:insideH w:val="single"/>
-          <w:insideV w:val="single"/>
-        </w:tblBorders>
-      </w:tblPr>
-      <w:tr>
-        <w:tc>
-          <w:tcPr>
-            <w:shd w:color="auto" w:val="clear" w:fill="fdce89"/>
+              <w:t>title</w:t>
+            </w:r>
+          </w:p>
+        </w:tc>
+      </w:tr>
+      <w:tr>
+        <w:tc>
+          <w:tcPr>
+            <w:shd w:color="auto" w:val="clear" w:fill="fde6c3"/>
           </w:tcPr>
           <w:p>
             <w:pPr>
@@ -24392,79 +24437,19 @@
               <w:t/>
               <w:drawing>
                 <wp:inline distT="0" distR="0" distB="0" distL="0">
-                  <wp:extent cx="203200" cy="203200"/>
-                  <wp:docPr id="48" name="Drawing 48" descr="file:/C:/Users/VINCEN~1/AppData/Local/Temp/ViewContainer__48qLMRVIEeetFdz5pzgWAw13639976802669880097.png"/>
+                  <wp:extent cx="203200" cy="190500"/>
+                  <wp:docPr id="51" name="Drawing 51" descr="file:/tmp/ViewElement__48qLNRVIEeetFdz5pzgWAw9642978183332711606.png"/>
                   <a:graphic xmlns:a="http://schemas.openxmlformats.org/drawingml/2006/main">
                     <a:graphicData uri="http://schemas.openxmlformats.org/drawingml/2006/picture">
                       <pic:pic xmlns:pic="http://schemas.openxmlformats.org/drawingml/2006/picture">
                         <pic:nvPicPr>
-                          <pic:cNvPr id="0" name="Picture 48" descr="file:/C:/Users/VINCEN~1/AppData/Local/Temp/ViewContainer__48qLMRVIEeetFdz5pzgWAw13639976802669880097.png"/>
+                          <pic:cNvPr id="0" name="Picture 51" descr="file:/tmp/ViewElement__48qLNRVIEeetFdz5pzgWAw9642978183332711606.png"/>
                           <pic:cNvPicPr>
                             <a:picLocks noChangeAspect="true"/>
                           </pic:cNvPicPr>
                         </pic:nvPicPr>
                         <pic:blipFill>
-                          <a:blip r:embed="rId17"/>
-                          <a:stretch>
-                            <a:fillRect/>
-                          </a:stretch>
-                        </pic:blipFill>
-                        <pic:spPr>
-                          <a:xfrm>
-                            <a:off x="0" y="0"/>
-                            <a:ext cx="203200" cy="203200"/>
-                          </a:xfrm>
-                          <a:prstGeom prst="rect">
-                            <a:avLst/>
-                          </a:prstGeom>
-                        </pic:spPr>
-                      </pic:pic>
-                    </a:graphicData>
-                  </a:graphic>
-                </wp:inline>
-              </w:drawing>
-            </w:r>
-            <w:r>
-              <w:rPr>
-                <w:sz w:val="20"/>
-              </w:rPr>
-              <w:t xml:space="preserve">  </w:t>
-            </w:r>
-            <w:r>
-              <w:rPr>
-                <w:sz w:val="20"/>
-              </w:rPr>
-              <w:t>CartLines</w:t>
-            </w:r>
-          </w:p>
-        </w:tc>
-      </w:tr>
-      <w:tr>
-        <w:tc>
-          <w:tcPr>
-            <w:shd w:color="auto" w:val="clear" w:fill="fde6c3"/>
-          </w:tcPr>
-          <w:p>
-            <w:pPr>
-              <w:spacing w:before="0" w:after="0"/>
-            </w:pPr>
-            <w:r>
-              <w:t/>
-              <w:drawing>
-                <wp:inline distT="0" distR="0" distB="0" distL="0">
-                  <wp:extent cx="203200" cy="190500"/>
-                  <wp:docPr id="49" name="Drawing 49" descr="file:/C:/Users/VINCEN~1/AppData/Local/Temp/ViewElement__48qLMxVIEeetFdz5pzgWAw2568783180242686919.png"/>
-                  <a:graphic xmlns:a="http://schemas.openxmlformats.org/drawingml/2006/main">
-                    <a:graphicData uri="http://schemas.openxmlformats.org/drawingml/2006/picture">
-                      <pic:pic xmlns:pic="http://schemas.openxmlformats.org/drawingml/2006/picture">
-                        <pic:nvPicPr>
-                          <pic:cNvPr id="0" name="Picture 49" descr="file:/C:/Users/VINCEN~1/AppData/Local/Temp/ViewElement__48qLMxVIEeetFdz5pzgWAw2568783180242686919.png"/>
-                          <pic:cNvPicPr>
-                            <a:picLocks noChangeAspect="true"/>
-                          </pic:cNvPicPr>
-                        </pic:nvPicPr>
-                        <pic:blipFill>
-                          <a:blip r:embed="rId27"/>
+                          <a:blip r:embed="rId29"/>
                           <a:stretch>
                             <a:fillRect/>
                           </a:stretch>
@@ -24494,7 +24479,7 @@
               <w:rPr>
                 <w:sz w:val="20"/>
               </w:rPr>
-              <w:t>title</w:t>
+              <w:t>author</w:t>
             </w:r>
           </w:p>
         </w:tc>
@@ -24513,18 +24498,18 @@
               <w:drawing>
                 <wp:inline distT="0" distR="0" distB="0" distL="0">
                   <wp:extent cx="203200" cy="190500"/>
-                  <wp:docPr id="50" name="Drawing 50" descr="file:/C:/Users/VINCEN~1/AppData/Local/Temp/ViewElement__48qLNRVIEeetFdz5pzgWAw4030078402118849604.png"/>
+                  <wp:docPr id="52" name="Drawing 52" descr="file:/tmp/ViewElement__48qLNxVIEeetFdz5pzgWAw14048251673816449388.png"/>
                   <a:graphic xmlns:a="http://schemas.openxmlformats.org/drawingml/2006/main">
                     <a:graphicData uri="http://schemas.openxmlformats.org/drawingml/2006/picture">
                       <pic:pic xmlns:pic="http://schemas.openxmlformats.org/drawingml/2006/picture">
                         <pic:nvPicPr>
-                          <pic:cNvPr id="0" name="Picture 50" descr="file:/C:/Users/VINCEN~1/AppData/Local/Temp/ViewElement__48qLNRVIEeetFdz5pzgWAw4030078402118849604.png"/>
+                          <pic:cNvPr id="0" name="Picture 52" descr="file:/tmp/ViewElement__48qLNxVIEeetFdz5pzgWAw14048251673816449388.png"/>
                           <pic:cNvPicPr>
                             <a:picLocks noChangeAspect="true"/>
                           </pic:cNvPicPr>
                         </pic:nvPicPr>
                         <pic:blipFill>
-                          <a:blip r:embed="rId27"/>
+                          <a:blip r:embed="rId29"/>
                           <a:stretch>
                             <a:fillRect/>
                           </a:stretch>
@@ -24554,7 +24539,7 @@
               <w:rPr>
                 <w:sz w:val="20"/>
               </w:rPr>
-              <w:t>author</w:t>
+              <w:t>price</w:t>
             </w:r>
           </w:p>
         </w:tc>
@@ -24572,19 +24557,79 @@
               <w:t/>
               <w:drawing>
                 <wp:inline distT="0" distR="0" distB="0" distL="0">
-                  <wp:extent cx="203200" cy="190500"/>
-                  <wp:docPr id="51" name="Drawing 51" descr="file:/C:/Users/VINCEN~1/AppData/Local/Temp/ViewElement__48qLNxVIEeetFdz5pzgWAw2955794896830072966.png"/>
+                  <wp:extent cx="203200" cy="177800"/>
+                  <wp:docPr id="53" name="Drawing 53" descr="file:/tmp/ViewElement__48qLORVIEeetFdz5pzgWAw12386150979555913277.png"/>
                   <a:graphic xmlns:a="http://schemas.openxmlformats.org/drawingml/2006/main">
                     <a:graphicData uri="http://schemas.openxmlformats.org/drawingml/2006/picture">
                       <pic:pic xmlns:pic="http://schemas.openxmlformats.org/drawingml/2006/picture">
                         <pic:nvPicPr>
-                          <pic:cNvPr id="0" name="Picture 51" descr="file:/C:/Users/VINCEN~1/AppData/Local/Temp/ViewElement__48qLNxVIEeetFdz5pzgWAw2955794896830072966.png"/>
+                          <pic:cNvPr id="0" name="Picture 53" descr="file:/tmp/ViewElement__48qLORVIEeetFdz5pzgWAw12386150979555913277.png"/>
                           <pic:cNvPicPr>
                             <a:picLocks noChangeAspect="true"/>
                           </pic:cNvPicPr>
                         </pic:nvPicPr>
                         <pic:blipFill>
-                          <a:blip r:embed="rId27"/>
+                          <a:blip r:embed="rId24"/>
+                          <a:stretch>
+                            <a:fillRect/>
+                          </a:stretch>
+                        </pic:blipFill>
+                        <pic:spPr>
+                          <a:xfrm>
+                            <a:off x="0" y="0"/>
+                            <a:ext cx="203200" cy="177800"/>
+                          </a:xfrm>
+                          <a:prstGeom prst="rect">
+                            <a:avLst/>
+                          </a:prstGeom>
+                        </pic:spPr>
+                      </pic:pic>
+                    </a:graphicData>
+                  </a:graphic>
+                </wp:inline>
+              </w:drawing>
+            </w:r>
+            <w:r>
+              <w:rPr>
+                <w:sz w:val="20"/>
+              </w:rPr>
+              <w:t xml:space="preserve">  </w:t>
+            </w:r>
+            <w:r>
+              <w:rPr>
+                <w:sz w:val="20"/>
+              </w:rPr>
+              <w:t>quantity</w:t>
+            </w:r>
+          </w:p>
+        </w:tc>
+      </w:tr>
+      <w:tr>
+        <w:tc>
+          <w:tcPr>
+            <w:shd w:color="auto" w:val="clear" w:fill="fde6c3"/>
+          </w:tcPr>
+          <w:p>
+            <w:pPr>
+              <w:spacing w:before="0" w:after="0"/>
+            </w:pPr>
+            <w:r>
+              <w:t/>
+              <w:drawing>
+                <wp:inline distT="0" distR="0" distB="0" distL="0">
+                  <wp:extent cx="203200" cy="190500"/>
+                  <wp:docPr id="54" name="Drawing 54" descr="file:/tmp/ViewElement__48qLOxVIEeetFdz5pzgWAw3394503358870393793.png"/>
+                  <a:graphic xmlns:a="http://schemas.openxmlformats.org/drawingml/2006/main">
+                    <a:graphicData uri="http://schemas.openxmlformats.org/drawingml/2006/picture">
+                      <pic:pic xmlns:pic="http://schemas.openxmlformats.org/drawingml/2006/picture">
+                        <pic:nvPicPr>
+                          <pic:cNvPr id="0" name="Picture 54" descr="file:/tmp/ViewElement__48qLOxVIEeetFdz5pzgWAw3394503358870393793.png"/>
+                          <pic:cNvPicPr>
+                            <a:picLocks noChangeAspect="true"/>
+                          </pic:cNvPicPr>
+                        </pic:nvPicPr>
+                        <pic:blipFill>
+                          <a:blip r:embed="rId26"/>
                           <a:stretch>
                             <a:fillRect/>
                           </a:stretch>
@@ -24614,126 +24659,6 @@
               <w:rPr>
                 <w:sz w:val="20"/>
               </w:rPr>
-              <w:t>price</w:t>
-            </w:r>
-          </w:p>
-        </w:tc>
-      </w:tr>
-      <w:tr>
-        <w:tc>
-          <w:tcPr>
-            <w:shd w:color="auto" w:val="clear" w:fill="fde6c3"/>
-          </w:tcPr>
-          <w:p>
-            <w:pPr>
-              <w:spacing w:before="0" w:after="0"/>
-            </w:pPr>
-            <w:r>
-              <w:t/>
-              <w:drawing>
-                <wp:inline distT="0" distR="0" distB="0" distL="0">
-                  <wp:extent cx="203200" cy="177800"/>
-                  <wp:docPr id="52" name="Drawing 52" descr="file:/C:/Users/VINCEN~1/AppData/Local/Temp/ViewElement__48qLORVIEeetFdz5pzgWAw7808260803690316345.png"/>
-                  <a:graphic xmlns:a="http://schemas.openxmlformats.org/drawingml/2006/main">
-                    <a:graphicData uri="http://schemas.openxmlformats.org/drawingml/2006/picture">
-                      <pic:pic xmlns:pic="http://schemas.openxmlformats.org/drawingml/2006/picture">
-                        <pic:nvPicPr>
-                          <pic:cNvPr id="0" name="Picture 52" descr="file:/C:/Users/VINCEN~1/AppData/Local/Temp/ViewElement__48qLORVIEeetFdz5pzgWAw7808260803690316345.png"/>
-                          <pic:cNvPicPr>
-                            <a:picLocks noChangeAspect="true"/>
-                          </pic:cNvPicPr>
-                        </pic:nvPicPr>
-                        <pic:blipFill>
-                          <a:blip r:embed="rId22"/>
-                          <a:stretch>
-                            <a:fillRect/>
-                          </a:stretch>
-                        </pic:blipFill>
-                        <pic:spPr>
-                          <a:xfrm>
-                            <a:off x="0" y="0"/>
-                            <a:ext cx="203200" cy="177800"/>
-                          </a:xfrm>
-                          <a:prstGeom prst="rect">
-                            <a:avLst/>
-                          </a:prstGeom>
-                        </pic:spPr>
-                      </pic:pic>
-                    </a:graphicData>
-                  </a:graphic>
-                </wp:inline>
-              </w:drawing>
-            </w:r>
-            <w:r>
-              <w:rPr>
-                <w:sz w:val="20"/>
-              </w:rPr>
-              <w:t xml:space="preserve">  </w:t>
-            </w:r>
-            <w:r>
-              <w:rPr>
-                <w:sz w:val="20"/>
-              </w:rPr>
-              <w:t>quantity</w:t>
-            </w:r>
-          </w:p>
-        </w:tc>
-      </w:tr>
-      <w:tr>
-        <w:tc>
-          <w:tcPr>
-            <w:shd w:color="auto" w:val="clear" w:fill="fde6c3"/>
-          </w:tcPr>
-          <w:p>
-            <w:pPr>
-              <w:spacing w:before="0" w:after="0"/>
-            </w:pPr>
-            <w:r>
-              <w:t/>
-              <w:drawing>
-                <wp:inline distT="0" distR="0" distB="0" distL="0">
-                  <wp:extent cx="203200" cy="190500"/>
-                  <wp:docPr id="53" name="Drawing 53" descr="file:/C:/Users/VINCEN~1/AppData/Local/Temp/ViewElement__48qLOxVIEeetFdz5pzgWAw11917806268529556800.png"/>
-                  <a:graphic xmlns:a="http://schemas.openxmlformats.org/drawingml/2006/main">
-                    <a:graphicData uri="http://schemas.openxmlformats.org/drawingml/2006/picture">
-                      <pic:pic xmlns:pic="http://schemas.openxmlformats.org/drawingml/2006/picture">
-                        <pic:nvPicPr>
-                          <pic:cNvPr id="0" name="Picture 53" descr="file:/C:/Users/VINCEN~1/AppData/Local/Temp/ViewElement__48qLOxVIEeetFdz5pzgWAw11917806268529556800.png"/>
-                          <pic:cNvPicPr>
-                            <a:picLocks noChangeAspect="true"/>
-                          </pic:cNvPicPr>
-                        </pic:nvPicPr>
-                        <pic:blipFill>
-                          <a:blip r:embed="rId24"/>
-                          <a:stretch>
-                            <a:fillRect/>
-                          </a:stretch>
-                        </pic:blipFill>
-                        <pic:spPr>
-                          <a:xfrm>
-                            <a:off x="0" y="0"/>
-                            <a:ext cx="203200" cy="190500"/>
-                          </a:xfrm>
-                          <a:prstGeom prst="rect">
-                            <a:avLst/>
-                          </a:prstGeom>
-                        </pic:spPr>
-                      </pic:pic>
-                    </a:graphicData>
-                  </a:graphic>
-                </wp:inline>
-              </w:drawing>
-            </w:r>
-            <w:r>
-              <w:rPr>
-                <w:sz w:val="20"/>
-              </w:rPr>
-              <w:t xml:space="preserve">  </w:t>
-            </w:r>
-            <w:r>
-              <w:rPr>
-                <w:sz w:val="20"/>
-              </w:rPr>
               <w:t>removeFromCart</w:t>
             </w:r>
           </w:p>
@@ -24800,12 +24725,12 @@
               <w:drawing>
                 <wp:inline distT="0" distR="0" distB="0" distL="0">
                   <wp:extent cx="203200" cy="203200"/>
-                  <wp:docPr id="54" name="Drawing 54" descr="file:/C:/Users/VINCEN~1/AppData/Local/Temp/ViewContainer__48qLRRVIEeetFdz5pzgWAw4389441732894456208.png"/>
+                  <wp:docPr id="55" name="Drawing 55" descr="file:/tmp/ViewContainer__48qLRRVIEeetFdz5pzgWAw5609500659465200396.png"/>
                   <a:graphic xmlns:a="http://schemas.openxmlformats.org/drawingml/2006/main">
                     <a:graphicData uri="http://schemas.openxmlformats.org/drawingml/2006/picture">
                       <pic:pic xmlns:pic="http://schemas.openxmlformats.org/drawingml/2006/picture">
                         <pic:nvPicPr>
-                          <pic:cNvPr id="0" name="Picture 54" descr="file:/C:/Users/VINCEN~1/AppData/Local/Temp/ViewContainer__48qLRRVIEeetFdz5pzgWAw4389441732894456208.png"/>
+                          <pic:cNvPr id="0" name="Picture 55" descr="file:/tmp/ViewContainer__48qLRRVIEeetFdz5pzgWAw5609500659465200396.png"/>
                           <pic:cNvPicPr>
                             <a:picLocks noChangeAspect="true"/>
                           </pic:cNvPicPr>
@@ -24860,18 +24785,18 @@
               <w:drawing>
                 <wp:inline distT="0" distR="0" distB="0" distL="0">
                   <wp:extent cx="203200" cy="177800"/>
-                  <wp:docPr id="55" name="Drawing 55" descr="file:/C:/Users/VINCEN~1/AppData/Local/Temp/ViewElement__48qLRxVIEeetFdz5pzgWAw6314633790028009016.png"/>
+                  <wp:docPr id="56" name="Drawing 56" descr="file:/tmp/ViewElement__48qLRxVIEeetFdz5pzgWAw4939686700404657910.png"/>
                   <a:graphic xmlns:a="http://schemas.openxmlformats.org/drawingml/2006/main">
                     <a:graphicData uri="http://schemas.openxmlformats.org/drawingml/2006/picture">
                       <pic:pic xmlns:pic="http://schemas.openxmlformats.org/drawingml/2006/picture">
                         <pic:nvPicPr>
-                          <pic:cNvPr id="0" name="Picture 55" descr="file:/C:/Users/VINCEN~1/AppData/Local/Temp/ViewElement__48qLRxVIEeetFdz5pzgWAw6314633790028009016.png"/>
+                          <pic:cNvPr id="0" name="Picture 56" descr="file:/tmp/ViewElement__48qLRxVIEeetFdz5pzgWAw4939686700404657910.png"/>
                           <pic:cNvPicPr>
                             <a:picLocks noChangeAspect="true"/>
                           </pic:cNvPicPr>
                         </pic:nvPicPr>
                         <pic:blipFill>
-                          <a:blip r:embed="rId22"/>
+                          <a:blip r:embed="rId24"/>
                           <a:stretch>
                             <a:fillRect/>
                           </a:stretch>
@@ -24920,18 +24845,18 @@
               <w:drawing>
                 <wp:inline distT="0" distR="0" distB="0" distL="0">
                   <wp:extent cx="203200" cy="203200"/>
-                  <wp:docPr id="56" name="Drawing 56" descr="file:/C:/Users/VINCEN~1/AppData/Local/Temp/ViewElement__48qyMBVIEeetFdz5pzgWAw2457921516559108714.png"/>
+                  <wp:docPr id="57" name="Drawing 57" descr="file:/tmp/ViewElement__48qyMBVIEeetFdz5pzgWAw7163269211901735468.png"/>
                   <a:graphic xmlns:a="http://schemas.openxmlformats.org/drawingml/2006/main">
                     <a:graphicData uri="http://schemas.openxmlformats.org/drawingml/2006/picture">
                       <pic:pic xmlns:pic="http://schemas.openxmlformats.org/drawingml/2006/picture">
                         <pic:nvPicPr>
-                          <pic:cNvPr id="0" name="Picture 56" descr="file:/C:/Users/VINCEN~1/AppData/Local/Temp/ViewElement__48qyMBVIEeetFdz5pzgWAw2457921516559108714.png"/>
+                          <pic:cNvPr id="0" name="Picture 57" descr="file:/tmp/ViewElement__48qyMBVIEeetFdz5pzgWAw7163269211901735468.png"/>
                           <pic:cNvPicPr>
                             <a:picLocks noChangeAspect="true"/>
                           </pic:cNvPicPr>
                         </pic:nvPicPr>
                         <pic:blipFill>
-                          <a:blip r:embed="rId23"/>
+                          <a:blip r:embed="rId25"/>
                           <a:stretch>
                             <a:fillRect/>
                           </a:stretch>
@@ -24980,18 +24905,18 @@
               <w:drawing>
                 <wp:inline distT="0" distR="0" distB="0" distL="0">
                   <wp:extent cx="203200" cy="177800"/>
-                  <wp:docPr id="57" name="Drawing 57" descr="file:/C:/Users/VINCEN~1/AppData/Local/Temp/ViewElement__48qyMhVIEeetFdz5pzgWAw8110973684744018706.png"/>
+                  <wp:docPr id="58" name="Drawing 58" descr="file:/tmp/ViewElement__48qyMhVIEeetFdz5pzgWAw8232227678203019537.png"/>
                   <a:graphic xmlns:a="http://schemas.openxmlformats.org/drawingml/2006/main">
                     <a:graphicData uri="http://schemas.openxmlformats.org/drawingml/2006/picture">
                       <pic:pic xmlns:pic="http://schemas.openxmlformats.org/drawingml/2006/picture">
                         <pic:nvPicPr>
-                          <pic:cNvPr id="0" name="Picture 57" descr="file:/C:/Users/VINCEN~1/AppData/Local/Temp/ViewElement__48qyMhVIEeetFdz5pzgWAw8110973684744018706.png"/>
+                          <pic:cNvPr id="0" name="Picture 58" descr="file:/tmp/ViewElement__48qyMhVIEeetFdz5pzgWAw8232227678203019537.png"/>
                           <pic:cNvPicPr>
                             <a:picLocks noChangeAspect="true"/>
                           </pic:cNvPicPr>
                         </pic:nvPicPr>
                         <pic:blipFill>
-                          <a:blip r:embed="rId22"/>
+                          <a:blip r:embed="rId24"/>
                           <a:stretch>
                             <a:fillRect/>
                           </a:stretch>
@@ -25040,18 +24965,18 @@
               <w:drawing>
                 <wp:inline distT="0" distR="0" distB="0" distL="0">
                   <wp:extent cx="203200" cy="190500"/>
-                  <wp:docPr id="58" name="Drawing 58" descr="file:/C:/Users/VINCEN~1/AppData/Local/Temp/ViewElement__48qyNBVIEeetFdz5pzgWAw17102601035481382516.png"/>
+                  <wp:docPr id="59" name="Drawing 59" descr="file:/tmp/ViewElement__48qyNBVIEeetFdz5pzgWAw15146895729404637779.png"/>
                   <a:graphic xmlns:a="http://schemas.openxmlformats.org/drawingml/2006/main">
                     <a:graphicData uri="http://schemas.openxmlformats.org/drawingml/2006/picture">
                       <pic:pic xmlns:pic="http://schemas.openxmlformats.org/drawingml/2006/picture">
                         <pic:nvPicPr>
-                          <pic:cNvPr id="0" name="Picture 58" descr="file:/C:/Users/VINCEN~1/AppData/Local/Temp/ViewElement__48qyNBVIEeetFdz5pzgWAw17102601035481382516.png"/>
+                          <pic:cNvPr id="0" name="Picture 59" descr="file:/tmp/ViewElement__48qyNBVIEeetFdz5pzgWAw15146895729404637779.png"/>
                           <pic:cNvPicPr>
                             <a:picLocks noChangeAspect="true"/>
                           </pic:cNvPicPr>
                         </pic:nvPicPr>
                         <pic:blipFill>
-                          <a:blip r:embed="rId24"/>
+                          <a:blip r:embed="rId26"/>
                           <a:stretch>
                             <a:fillRect/>
                           </a:stretch>
@@ -25100,18 +25025,18 @@
               <w:drawing>
                 <wp:inline distT="0" distR="0" distB="0" distL="0">
                   <wp:extent cx="203200" cy="190500"/>
-                  <wp:docPr id="59" name="Drawing 59" descr="file:/C:/Users/VINCEN~1/AppData/Local/Temp/ViewElement__48qyOBVIEeetFdz5pzgWAw17654087759769090030.png"/>
+                  <wp:docPr id="60" name="Drawing 60" descr="file:/tmp/ViewElement__48qyOBVIEeetFdz5pzgWAw5389464366977781354.png"/>
                   <a:graphic xmlns:a="http://schemas.openxmlformats.org/drawingml/2006/main">
                     <a:graphicData uri="http://schemas.openxmlformats.org/drawingml/2006/picture">
                       <pic:pic xmlns:pic="http://schemas.openxmlformats.org/drawingml/2006/picture">
                         <pic:nvPicPr>
-                          <pic:cNvPr id="0" name="Picture 59" descr="file:/C:/Users/VINCEN~1/AppData/Local/Temp/ViewElement__48qyOBVIEeetFdz5pzgWAw17654087759769090030.png"/>
+                          <pic:cNvPr id="0" name="Picture 60" descr="file:/tmp/ViewElement__48qyOBVIEeetFdz5pzgWAw5389464366977781354.png"/>
                           <pic:cNvPicPr>
                             <a:picLocks noChangeAspect="true"/>
                           </pic:cNvPicPr>
                         </pic:nvPicPr>
                         <pic:blipFill>
-                          <a:blip r:embed="rId24"/>
+                          <a:blip r:embed="rId26"/>
                           <a:stretch>
                             <a:fillRect/>
                           </a:stretch>
@@ -25207,12 +25132,12 @@
               <w:drawing>
                 <wp:inline distT="0" distR="0" distB="0" distL="0">
                   <wp:extent cx="203200" cy="203200"/>
-                  <wp:docPr id="60" name="Drawing 60" descr="file:/C:/Users/VINCEN~1/AppData/Local/Temp/ViewContainer__48vDrhVIEeetFdz5pzgWAw14848796831342501332.png"/>
+                  <wp:docPr id="61" name="Drawing 61" descr="file:/tmp/ViewContainer__48vDrhVIEeetFdz5pzgWAw17683175812735203450.png"/>
                   <a:graphic xmlns:a="http://schemas.openxmlformats.org/drawingml/2006/main">
                     <a:graphicData uri="http://schemas.openxmlformats.org/drawingml/2006/picture">
                       <pic:pic xmlns:pic="http://schemas.openxmlformats.org/drawingml/2006/picture">
                         <pic:nvPicPr>
-                          <pic:cNvPr id="0" name="Picture 60" descr="file:/C:/Users/VINCEN~1/AppData/Local/Temp/ViewContainer__48vDrhVIEeetFdz5pzgWAw14848796831342501332.png"/>
+                          <pic:cNvPr id="0" name="Picture 61" descr="file:/tmp/ViewContainer__48vDrhVIEeetFdz5pzgWAw17683175812735203450.png"/>
                           <pic:cNvPicPr>
                             <a:picLocks noChangeAspect="true"/>
                           </pic:cNvPicPr>
@@ -25267,18 +25192,18 @@
               <w:drawing>
                 <wp:inline distT="0" distR="0" distB="0" distL="0">
                   <wp:extent cx="203200" cy="177800"/>
-                  <wp:docPr id="61" name="Drawing 61" descr="file:/C:/Users/VINCEN~1/AppData/Local/Temp/ViewElement__48vDsBVIEeetFdz5pzgWAw16937344584181898988.png"/>
+                  <wp:docPr id="62" name="Drawing 62" descr="file:/tmp/ViewElement__48vDsBVIEeetFdz5pzgWAw9972735714637813655.png"/>
                   <a:graphic xmlns:a="http://schemas.openxmlformats.org/drawingml/2006/main">
                     <a:graphicData uri="http://schemas.openxmlformats.org/drawingml/2006/picture">
                       <pic:pic xmlns:pic="http://schemas.openxmlformats.org/drawingml/2006/picture">
                         <pic:nvPicPr>
-                          <pic:cNvPr id="0" name="Picture 61" descr="file:/C:/Users/VINCEN~1/AppData/Local/Temp/ViewElement__48vDsBVIEeetFdz5pzgWAw16937344584181898988.png"/>
+                          <pic:cNvPr id="0" name="Picture 62" descr="file:/tmp/ViewElement__48vDsBVIEeetFdz5pzgWAw9972735714637813655.png"/>
                           <pic:cNvPicPr>
                             <a:picLocks noChangeAspect="true"/>
                           </pic:cNvPicPr>
                         </pic:nvPicPr>
                         <pic:blipFill>
-                          <a:blip r:embed="rId22"/>
+                          <a:blip r:embed="rId24"/>
                           <a:stretch>
                             <a:fillRect/>
                           </a:stretch>
@@ -25327,18 +25252,18 @@
               <w:drawing>
                 <wp:inline distT="0" distR="0" distB="0" distL="0">
                   <wp:extent cx="203200" cy="203200"/>
-                  <wp:docPr id="62" name="Drawing 62" descr="file:/C:/Users/VINCEN~1/AppData/Local/Temp/ViewElement__48vDshVIEeetFdz5pzgWAw18306971662497791147.png"/>
+                  <wp:docPr id="63" name="Drawing 63" descr="file:/tmp/ViewElement__48vDshVIEeetFdz5pzgWAw9525264284419161381.png"/>
                   <a:graphic xmlns:a="http://schemas.openxmlformats.org/drawingml/2006/main">
                     <a:graphicData uri="http://schemas.openxmlformats.org/drawingml/2006/picture">
                       <pic:pic xmlns:pic="http://schemas.openxmlformats.org/drawingml/2006/picture">
                         <pic:nvPicPr>
-                          <pic:cNvPr id="0" name="Picture 62" descr="file:/C:/Users/VINCEN~1/AppData/Local/Temp/ViewElement__48vDshVIEeetFdz5pzgWAw18306971662497791147.png"/>
+                          <pic:cNvPr id="0" name="Picture 63" descr="file:/tmp/ViewElement__48vDshVIEeetFdz5pzgWAw9525264284419161381.png"/>
                           <pic:cNvPicPr>
                             <a:picLocks noChangeAspect="true"/>
                           </pic:cNvPicPr>
                         </pic:nvPicPr>
                         <pic:blipFill>
-                          <a:blip r:embed="rId23"/>
+                          <a:blip r:embed="rId25"/>
                           <a:stretch>
                             <a:fillRect/>
                           </a:stretch>
@@ -25387,18 +25312,18 @@
               <w:drawing>
                 <wp:inline distT="0" distR="0" distB="0" distL="0">
                   <wp:extent cx="203200" cy="190500"/>
-                  <wp:docPr id="63" name="Drawing 63" descr="file:/C:/Users/VINCEN~1/AppData/Local/Temp/ViewElement__48vDtBVIEeetFdz5pzgWAw11373381852569173287.png"/>
+                  <wp:docPr id="64" name="Drawing 64" descr="file:/tmp/ViewElement__48vDtBVIEeetFdz5pzgWAw11620670644241241539.png"/>
                   <a:graphic xmlns:a="http://schemas.openxmlformats.org/drawingml/2006/main">
                     <a:graphicData uri="http://schemas.openxmlformats.org/drawingml/2006/picture">
                       <pic:pic xmlns:pic="http://schemas.openxmlformats.org/drawingml/2006/picture">
                         <pic:nvPicPr>
-                          <pic:cNvPr id="0" name="Picture 63" descr="file:/C:/Users/VINCEN~1/AppData/Local/Temp/ViewElement__48vDtBVIEeetFdz5pzgWAw11373381852569173287.png"/>
+                          <pic:cNvPr id="0" name="Picture 64" descr="file:/tmp/ViewElement__48vDtBVIEeetFdz5pzgWAw11620670644241241539.png"/>
                           <pic:cNvPicPr>
                             <a:picLocks noChangeAspect="true"/>
                           </pic:cNvPicPr>
                         </pic:nvPicPr>
                         <pic:blipFill>
-                          <a:blip r:embed="rId24"/>
+                          <a:blip r:embed="rId26"/>
                           <a:stretch>
                             <a:fillRect/>
                           </a:stretch>
@@ -25447,18 +25372,18 @@
               <w:drawing>
                 <wp:inline distT="0" distR="0" distB="0" distL="0">
                   <wp:extent cx="203200" cy="190500"/>
-                  <wp:docPr id="64" name="Drawing 64" descr="file:/C:/Users/VINCEN~1/AppData/Local/Temp/ViewElement__48vDuBVIEeetFdz5pzgWAw4684201820897814760.png"/>
+                  <wp:docPr id="65" name="Drawing 65" descr="file:/tmp/ViewElement__48vDuBVIEeetFdz5pzgWAw5517032725234521913.png"/>
                   <a:graphic xmlns:a="http://schemas.openxmlformats.org/drawingml/2006/main">
                     <a:graphicData uri="http://schemas.openxmlformats.org/drawingml/2006/picture">
                       <pic:pic xmlns:pic="http://schemas.openxmlformats.org/drawingml/2006/picture">
                         <pic:nvPicPr>
-                          <pic:cNvPr id="0" name="Picture 64" descr="file:/C:/Users/VINCEN~1/AppData/Local/Temp/ViewElement__48vDuBVIEeetFdz5pzgWAw4684201820897814760.png"/>
+                          <pic:cNvPr id="0" name="Picture 65" descr="file:/tmp/ViewElement__48vDuBVIEeetFdz5pzgWAw5517032725234521913.png"/>
                           <pic:cNvPicPr>
                             <a:picLocks noChangeAspect="true"/>
                           </pic:cNvPicPr>
                         </pic:nvPicPr>
                         <pic:blipFill>
-                          <a:blip r:embed="rId24"/>
+                          <a:blip r:embed="rId26"/>
                           <a:stretch>
                             <a:fillRect/>
                           </a:stretch>
@@ -25507,18 +25432,18 @@
               <w:drawing>
                 <wp:inline distT="0" distR="0" distB="0" distL="0">
                   <wp:extent cx="203200" cy="177800"/>
-                  <wp:docPr id="65" name="Drawing 65" descr="file:/C:/Users/VINCEN~1/AppData/Local/Temp/ViewElement__48vDvBVIEeetFdz5pzgWAw7426642034490457637.png"/>
+                  <wp:docPr id="66" name="Drawing 66" descr="file:/tmp/ViewElement__48vDvBVIEeetFdz5pzgWAw12221278636999564968.png"/>
                   <a:graphic xmlns:a="http://schemas.openxmlformats.org/drawingml/2006/main">
                     <a:graphicData uri="http://schemas.openxmlformats.org/drawingml/2006/picture">
                       <pic:pic xmlns:pic="http://schemas.openxmlformats.org/drawingml/2006/picture">
                         <pic:nvPicPr>
-                          <pic:cNvPr id="0" name="Picture 65" descr="file:/C:/Users/VINCEN~1/AppData/Local/Temp/ViewElement__48vDvBVIEeetFdz5pzgWAw7426642034490457637.png"/>
+                          <pic:cNvPr id="0" name="Picture 66" descr="file:/tmp/ViewElement__48vDvBVIEeetFdz5pzgWAw12221278636999564968.png"/>
                           <pic:cNvPicPr>
                             <a:picLocks noChangeAspect="true"/>
                           </pic:cNvPicPr>
                         </pic:nvPicPr>
                         <pic:blipFill>
-                          <a:blip r:embed="rId21"/>
+                          <a:blip r:embed="rId23"/>
                           <a:stretch>
                             <a:fillRect/>
                           </a:stretch>
@@ -25614,12 +25539,12 @@
               <w:drawing>
                 <wp:inline distT="0" distR="0" distB="0" distL="0">
                   <wp:extent cx="203200" cy="203200"/>
-                  <wp:docPr id="66" name="Drawing 66" descr="file:/C:/Users/VINCEN~1/AppData/Local/Temp/ViewContainer__48vDwBVIEeetFdz5pzgWAw5217405893228124261.png"/>
+                  <wp:docPr id="67" name="Drawing 67" descr="file:/tmp/ViewContainer__48vDwBVIEeetFdz5pzgWAw6692370827179843188.png"/>
                   <a:graphic xmlns:a="http://schemas.openxmlformats.org/drawingml/2006/main">
                     <a:graphicData uri="http://schemas.openxmlformats.org/drawingml/2006/picture">
                       <pic:pic xmlns:pic="http://schemas.openxmlformats.org/drawingml/2006/picture">
                         <pic:nvPicPr>
-                          <pic:cNvPr id="0" name="Picture 66" descr="file:/C:/Users/VINCEN~1/AppData/Local/Temp/ViewContainer__48vDwBVIEeetFdz5pzgWAw5217405893228124261.png"/>
+                          <pic:cNvPr id="0" name="Picture 67" descr="file:/tmp/ViewContainer__48vDwBVIEeetFdz5pzgWAw6692370827179843188.png"/>
                           <pic:cNvPicPr>
                             <a:picLocks noChangeAspect="true"/>
                           </pic:cNvPicPr>
@@ -25674,18 +25599,18 @@
               <w:drawing>
                 <wp:inline distT="0" distR="0" distB="0" distL="0">
                   <wp:extent cx="203200" cy="177800"/>
-                  <wp:docPr id="67" name="Drawing 67" descr="file:/C:/Users/VINCEN~1/AppData/Local/Temp/ViewElement__48vDwhVIEeetFdz5pzgWAw869336584589428716.png"/>
+                  <wp:docPr id="68" name="Drawing 68" descr="file:/tmp/ViewElement__48vDwhVIEeetFdz5pzgWAw1619031671787570619.png"/>
                   <a:graphic xmlns:a="http://schemas.openxmlformats.org/drawingml/2006/main">
                     <a:graphicData uri="http://schemas.openxmlformats.org/drawingml/2006/picture">
                       <pic:pic xmlns:pic="http://schemas.openxmlformats.org/drawingml/2006/picture">
                         <pic:nvPicPr>
-                          <pic:cNvPr id="0" name="Picture 67" descr="file:/C:/Users/VINCEN~1/AppData/Local/Temp/ViewElement__48vDwhVIEeetFdz5pzgWAw869336584589428716.png"/>
+                          <pic:cNvPr id="0" name="Picture 68" descr="file:/tmp/ViewElement__48vDwhVIEeetFdz5pzgWAw1619031671787570619.png"/>
                           <pic:cNvPicPr>
                             <a:picLocks noChangeAspect="true"/>
                           </pic:cNvPicPr>
                         </pic:nvPicPr>
                         <pic:blipFill>
-                          <a:blip r:embed="rId22"/>
+                          <a:blip r:embed="rId24"/>
                           <a:stretch>
                             <a:fillRect/>
                           </a:stretch>
@@ -25734,18 +25659,18 @@
               <w:drawing>
                 <wp:inline distT="0" distR="0" distB="0" distL="0">
                   <wp:extent cx="203200" cy="177800"/>
-                  <wp:docPr id="68" name="Drawing 68" descr="file:/C:/Users/VINCEN~1/AppData/Local/Temp/ViewElement__48vDxBVIEeetFdz5pzgWAw10780445633235596578.png"/>
+                  <wp:docPr id="69" name="Drawing 69" descr="file:/tmp/ViewElement__48vDxBVIEeetFdz5pzgWAw2451894357258490171.png"/>
                   <a:graphic xmlns:a="http://schemas.openxmlformats.org/drawingml/2006/main">
                     <a:graphicData uri="http://schemas.openxmlformats.org/drawingml/2006/picture">
                       <pic:pic xmlns:pic="http://schemas.openxmlformats.org/drawingml/2006/picture">
                         <pic:nvPicPr>
-                          <pic:cNvPr id="0" name="Picture 68" descr="file:/C:/Users/VINCEN~1/AppData/Local/Temp/ViewElement__48vDxBVIEeetFdz5pzgWAw10780445633235596578.png"/>
+                          <pic:cNvPr id="0" name="Picture 69" descr="file:/tmp/ViewElement__48vDxBVIEeetFdz5pzgWAw2451894357258490171.png"/>
                           <pic:cNvPicPr>
                             <a:picLocks noChangeAspect="true"/>
                           </pic:cNvPicPr>
                         </pic:nvPicPr>
                         <pic:blipFill>
-                          <a:blip r:embed="rId22"/>
+                          <a:blip r:embed="rId24"/>
                           <a:stretch>
                             <a:fillRect/>
                           </a:stretch>
@@ -25794,18 +25719,18 @@
               <w:drawing>
                 <wp:inline distT="0" distR="0" distB="0" distL="0">
                   <wp:extent cx="203200" cy="177800"/>
-                  <wp:docPr id="69" name="Drawing 69" descr="file:/C:/Users/VINCEN~1/AppData/Local/Temp/ViewElement__48vDxhVIEeetFdz5pzgWAw18329141328906797433.png"/>
+                  <wp:docPr id="70" name="Drawing 70" descr="file:/tmp/ViewElement__48vDxhVIEeetFdz5pzgWAw3053166383561164226.png"/>
                   <a:graphic xmlns:a="http://schemas.openxmlformats.org/drawingml/2006/main">
                     <a:graphicData uri="http://schemas.openxmlformats.org/drawingml/2006/picture">
                       <pic:pic xmlns:pic="http://schemas.openxmlformats.org/drawingml/2006/picture">
                         <pic:nvPicPr>
-                          <pic:cNvPr id="0" name="Picture 69" descr="file:/C:/Users/VINCEN~1/AppData/Local/Temp/ViewElement__48vDxhVIEeetFdz5pzgWAw18329141328906797433.png"/>
+                          <pic:cNvPr id="0" name="Picture 70" descr="file:/tmp/ViewElement__48vDxhVIEeetFdz5pzgWAw3053166383561164226.png"/>
                           <pic:cNvPicPr>
                             <a:picLocks noChangeAspect="true"/>
                           </pic:cNvPicPr>
                         </pic:nvPicPr>
                         <pic:blipFill>
-                          <a:blip r:embed="rId22"/>
+                          <a:blip r:embed="rId24"/>
                           <a:stretch>
                             <a:fillRect/>
                           </a:stretch>
@@ -25854,18 +25779,18 @@
               <w:drawing>
                 <wp:inline distT="0" distR="0" distB="0" distL="0">
                   <wp:extent cx="203200" cy="190500"/>
-                  <wp:docPr id="70" name="Drawing 70" descr="file:/C:/Users/VINCEN~1/AppData/Local/Temp/ViewElement__48vDyBVIEeetFdz5pzgWAw3582901325881555998.png"/>
+                  <wp:docPr id="71" name="Drawing 71" descr="file:/tmp/ViewElement__48vDyBVIEeetFdz5pzgWAw1322419776846618431.png"/>
                   <a:graphic xmlns:a="http://schemas.openxmlformats.org/drawingml/2006/main">
                     <a:graphicData uri="http://schemas.openxmlformats.org/drawingml/2006/picture">
                       <pic:pic xmlns:pic="http://schemas.openxmlformats.org/drawingml/2006/picture">
                         <pic:nvPicPr>
-                          <pic:cNvPr id="0" name="Picture 70" descr="file:/C:/Users/VINCEN~1/AppData/Local/Temp/ViewElement__48vDyBVIEeetFdz5pzgWAw3582901325881555998.png"/>
+                          <pic:cNvPr id="0" name="Picture 71" descr="file:/tmp/ViewElement__48vDyBVIEeetFdz5pzgWAw1322419776846618431.png"/>
                           <pic:cNvPicPr>
                             <a:picLocks noChangeAspect="true"/>
                           </pic:cNvPicPr>
                         </pic:nvPicPr>
                         <pic:blipFill>
-                          <a:blip r:embed="rId24"/>
+                          <a:blip r:embed="rId26"/>
                           <a:stretch>
                             <a:fillRect/>
                           </a:stretch>
@@ -25914,18 +25839,18 @@
               <w:drawing>
                 <wp:inline distT="0" distR="0" distB="0" distL="0">
                   <wp:extent cx="203200" cy="190500"/>
-                  <wp:docPr id="71" name="Drawing 71" descr="file:/C:/Users/VINCEN~1/AppData/Local/Temp/ViewElement__48vDzBVIEeetFdz5pzgWAw9230970162749969691.png"/>
+                  <wp:docPr id="72" name="Drawing 72" descr="file:/tmp/ViewElement__48vDzBVIEeetFdz5pzgWAw154242135002376637.png"/>
                   <a:graphic xmlns:a="http://schemas.openxmlformats.org/drawingml/2006/main">
                     <a:graphicData uri="http://schemas.openxmlformats.org/drawingml/2006/picture">
                       <pic:pic xmlns:pic="http://schemas.openxmlformats.org/drawingml/2006/picture">
                         <pic:nvPicPr>
-                          <pic:cNvPr id="0" name="Picture 71" descr="file:/C:/Users/VINCEN~1/AppData/Local/Temp/ViewElement__48vDzBVIEeetFdz5pzgWAw9230970162749969691.png"/>
+                          <pic:cNvPr id="0" name="Picture 72" descr="file:/tmp/ViewElement__48vDzBVIEeetFdz5pzgWAw154242135002376637.png"/>
                           <pic:cNvPicPr>
                             <a:picLocks noChangeAspect="true"/>
                           </pic:cNvPicPr>
                         </pic:nvPicPr>
                         <pic:blipFill>
-                          <a:blip r:embed="rId24"/>
+                          <a:blip r:embed="rId26"/>
                           <a:stretch>
                             <a:fillRect/>
                           </a:stretch>
@@ -26021,12 +25946,12 @@
               <w:drawing>
                 <wp:inline distT="0" distR="0" distB="0" distL="0">
                   <wp:extent cx="203200" cy="203200"/>
-                  <wp:docPr id="72" name="Drawing 72" descr="file:/C:/Users/VINCEN~1/AppData/Local/Temp/ViewContainer__48vDrhVIEeetFdz5pzgWAw7903151375329233387.png"/>
+                  <wp:docPr id="73" name="Drawing 73" descr="file:/tmp/ViewContainer__48vDrhVIEeetFdz5pzgWAw4656430655936428834.png"/>
                   <a:graphic xmlns:a="http://schemas.openxmlformats.org/drawingml/2006/main">
                     <a:graphicData uri="http://schemas.openxmlformats.org/drawingml/2006/picture">
                       <pic:pic xmlns:pic="http://schemas.openxmlformats.org/drawingml/2006/picture">
                         <pic:nvPicPr>
-                          <pic:cNvPr id="0" name="Picture 72" descr="file:/C:/Users/VINCEN~1/AppData/Local/Temp/ViewContainer__48vDrhVIEeetFdz5pzgWAw7903151375329233387.png"/>
+                          <pic:cNvPr id="0" name="Picture 73" descr="file:/tmp/ViewContainer__48vDrhVIEeetFdz5pzgWAw4656430655936428834.png"/>
                           <pic:cNvPicPr>
                             <a:picLocks noChangeAspect="true"/>
                           </pic:cNvPicPr>
@@ -26081,18 +26006,18 @@
               <w:drawing>
                 <wp:inline distT="0" distR="0" distB="0" distL="0">
                   <wp:extent cx="203200" cy="177800"/>
-                  <wp:docPr id="73" name="Drawing 73" descr="file:/C:/Users/VINCEN~1/AppData/Local/Temp/ViewElement__48vDsBVIEeetFdz5pzgWAw153301300667381483.png"/>
+                  <wp:docPr id="74" name="Drawing 74" descr="file:/tmp/ViewElement__48vDsBVIEeetFdz5pzgWAw15806978803302864098.png"/>
                   <a:graphic xmlns:a="http://schemas.openxmlformats.org/drawingml/2006/main">
                     <a:graphicData uri="http://schemas.openxmlformats.org/drawingml/2006/picture">
                       <pic:pic xmlns:pic="http://schemas.openxmlformats.org/drawingml/2006/picture">
                         <pic:nvPicPr>
-                          <pic:cNvPr id="0" name="Picture 73" descr="file:/C:/Users/VINCEN~1/AppData/Local/Temp/ViewElement__48vDsBVIEeetFdz5pzgWAw153301300667381483.png"/>
+                          <pic:cNvPr id="0" name="Picture 74" descr="file:/tmp/ViewElement__48vDsBVIEeetFdz5pzgWAw15806978803302864098.png"/>
                           <pic:cNvPicPr>
                             <a:picLocks noChangeAspect="true"/>
                           </pic:cNvPicPr>
                         </pic:nvPicPr>
                         <pic:blipFill>
-                          <a:blip r:embed="rId22"/>
+                          <a:blip r:embed="rId24"/>
                           <a:stretch>
                             <a:fillRect/>
                           </a:stretch>
@@ -26141,18 +26066,18 @@
               <w:drawing>
                 <wp:inline distT="0" distR="0" distB="0" distL="0">
                   <wp:extent cx="203200" cy="203200"/>
-                  <wp:docPr id="74" name="Drawing 74" descr="file:/C:/Users/VINCEN~1/AppData/Local/Temp/ViewElement__48vDshVIEeetFdz5pzgWAw17202586680586428827.png"/>
+                  <wp:docPr id="75" name="Drawing 75" descr="file:/tmp/ViewElement__48vDshVIEeetFdz5pzgWAw8568800544294448876.png"/>
                   <a:graphic xmlns:a="http://schemas.openxmlformats.org/drawingml/2006/main">
                     <a:graphicData uri="http://schemas.openxmlformats.org/drawingml/2006/picture">
                       <pic:pic xmlns:pic="http://schemas.openxmlformats.org/drawingml/2006/picture">
                         <pic:nvPicPr>
-                          <pic:cNvPr id="0" name="Picture 74" descr="file:/C:/Users/VINCEN~1/AppData/Local/Temp/ViewElement__48vDshVIEeetFdz5pzgWAw17202586680586428827.png"/>
+                          <pic:cNvPr id="0" name="Picture 75" descr="file:/tmp/ViewElement__48vDshVIEeetFdz5pzgWAw8568800544294448876.png"/>
                           <pic:cNvPicPr>
                             <a:picLocks noChangeAspect="true"/>
                           </pic:cNvPicPr>
                         </pic:nvPicPr>
                         <pic:blipFill>
-                          <a:blip r:embed="rId23"/>
+                          <a:blip r:embed="rId25"/>
                           <a:stretch>
                             <a:fillRect/>
                           </a:stretch>
@@ -26201,18 +26126,18 @@
               <w:drawing>
                 <wp:inline distT="0" distR="0" distB="0" distL="0">
                   <wp:extent cx="203200" cy="190500"/>
-                  <wp:docPr id="75" name="Drawing 75" descr="file:/C:/Users/VINCEN~1/AppData/Local/Temp/ViewElement__48vDtBVIEeetFdz5pzgWAw14962627617760111594.png"/>
+                  <wp:docPr id="76" name="Drawing 76" descr="file:/tmp/ViewElement__48vDtBVIEeetFdz5pzgWAw17481143917103043092.png"/>
                   <a:graphic xmlns:a="http://schemas.openxmlformats.org/drawingml/2006/main">
                     <a:graphicData uri="http://schemas.openxmlformats.org/drawingml/2006/picture">
                       <pic:pic xmlns:pic="http://schemas.openxmlformats.org/drawingml/2006/picture">
                         <pic:nvPicPr>
-                          <pic:cNvPr id="0" name="Picture 75" descr="file:/C:/Users/VINCEN~1/AppData/Local/Temp/ViewElement__48vDtBVIEeetFdz5pzgWAw14962627617760111594.png"/>
+                          <pic:cNvPr id="0" name="Picture 76" descr="file:/tmp/ViewElement__48vDtBVIEeetFdz5pzgWAw17481143917103043092.png"/>
                           <pic:cNvPicPr>
                             <a:picLocks noChangeAspect="true"/>
                           </pic:cNvPicPr>
                         </pic:nvPicPr>
                         <pic:blipFill>
-                          <a:blip r:embed="rId24"/>
+                          <a:blip r:embed="rId26"/>
                           <a:stretch>
                             <a:fillRect/>
                           </a:stretch>
@@ -26261,18 +26186,18 @@
               <w:drawing>
                 <wp:inline distT="0" distR="0" distB="0" distL="0">
                   <wp:extent cx="203200" cy="190500"/>
-                  <wp:docPr id="76" name="Drawing 76" descr="file:/C:/Users/VINCEN~1/AppData/Local/Temp/ViewElement__48vDuBVIEeetFdz5pzgWAw15568201067673610291.png"/>
+                  <wp:docPr id="77" name="Drawing 77" descr="file:/tmp/ViewElement__48vDuBVIEeetFdz5pzgWAw415426640830551128.png"/>
                   <a:graphic xmlns:a="http://schemas.openxmlformats.org/drawingml/2006/main">
                     <a:graphicData uri="http://schemas.openxmlformats.org/drawingml/2006/picture">
                       <pic:pic xmlns:pic="http://schemas.openxmlformats.org/drawingml/2006/picture">
                         <pic:nvPicPr>
-                          <pic:cNvPr id="0" name="Picture 76" descr="file:/C:/Users/VINCEN~1/AppData/Local/Temp/ViewElement__48vDuBVIEeetFdz5pzgWAw15568201067673610291.png"/>
+                          <pic:cNvPr id="0" name="Picture 77" descr="file:/tmp/ViewElement__48vDuBVIEeetFdz5pzgWAw415426640830551128.png"/>
                           <pic:cNvPicPr>
                             <a:picLocks noChangeAspect="true"/>
                           </pic:cNvPicPr>
                         </pic:nvPicPr>
                         <pic:blipFill>
-                          <a:blip r:embed="rId24"/>
+                          <a:blip r:embed="rId26"/>
                           <a:stretch>
                             <a:fillRect/>
                           </a:stretch>
@@ -26321,18 +26246,18 @@
               <w:drawing>
                 <wp:inline distT="0" distR="0" distB="0" distL="0">
                   <wp:extent cx="203200" cy="177800"/>
-                  <wp:docPr id="77" name="Drawing 77" descr="file:/C:/Users/VINCEN~1/AppData/Local/Temp/ViewElement__48vDvBVIEeetFdz5pzgWAw17749212636771518064.png"/>
+                  <wp:docPr id="78" name="Drawing 78" descr="file:/tmp/ViewElement__48vDvBVIEeetFdz5pzgWAw2597862241352539727.png"/>
                   <a:graphic xmlns:a="http://schemas.openxmlformats.org/drawingml/2006/main">
                     <a:graphicData uri="http://schemas.openxmlformats.org/drawingml/2006/picture">
                       <pic:pic xmlns:pic="http://schemas.openxmlformats.org/drawingml/2006/picture">
                         <pic:nvPicPr>
-                          <pic:cNvPr id="0" name="Picture 77" descr="file:/C:/Users/VINCEN~1/AppData/Local/Temp/ViewElement__48vDvBVIEeetFdz5pzgWAw17749212636771518064.png"/>
+                          <pic:cNvPr id="0" name="Picture 78" descr="file:/tmp/ViewElement__48vDvBVIEeetFdz5pzgWAw2597862241352539727.png"/>
                           <pic:cNvPicPr>
                             <a:picLocks noChangeAspect="true"/>
                           </pic:cNvPicPr>
                         </pic:nvPicPr>
                         <pic:blipFill>
-                          <a:blip r:embed="rId21"/>
+                          <a:blip r:embed="rId23"/>
                           <a:stretch>
                             <a:fillRect/>
                           </a:stretch>
@@ -26428,12 +26353,12 @@
               <w:drawing>
                 <wp:inline distT="0" distR="0" distB="0" distL="0">
                   <wp:extent cx="203200" cy="203200"/>
-                  <wp:docPr id="78" name="Drawing 78" descr="file:/C:/Users/VINCEN~1/AppData/Local/Temp/ViewContainer__48vDwBVIEeetFdz5pzgWAw9107867102836308589.png"/>
+                  <wp:docPr id="79" name="Drawing 79" descr="file:/tmp/ViewContainer__48vDwBVIEeetFdz5pzgWAw10703313197312491899.png"/>
                   <a:graphic xmlns:a="http://schemas.openxmlformats.org/drawingml/2006/main">
                     <a:graphicData uri="http://schemas.openxmlformats.org/drawingml/2006/picture">
                       <pic:pic xmlns:pic="http://schemas.openxmlformats.org/drawingml/2006/picture">
                         <pic:nvPicPr>
-                          <pic:cNvPr id="0" name="Picture 78" descr="file:/C:/Users/VINCEN~1/AppData/Local/Temp/ViewContainer__48vDwBVIEeetFdz5pzgWAw9107867102836308589.png"/>
+                          <pic:cNvPr id="0" name="Picture 79" descr="file:/tmp/ViewContainer__48vDwBVIEeetFdz5pzgWAw10703313197312491899.png"/>
                           <pic:cNvPicPr>
                             <a:picLocks noChangeAspect="true"/>
                           </pic:cNvPicPr>
@@ -26488,18 +26413,18 @@
               <w:drawing>
                 <wp:inline distT="0" distR="0" distB="0" distL="0">
                   <wp:extent cx="203200" cy="177800"/>
-                  <wp:docPr id="79" name="Drawing 79" descr="file:/C:/Users/VINCEN~1/AppData/Local/Temp/ViewElement__48vDwhVIEeetFdz5pzgWAw13057474167532169155.png"/>
+                  <wp:docPr id="80" name="Drawing 80" descr="file:/tmp/ViewElement__48vDwhVIEeetFdz5pzgWAw5767673027084592550.png"/>
                   <a:graphic xmlns:a="http://schemas.openxmlformats.org/drawingml/2006/main">
                     <a:graphicData uri="http://schemas.openxmlformats.org/drawingml/2006/picture">
                       <pic:pic xmlns:pic="http://schemas.openxmlformats.org/drawingml/2006/picture">
                         <pic:nvPicPr>
-                          <pic:cNvPr id="0" name="Picture 79" descr="file:/C:/Users/VINCEN~1/AppData/Local/Temp/ViewElement__48vDwhVIEeetFdz5pzgWAw13057474167532169155.png"/>
+                          <pic:cNvPr id="0" name="Picture 80" descr="file:/tmp/ViewElement__48vDwhVIEeetFdz5pzgWAw5767673027084592550.png"/>
                           <pic:cNvPicPr>
                             <a:picLocks noChangeAspect="true"/>
                           </pic:cNvPicPr>
                         </pic:nvPicPr>
                         <pic:blipFill>
-                          <a:blip r:embed="rId22"/>
+                          <a:blip r:embed="rId24"/>
                           <a:stretch>
                             <a:fillRect/>
                           </a:stretch>
@@ -26548,18 +26473,18 @@
               <w:drawing>
                 <wp:inline distT="0" distR="0" distB="0" distL="0">
                   <wp:extent cx="203200" cy="177800"/>
-                  <wp:docPr id="80" name="Drawing 80" descr="file:/C:/Users/VINCEN~1/AppData/Local/Temp/ViewElement__48vDxBVIEeetFdz5pzgWAw10137066895114004424.png"/>
+                  <wp:docPr id="81" name="Drawing 81" descr="file:/tmp/ViewElement__48vDxBVIEeetFdz5pzgWAw12347469551901079493.png"/>
                   <a:graphic xmlns:a="http://schemas.openxmlformats.org/drawingml/2006/main">
                     <a:graphicData uri="http://schemas.openxmlformats.org/drawingml/2006/picture">
                       <pic:pic xmlns:pic="http://schemas.openxmlformats.org/drawingml/2006/picture">
                         <pic:nvPicPr>
-                          <pic:cNvPr id="0" name="Picture 80" descr="file:/C:/Users/VINCEN~1/AppData/Local/Temp/ViewElement__48vDxBVIEeetFdz5pzgWAw10137066895114004424.png"/>
+                          <pic:cNvPr id="0" name="Picture 81" descr="file:/tmp/ViewElement__48vDxBVIEeetFdz5pzgWAw12347469551901079493.png"/>
                           <pic:cNvPicPr>
                             <a:picLocks noChangeAspect="true"/>
                           </pic:cNvPicPr>
                         </pic:nvPicPr>
                         <pic:blipFill>
-                          <a:blip r:embed="rId22"/>
+                          <a:blip r:embed="rId24"/>
                           <a:stretch>
                             <a:fillRect/>
                           </a:stretch>
@@ -26608,18 +26533,18 @@
               <w:drawing>
                 <wp:inline distT="0" distR="0" distB="0" distL="0">
                   <wp:extent cx="203200" cy="177800"/>
-                  <wp:docPr id="81" name="Drawing 81" descr="file:/C:/Users/VINCEN~1/AppData/Local/Temp/ViewElement__48vDxhVIEeetFdz5pzgWAw7421371540507714795.png"/>
+                  <wp:docPr id="82" name="Drawing 82" descr="file:/tmp/ViewElement__48vDxhVIEeetFdz5pzgWAw2015197134271891646.png"/>
                   <a:graphic xmlns:a="http://schemas.openxmlformats.org/drawingml/2006/main">
                     <a:graphicData uri="http://schemas.openxmlformats.org/drawingml/2006/picture">
                       <pic:pic xmlns:pic="http://schemas.openxmlformats.org/drawingml/2006/picture">
                         <pic:nvPicPr>
-                          <pic:cNvPr id="0" name="Picture 81" descr="file:/C:/Users/VINCEN~1/AppData/Local/Temp/ViewElement__48vDxhVIEeetFdz5pzgWAw7421371540507714795.png"/>
+                          <pic:cNvPr id="0" name="Picture 82" descr="file:/tmp/ViewElement__48vDxhVIEeetFdz5pzgWAw2015197134271891646.png"/>
                           <pic:cNvPicPr>
                             <a:picLocks noChangeAspect="true"/>
                           </pic:cNvPicPr>
                         </pic:nvPicPr>
                         <pic:blipFill>
-                          <a:blip r:embed="rId22"/>
+                          <a:blip r:embed="rId24"/>
                           <a:stretch>
                             <a:fillRect/>
                           </a:stretch>
@@ -26668,18 +26593,18 @@
               <w:drawing>
                 <wp:inline distT="0" distR="0" distB="0" distL="0">
                   <wp:extent cx="203200" cy="190500"/>
-                  <wp:docPr id="82" name="Drawing 82" descr="file:/C:/Users/VINCEN~1/AppData/Local/Temp/ViewElement__48vDyBVIEeetFdz5pzgWAw7776689990349081674.png"/>
+                  <wp:docPr id="83" name="Drawing 83" descr="file:/tmp/ViewElement__48vDyBVIEeetFdz5pzgWAw3684479240844910004.png"/>
                   <a:graphic xmlns:a="http://schemas.openxmlformats.org/drawingml/2006/main">
                     <a:graphicData uri="http://schemas.openxmlformats.org/drawingml/2006/picture">
                       <pic:pic xmlns:pic="http://schemas.openxmlformats.org/drawingml/2006/picture">
                         <pic:nvPicPr>
-                          <pic:cNvPr id="0" name="Picture 82" descr="file:/C:/Users/VINCEN~1/AppData/Local/Temp/ViewElement__48vDyBVIEeetFdz5pzgWAw7776689990349081674.png"/>
+                          <pic:cNvPr id="0" name="Picture 83" descr="file:/tmp/ViewElement__48vDyBVIEeetFdz5pzgWAw3684479240844910004.png"/>
                           <pic:cNvPicPr>
                             <a:picLocks noChangeAspect="true"/>
                           </pic:cNvPicPr>
                         </pic:nvPicPr>
                         <pic:blipFill>
-                          <a:blip r:embed="rId24"/>
+                          <a:blip r:embed="rId26"/>
                           <a:stretch>
                             <a:fillRect/>
                           </a:stretch>
@@ -26728,18 +26653,18 @@
               <w:drawing>
                 <wp:inline distT="0" distR="0" distB="0" distL="0">
                   <wp:extent cx="203200" cy="190500"/>
-                  <wp:docPr id="83" name="Drawing 83" descr="file:/C:/Users/VINCEN~1/AppData/Local/Temp/ViewElement__48vDzBVIEeetFdz5pzgWAw401342329497873771.png"/>
+                  <wp:docPr id="84" name="Drawing 84" descr="file:/tmp/ViewElement__48vDzBVIEeetFdz5pzgWAw12088432899288681985.png"/>
                   <a:graphic xmlns:a="http://schemas.openxmlformats.org/drawingml/2006/main">
                     <a:graphicData uri="http://schemas.openxmlformats.org/drawingml/2006/picture">
                       <pic:pic xmlns:pic="http://schemas.openxmlformats.org/drawingml/2006/picture">
                         <pic:nvPicPr>
-                          <pic:cNvPr id="0" name="Picture 83" descr="file:/C:/Users/VINCEN~1/AppData/Local/Temp/ViewElement__48vDzBVIEeetFdz5pzgWAw401342329497873771.png"/>
+                          <pic:cNvPr id="0" name="Picture 84" descr="file:/tmp/ViewElement__48vDzBVIEeetFdz5pzgWAw12088432899288681985.png"/>
                           <pic:cNvPicPr>
                             <a:picLocks noChangeAspect="true"/>
                           </pic:cNvPicPr>
                         </pic:nvPicPr>
                         <pic:blipFill>
-                          <a:blip r:embed="rId24"/>
+                          <a:blip r:embed="rId26"/>
                           <a:stretch>
                             <a:fillRect/>
                           </a:stretch>

</xml_diff>

<commit_message>
[SAFRAN-1240] Review MM declarations in templates properties
</commit_message>
<xml_diff>
--- a/samples/plugins/org.obeonetwork.is.samples/contents/E-BookStore/documentation/doc-src/E-BookStore_Cinematic_template.generated.docx
+++ b/samples/plugins/org.obeonetwork.is.samples/contents/E-BookStore/documentation/doc-src/E-BookStore_Cinematic_template.generated.docx
@@ -2051,12 +2051,12 @@
                     <w:drawing>
                       <wp:inline distT="0" distR="0" distB="0" distL="0">
                         <wp:extent cx="203200" cy="203200"/>
-                        <wp:docPr id="0" name="Drawing 0" descr="file:/tmp/CinematicRoot__47-1sBVIEeetFdz5pzgWAw11353336565241744010.png"/>
+                        <wp:docPr id="0" name="Drawing 0" descr="file:/tmp/CinematicRoot__47-1sBVIEeetFdz5pzgWAw2457421719552199320.png"/>
                         <a:graphic xmlns:a="http://schemas.openxmlformats.org/drawingml/2006/main">
                           <a:graphicData uri="http://schemas.openxmlformats.org/drawingml/2006/picture">
                             <pic:pic xmlns:pic="http://schemas.openxmlformats.org/drawingml/2006/picture">
                               <pic:nvPicPr>
-                                <pic:cNvPr id="0" name="Picture 0" descr="file:/tmp/CinematicRoot__47-1sBVIEeetFdz5pzgWAw11353336565241744010.png"/>
+                                <pic:cNvPr id="0" name="Picture 0" descr="file:/tmp/CinematicRoot__47-1sBVIEeetFdz5pzgWAw2457421719552199320.png"/>
                                 <pic:cNvPicPr>
                                   <a:picLocks noChangeAspect="true"/>
                                 </pic:cNvPicPr>
@@ -2117,12 +2117,12 @@
                     <w:drawing>
                       <wp:inline distT="0" distR="0" distB="0" distL="0">
                         <wp:extent cx="203200" cy="203200"/>
-                        <wp:docPr id="1" name="Drawing 1" descr="file:/tmp/Package__48qyPBVIEeetFdz5pzgWAw7872905843181545527.png"/>
+                        <wp:docPr id="1" name="Drawing 1" descr="file:/tmp/Package__48qyPBVIEeetFdz5pzgWAw6317141299206139556.png"/>
                         <a:graphic xmlns:a="http://schemas.openxmlformats.org/drawingml/2006/main">
                           <a:graphicData uri="http://schemas.openxmlformats.org/drawingml/2006/picture">
                             <pic:pic xmlns:pic="http://schemas.openxmlformats.org/drawingml/2006/picture">
                               <pic:nvPicPr>
-                                <pic:cNvPr id="0" name="Picture 1" descr="file:/tmp/Package__48qyPBVIEeetFdz5pzgWAw7872905843181545527.png"/>
+                                <pic:cNvPr id="0" name="Picture 1" descr="file:/tmp/Package__48qyPBVIEeetFdz5pzgWAw6317141299206139556.png"/>
                                 <pic:cNvPicPr>
                                   <a:picLocks noChangeAspect="true"/>
                                 </pic:cNvPicPr>
@@ -2183,12 +2183,12 @@
                     <w:drawing>
                       <wp:inline distT="0" distR="0" distB="0" distL="0">
                         <wp:extent cx="203200" cy="203200"/>
-                        <wp:docPr id="2" name="Drawing 2" descr="file:/tmp/ViewContainer__48gaJBVIEeetFdz5pzgWAw15355073053068983889.png"/>
+                        <wp:docPr id="2" name="Drawing 2" descr="file:/tmp/ViewContainer__48gaJBVIEeetFdz5pzgWAw7627839229637117476.png"/>
                         <a:graphic xmlns:a="http://schemas.openxmlformats.org/drawingml/2006/main">
                           <a:graphicData uri="http://schemas.openxmlformats.org/drawingml/2006/picture">
                             <pic:pic xmlns:pic="http://schemas.openxmlformats.org/drawingml/2006/picture">
                               <pic:nvPicPr>
-                                <pic:cNvPr id="0" name="Picture 2" descr="file:/tmp/ViewContainer__48gaJBVIEeetFdz5pzgWAw15355073053068983889.png"/>
+                                <pic:cNvPr id="0" name="Picture 2" descr="file:/tmp/ViewContainer__48gaJBVIEeetFdz5pzgWAw7627839229637117476.png"/>
                                 <pic:cNvPicPr>
                                   <a:picLocks noChangeAspect="true"/>
                                 </pic:cNvPicPr>
@@ -2249,12 +2249,12 @@
                     <w:drawing>
                       <wp:inline distT="0" distR="0" distB="0" distL="0">
                         <wp:extent cx="203200" cy="203200"/>
-                        <wp:docPr id="3" name="Drawing 3" descr="file:/tmp/ViewContainer__48qLRRVIEeetFdz5pzgWAw363649048786183271.png"/>
+                        <wp:docPr id="3" name="Drawing 3" descr="file:/tmp/ViewContainer__48qLRRVIEeetFdz5pzgWAw17101472733914911028.png"/>
                         <a:graphic xmlns:a="http://schemas.openxmlformats.org/drawingml/2006/main">
                           <a:graphicData uri="http://schemas.openxmlformats.org/drawingml/2006/picture">
                             <pic:pic xmlns:pic="http://schemas.openxmlformats.org/drawingml/2006/picture">
                               <pic:nvPicPr>
-                                <pic:cNvPr id="0" name="Picture 3" descr="file:/tmp/ViewContainer__48qLRRVIEeetFdz5pzgWAw363649048786183271.png"/>
+                                <pic:cNvPr id="0" name="Picture 3" descr="file:/tmp/ViewContainer__48qLRRVIEeetFdz5pzgWAw17101472733914911028.png"/>
                                 <pic:cNvPicPr>
                                   <a:picLocks noChangeAspect="true"/>
                                 </pic:cNvPicPr>
@@ -2315,12 +2315,12 @@
                     <w:drawing>
                       <wp:inline distT="0" distR="0" distB="0" distL="0">
                         <wp:extent cx="203200" cy="203200"/>
-                        <wp:docPr id="4" name="Drawing 4" descr="file:/tmp/Toolkit__IxeAcKLCEeuqs9mIRWXCLA5063673587357248721.png"/>
+                        <wp:docPr id="4" name="Drawing 4" descr="file:/tmp/Toolkit__IxeAcKLCEeuqs9mIRWXCLA17932569357210283273.png"/>
                         <a:graphic xmlns:a="http://schemas.openxmlformats.org/drawingml/2006/main">
                           <a:graphicData uri="http://schemas.openxmlformats.org/drawingml/2006/picture">
                             <pic:pic xmlns:pic="http://schemas.openxmlformats.org/drawingml/2006/picture">
                               <pic:nvPicPr>
-                                <pic:cNvPr id="0" name="Picture 4" descr="file:/tmp/Toolkit__IxeAcKLCEeuqs9mIRWXCLA5063673587357248721.png"/>
+                                <pic:cNvPr id="0" name="Picture 4" descr="file:/tmp/Toolkit__IxeAcKLCEeuqs9mIRWXCLA17932569357210283273.png"/>
                                 <pic:cNvPicPr>
                                   <a:picLocks noChangeAspect="true"/>
                                 </pic:cNvPicPr>
@@ -2605,12 +2605,12 @@
                     <w:drawing>
                       <wp:inline distT="0" distR="0" distB="0" distL="0">
                         <wp:extent cx="203200" cy="203200"/>
-                        <wp:docPr id="5" name="Drawing 5" descr="file:/tmp/ViewContainer__48gaJBVIEeetFdz5pzgWAw7043107571246062328.png"/>
+                        <wp:docPr id="5" name="Drawing 5" descr="file:/tmp/ViewContainer__48gaJBVIEeetFdz5pzgWAw9361573764633183095.png"/>
                         <a:graphic xmlns:a="http://schemas.openxmlformats.org/drawingml/2006/main">
                           <a:graphicData uri="http://schemas.openxmlformats.org/drawingml/2006/picture">
                             <pic:pic xmlns:pic="http://schemas.openxmlformats.org/drawingml/2006/picture">
                               <pic:nvPicPr>
-                                <pic:cNvPr id="0" name="Picture 5" descr="file:/tmp/ViewContainer__48gaJBVIEeetFdz5pzgWAw7043107571246062328.png"/>
+                                <pic:cNvPr id="0" name="Picture 5" descr="file:/tmp/ViewContainer__48gaJBVIEeetFdz5pzgWAw9361573764633183095.png"/>
                                 <pic:cNvPicPr>
                                   <a:picLocks noChangeAspect="true"/>
                                 </pic:cNvPicPr>
@@ -2671,12 +2671,12 @@
                     <w:drawing>
                       <wp:inline distT="0" distR="0" distB="0" distL="0">
                         <wp:extent cx="203200" cy="203200"/>
-                        <wp:docPr id="6" name="Drawing 6" descr="file:/tmp/ViewContainer__48jdcBVIEeetFdz5pzgWAw15371829056021384825.png"/>
+                        <wp:docPr id="6" name="Drawing 6" descr="file:/tmp/ViewContainer__48jdcBVIEeetFdz5pzgWAw927050090001699788.png"/>
                         <a:graphic xmlns:a="http://schemas.openxmlformats.org/drawingml/2006/main">
                           <a:graphicData uri="http://schemas.openxmlformats.org/drawingml/2006/picture">
                             <pic:pic xmlns:pic="http://schemas.openxmlformats.org/drawingml/2006/picture">
                               <pic:nvPicPr>
-                                <pic:cNvPr id="0" name="Picture 6" descr="file:/tmp/ViewContainer__48jdcBVIEeetFdz5pzgWAw15371829056021384825.png"/>
+                                <pic:cNvPr id="0" name="Picture 6" descr="file:/tmp/ViewContainer__48jdcBVIEeetFdz5pzgWAw927050090001699788.png"/>
                                 <pic:cNvPicPr>
                                   <a:picLocks noChangeAspect="true"/>
                                 </pic:cNvPicPr>
@@ -2737,12 +2737,12 @@
                     <w:drawing>
                       <wp:inline distT="0" distR="0" distB="0" distL="0">
                         <wp:extent cx="203200" cy="203200"/>
-                        <wp:docPr id="7" name="Drawing 7" descr="file:/tmp/ViewContainer__48qLIBVIEeetFdz5pzgWAw11493395312212176430.png"/>
+                        <wp:docPr id="7" name="Drawing 7" descr="file:/tmp/ViewContainer__48qLIBVIEeetFdz5pzgWAw8580573725342588752.png"/>
                         <a:graphic xmlns:a="http://schemas.openxmlformats.org/drawingml/2006/main">
                           <a:graphicData uri="http://schemas.openxmlformats.org/drawingml/2006/picture">
                             <pic:pic xmlns:pic="http://schemas.openxmlformats.org/drawingml/2006/picture">
                               <pic:nvPicPr>
-                                <pic:cNvPr id="0" name="Picture 7" descr="file:/tmp/ViewContainer__48qLIBVIEeetFdz5pzgWAw11493395312212176430.png"/>
+                                <pic:cNvPr id="0" name="Picture 7" descr="file:/tmp/ViewContainer__48qLIBVIEeetFdz5pzgWAw8580573725342588752.png"/>
                                 <pic:cNvPicPr>
                                   <a:picLocks noChangeAspect="true"/>
                                 </pic:cNvPicPr>
@@ -2803,12 +2803,12 @@
                     <w:drawing>
                       <wp:inline distT="0" distR="0" distB="0" distL="0">
                         <wp:extent cx="203200" cy="203200"/>
-                        <wp:docPr id="8" name="Drawing 8" descr="file:/tmp/ViewContainer__48qLLxVIEeetFdz5pzgWAw10459336326838330845.png"/>
+                        <wp:docPr id="8" name="Drawing 8" descr="file:/tmp/ViewContainer__48qLLxVIEeetFdz5pzgWAw12379054279633608544.png"/>
                         <a:graphic xmlns:a="http://schemas.openxmlformats.org/drawingml/2006/main">
                           <a:graphicData uri="http://schemas.openxmlformats.org/drawingml/2006/picture">
                             <pic:pic xmlns:pic="http://schemas.openxmlformats.org/drawingml/2006/picture">
                               <pic:nvPicPr>
-                                <pic:cNvPr id="0" name="Picture 8" descr="file:/tmp/ViewContainer__48qLLxVIEeetFdz5pzgWAw10459336326838330845.png"/>
+                                <pic:cNvPr id="0" name="Picture 8" descr="file:/tmp/ViewContainer__48qLLxVIEeetFdz5pzgWAw12379054279633608544.png"/>
                                 <pic:cNvPicPr>
                                   <a:picLocks noChangeAspect="true"/>
                                 </pic:cNvPicPr>
@@ -2872,12 +2872,12 @@
               <w:drawing>
                 <wp:inline distT="0" distR="0" distB="0" distL="0">
                   <wp:extent cx="5080000" cy="3365500"/>
-                  <wp:docPr id="9" name="Drawing 9" descr="file:/tmp/HomePage%20View%20Container%20Mockup_copy-m2doc12176188487080981016.jpg"/>
+                  <wp:docPr id="9" name="Drawing 9" descr="file:/tmp/HomePage%20View%20Container%20Mockup_copy-m2doc5571146073472931877.jpg"/>
                   <a:graphic xmlns:a="http://schemas.openxmlformats.org/drawingml/2006/main">
                     <a:graphicData uri="http://schemas.openxmlformats.org/drawingml/2006/picture">
                       <pic:pic xmlns:pic="http://schemas.openxmlformats.org/drawingml/2006/picture">
                         <pic:nvPicPr>
-                          <pic:cNvPr id="0" name="Picture 9" descr="file:/tmp/HomePage%20View%20Container%20Mockup_copy-m2doc12176188487080981016.jpg"/>
+                          <pic:cNvPr id="0" name="Picture 9" descr="file:/tmp/HomePage%20View%20Container%20Mockup_copy-m2doc5571146073472931877.jpg"/>
                           <pic:cNvPicPr>
                             <a:picLocks noChangeAspect="true"/>
                           </pic:cNvPicPr>
@@ -4529,12 +4529,12 @@
                     <w:drawing>
                       <wp:inline distT="0" distR="0" distB="0" distL="0">
                         <wp:extent cx="203200" cy="203200"/>
-                        <wp:docPr id="10" name="Drawing 10" descr="file:/tmp/ViewContainer__48qLRRVIEeetFdz5pzgWAw1002355104101148279.png"/>
+                        <wp:docPr id="10" name="Drawing 10" descr="file:/tmp/ViewContainer__48qLRRVIEeetFdz5pzgWAw16045661521533859969.png"/>
                         <a:graphic xmlns:a="http://schemas.openxmlformats.org/drawingml/2006/main">
                           <a:graphicData uri="http://schemas.openxmlformats.org/drawingml/2006/picture">
                             <pic:pic xmlns:pic="http://schemas.openxmlformats.org/drawingml/2006/picture">
                               <pic:nvPicPr>
-                                <pic:cNvPr id="0" name="Picture 10" descr="file:/tmp/ViewContainer__48qLRRVIEeetFdz5pzgWAw1002355104101148279.png"/>
+                                <pic:cNvPr id="0" name="Picture 10" descr="file:/tmp/ViewContainer__48qLRRVIEeetFdz5pzgWAw16045661521533859969.png"/>
                                 <pic:cNvPicPr>
                                   <a:picLocks noChangeAspect="true"/>
                                 </pic:cNvPicPr>
@@ -4598,12 +4598,12 @@
               <w:drawing>
                 <wp:inline distT="0" distR="0" distB="0" distL="0">
                   <wp:extent cx="5080000" cy="3352800"/>
-                  <wp:docPr id="11" name="Drawing 11" descr="file:/tmp/CreateAccount%20View%20Container%20Mockup_copy-m2doc9653542254228849561.jpg"/>
+                  <wp:docPr id="11" name="Drawing 11" descr="file:/tmp/CreateAccount%20View%20Container%20Mockup_copy-m2doc7005410934931203809.jpg"/>
                   <a:graphic xmlns:a="http://schemas.openxmlformats.org/drawingml/2006/main">
                     <a:graphicData uri="http://schemas.openxmlformats.org/drawingml/2006/picture">
                       <pic:pic xmlns:pic="http://schemas.openxmlformats.org/drawingml/2006/picture">
                         <pic:nvPicPr>
-                          <pic:cNvPr id="0" name="Picture 11" descr="file:/tmp/CreateAccount%20View%20Container%20Mockup_copy-m2doc9653542254228849561.jpg"/>
+                          <pic:cNvPr id="0" name="Picture 11" descr="file:/tmp/CreateAccount%20View%20Container%20Mockup_copy-m2doc7005410934931203809.jpg"/>
                           <pic:cNvPicPr>
                             <a:picLocks noChangeAspect="true"/>
                           </pic:cNvPicPr>
@@ -7025,12 +7025,12 @@
                     <w:drawing>
                       <wp:inline distT="0" distR="0" distB="0" distL="0">
                         <wp:extent cx="203200" cy="203200"/>
-                        <wp:docPr id="12" name="Drawing 12" descr="file:/tmp/Package__48qyPBVIEeetFdz5pzgWAw12418580266353415706.png"/>
+                        <wp:docPr id="12" name="Drawing 12" descr="file:/tmp/Package__48qyPBVIEeetFdz5pzgWAw13769370124427966298.png"/>
                         <a:graphic xmlns:a="http://schemas.openxmlformats.org/drawingml/2006/main">
                           <a:graphicData uri="http://schemas.openxmlformats.org/drawingml/2006/picture">
                             <pic:pic xmlns:pic="http://schemas.openxmlformats.org/drawingml/2006/picture">
                               <pic:nvPicPr>
-                                <pic:cNvPr id="0" name="Picture 12" descr="file:/tmp/Package__48qyPBVIEeetFdz5pzgWAw12418580266353415706.png"/>
+                                <pic:cNvPr id="0" name="Picture 12" descr="file:/tmp/Package__48qyPBVIEeetFdz5pzgWAw13769370124427966298.png"/>
                                 <pic:cNvPicPr>
                                   <a:picLocks noChangeAspect="true"/>
                                 </pic:cNvPicPr>
@@ -7091,12 +7091,12 @@
                     <w:drawing>
                       <wp:inline distT="0" distR="0" distB="0" distL="0">
                         <wp:extent cx="203200" cy="203200"/>
-                        <wp:docPr id="13" name="Drawing 13" descr="file:/tmp/ViewContainer__48vDrhVIEeetFdz5pzgWAw4063899638983615070.png"/>
+                        <wp:docPr id="13" name="Drawing 13" descr="file:/tmp/ViewContainer__48vDrhVIEeetFdz5pzgWAw12638976890474204377.png"/>
                         <a:graphic xmlns:a="http://schemas.openxmlformats.org/drawingml/2006/main">
                           <a:graphicData uri="http://schemas.openxmlformats.org/drawingml/2006/picture">
                             <pic:pic xmlns:pic="http://schemas.openxmlformats.org/drawingml/2006/picture">
                               <pic:nvPicPr>
-                                <pic:cNvPr id="0" name="Picture 13" descr="file:/tmp/ViewContainer__48vDrhVIEeetFdz5pzgWAw4063899638983615070.png"/>
+                                <pic:cNvPr id="0" name="Picture 13" descr="file:/tmp/ViewContainer__48vDrhVIEeetFdz5pzgWAw12638976890474204377.png"/>
                                 <pic:cNvPicPr>
                                   <a:picLocks noChangeAspect="true"/>
                                 </pic:cNvPicPr>
@@ -7157,12 +7157,12 @@
                     <w:drawing>
                       <wp:inline distT="0" distR="0" distB="0" distL="0">
                         <wp:extent cx="203200" cy="203200"/>
-                        <wp:docPr id="14" name="Drawing 14" descr="file:/tmp/ViewContainer__48vDwBVIEeetFdz5pzgWAw14995166363267004761.png"/>
+                        <wp:docPr id="14" name="Drawing 14" descr="file:/tmp/ViewContainer__48vDwBVIEeetFdz5pzgWAw4889815883873662578.png"/>
                         <a:graphic xmlns:a="http://schemas.openxmlformats.org/drawingml/2006/main">
                           <a:graphicData uri="http://schemas.openxmlformats.org/drawingml/2006/picture">
                             <pic:pic xmlns:pic="http://schemas.openxmlformats.org/drawingml/2006/picture">
                               <pic:nvPicPr>
-                                <pic:cNvPr id="0" name="Picture 14" descr="file:/tmp/ViewContainer__48vDwBVIEeetFdz5pzgWAw14995166363267004761.png"/>
+                                <pic:cNvPr id="0" name="Picture 14" descr="file:/tmp/ViewContainer__48vDwBVIEeetFdz5pzgWAw4889815883873662578.png"/>
                                 <pic:cNvPicPr>
                                   <a:picLocks noChangeAspect="true"/>
                                 </pic:cNvPicPr>
@@ -7427,12 +7427,12 @@
                     <w:drawing>
                       <wp:inline distT="0" distR="0" distB="0" distL="0">
                         <wp:extent cx="203200" cy="203200"/>
-                        <wp:docPr id="15" name="Drawing 15" descr="file:/tmp/ViewContainer__48vDrhVIEeetFdz5pzgWAw16191188910132853105.png"/>
+                        <wp:docPr id="15" name="Drawing 15" descr="file:/tmp/ViewContainer__48vDrhVIEeetFdz5pzgWAw18326510860031790017.png"/>
                         <a:graphic xmlns:a="http://schemas.openxmlformats.org/drawingml/2006/main">
                           <a:graphicData uri="http://schemas.openxmlformats.org/drawingml/2006/picture">
                             <pic:pic xmlns:pic="http://schemas.openxmlformats.org/drawingml/2006/picture">
                               <pic:nvPicPr>
-                                <pic:cNvPr id="0" name="Picture 15" descr="file:/tmp/ViewContainer__48vDrhVIEeetFdz5pzgWAw16191188910132853105.png"/>
+                                <pic:cNvPr id="0" name="Picture 15" descr="file:/tmp/ViewContainer__48vDrhVIEeetFdz5pzgWAw18326510860031790017.png"/>
                                 <pic:cNvPicPr>
                                   <a:picLocks noChangeAspect="true"/>
                                 </pic:cNvPicPr>
@@ -9390,12 +9390,12 @@
                     <w:drawing>
                       <wp:inline distT="0" distR="0" distB="0" distL="0">
                         <wp:extent cx="203200" cy="203200"/>
-                        <wp:docPr id="16" name="Drawing 16" descr="file:/tmp/ViewContainer__48vDwBVIEeetFdz5pzgWAw2796940961685463619.png"/>
+                        <wp:docPr id="16" name="Drawing 16" descr="file:/tmp/ViewContainer__48vDwBVIEeetFdz5pzgWAw16037760972367367195.png"/>
                         <a:graphic xmlns:a="http://schemas.openxmlformats.org/drawingml/2006/main">
                           <a:graphicData uri="http://schemas.openxmlformats.org/drawingml/2006/picture">
                             <pic:pic xmlns:pic="http://schemas.openxmlformats.org/drawingml/2006/picture">
                               <pic:nvPicPr>
-                                <pic:cNvPr id="0" name="Picture 16" descr="file:/tmp/ViewContainer__48vDwBVIEeetFdz5pzgWAw2796940961685463619.png"/>
+                                <pic:cNvPr id="0" name="Picture 16" descr="file:/tmp/ViewContainer__48vDwBVIEeetFdz5pzgWAw16037760972367367195.png"/>
                                 <pic:cNvPicPr>
                                   <a:picLocks noChangeAspect="true"/>
                                 </pic:cNvPicPr>
@@ -11701,12 +11701,12 @@
         <w:drawing>
           <wp:inline distT="0" distR="0" distB="0" distL="0">
             <wp:extent cx="5080000" cy="2222500"/>
-            <wp:docPr id="17" name="Drawing 17" descr="file:/tmp/E-BookStore%20Package%20Diagram_copy-m2doc1009963335195314013.jpg"/>
+            <wp:docPr id="17" name="Drawing 17" descr="file:/tmp/E-BookStore%20Package%20Diagram_copy-m2doc14743081942175294615.jpg"/>
             <a:graphic xmlns:a="http://schemas.openxmlformats.org/drawingml/2006/main">
               <a:graphicData uri="http://schemas.openxmlformats.org/drawingml/2006/picture">
                 <pic:pic xmlns:pic="http://schemas.openxmlformats.org/drawingml/2006/picture">
                   <pic:nvPicPr>
-                    <pic:cNvPr id="0" name="Picture 17" descr="file:/tmp/E-BookStore%20Package%20Diagram_copy-m2doc1009963335195314013.jpg"/>
+                    <pic:cNvPr id="0" name="Picture 17" descr="file:/tmp/E-BookStore%20Package%20Diagram_copy-m2doc14743081942175294615.jpg"/>
                     <pic:cNvPicPr>
                       <a:picLocks noChangeAspect="true"/>
                     </pic:cNvPicPr>
@@ -11885,12 +11885,12 @@
         <w:drawing>
           <wp:inline distT="0" distR="0" distB="0" distL="0">
             <wp:extent cx="5080000" cy="2616200"/>
-            <wp:docPr id="18" name="Drawing 18" descr="file:/tmp/Main%20Flow%20Diagram_copy-m2doc10589499605456662408.jpg"/>
+            <wp:docPr id="18" name="Drawing 18" descr="file:/tmp/Main%20Flow%20Diagram_copy-m2doc4314139412061210898.jpg"/>
             <a:graphic xmlns:a="http://schemas.openxmlformats.org/drawingml/2006/main">
               <a:graphicData uri="http://schemas.openxmlformats.org/drawingml/2006/picture">
                 <pic:pic xmlns:pic="http://schemas.openxmlformats.org/drawingml/2006/picture">
                   <pic:nvPicPr>
-                    <pic:cNvPr id="0" name="Picture 18" descr="file:/tmp/Main%20Flow%20Diagram_copy-m2doc10589499605456662408.jpg"/>
+                    <pic:cNvPr id="0" name="Picture 18" descr="file:/tmp/Main%20Flow%20Diagram_copy-m2doc4314139412061210898.jpg"/>
                     <pic:cNvPicPr>
                       <a:picLocks noChangeAspect="true"/>
                     </pic:cNvPicPr>
@@ -12350,7 +12350,7 @@
           </w:tcPr>
           <w:p>
             <w:r>
-              <w:t>InitialState</w:t>
+              <w:t>Initial State</w:t>
             </w:r>
           </w:p>
         </w:tc>
@@ -12383,7 +12383,7 @@
           </w:tcPr>
           <w:p>
             <w:r>
-              <w:t>ViewState</w:t>
+              <w:t>View State</w:t>
             </w:r>
           </w:p>
         </w:tc>
@@ -12416,7 +12416,7 @@
           </w:tcPr>
           <w:p>
             <w:r>
-              <w:t>ActionState</w:t>
+              <w:t>Action State</w:t>
             </w:r>
           </w:p>
         </w:tc>
@@ -12449,7 +12449,7 @@
           </w:tcPr>
           <w:p>
             <w:r>
-              <w:t>ActionState</w:t>
+              <w:t>Action State</w:t>
             </w:r>
           </w:p>
         </w:tc>
@@ -12482,7 +12482,7 @@
           </w:tcPr>
           <w:p>
             <w:r>
-              <w:t>ActionState</w:t>
+              <w:t>Action State</w:t>
             </w:r>
           </w:p>
         </w:tc>
@@ -12515,7 +12515,7 @@
           </w:tcPr>
           <w:p>
             <w:r>
-              <w:t>ActionState</w:t>
+              <w:t>Action State</w:t>
             </w:r>
           </w:p>
         </w:tc>
@@ -12548,7 +12548,7 @@
           </w:tcPr>
           <w:p>
             <w:r>
-              <w:t>ViewState</w:t>
+              <w:t>View State</w:t>
             </w:r>
           </w:p>
         </w:tc>
@@ -12581,7 +12581,7 @@
           </w:tcPr>
           <w:p>
             <w:r>
-              <w:t>ActionState</w:t>
+              <w:t>Action State</w:t>
             </w:r>
           </w:p>
         </w:tc>
@@ -12614,7 +12614,7 @@
           </w:tcPr>
           <w:p>
             <w:r>
-              <w:t>SubflowState</w:t>
+              <w:t>Subflow State</w:t>
             </w:r>
           </w:p>
         </w:tc>
@@ -12649,7 +12649,7 @@
           <w:i/>
           <w:u w:val="single"/>
         </w:rPr>
-        <w:t>InitialState</w:t>
+        <w:t>Initial State</w:t>
       </w:r>
       <w:r>
         <w:rPr>
@@ -12838,7 +12838,7 @@
           <w:i/>
           <w:u w:val="single"/>
         </w:rPr>
-        <w:t>ViewState</w:t>
+        <w:t>View State</w:t>
       </w:r>
       <w:r>
         <w:rPr>
@@ -13029,7 +13029,7 @@
           <w:i/>
           <w:u w:val="single"/>
         </w:rPr>
-        <w:t>ActionState</w:t>
+        <w:t>Action State</w:t>
       </w:r>
       <w:r>
         <w:rPr>
@@ -13220,7 +13220,7 @@
           <w:i/>
           <w:u w:val="single"/>
         </w:rPr>
-        <w:t>ActionState</w:t>
+        <w:t>Action State</w:t>
       </w:r>
       <w:r>
         <w:rPr>
@@ -13411,7 +13411,7 @@
           <w:i/>
           <w:u w:val="single"/>
         </w:rPr>
-        <w:t>ActionState</w:t>
+        <w:t>Action State</w:t>
       </w:r>
       <w:r>
         <w:rPr>
@@ -13600,7 +13600,7 @@
           <w:i/>
           <w:u w:val="single"/>
         </w:rPr>
-        <w:t>ActionState</w:t>
+        <w:t>Action State</w:t>
       </w:r>
       <w:r>
         <w:rPr>
@@ -13789,7 +13789,7 @@
           <w:i/>
           <w:u w:val="single"/>
         </w:rPr>
-        <w:t>ViewState</w:t>
+        <w:t>View State</w:t>
       </w:r>
       <w:r>
         <w:rPr>
@@ -13980,7 +13980,7 @@
           <w:i/>
           <w:u w:val="single"/>
         </w:rPr>
-        <w:t>ActionState</w:t>
+        <w:t>Action State</w:t>
       </w:r>
       <w:r>
         <w:rPr>
@@ -14169,7 +14169,7 @@
           <w:i/>
           <w:u w:val="single"/>
         </w:rPr>
-        <w:t>SubflowState</w:t>
+        <w:t>Subflow State</w:t>
       </w:r>
       <w:r>
         <w:rPr>
@@ -17496,12 +17496,12 @@
         <w:drawing>
           <wp:inline distT="0" distR="0" distB="0" distL="0">
             <wp:extent cx="5080000" cy="4775200"/>
-            <wp:docPr id="19" name="Drawing 19" descr="file:/tmp/Checkout%20Flow%20Diagram_copy-m2doc13928194921208584653.jpg"/>
+            <wp:docPr id="19" name="Drawing 19" descr="file:/tmp/Checkout%20Flow%20Diagram_copy-m2doc14226501123629936369.jpg"/>
             <a:graphic xmlns:a="http://schemas.openxmlformats.org/drawingml/2006/main">
               <a:graphicData uri="http://schemas.openxmlformats.org/drawingml/2006/picture">
                 <pic:pic xmlns:pic="http://schemas.openxmlformats.org/drawingml/2006/picture">
                   <pic:nvPicPr>
-                    <pic:cNvPr id="0" name="Picture 19" descr="file:/tmp/Checkout%20Flow%20Diagram_copy-m2doc13928194921208584653.jpg"/>
+                    <pic:cNvPr id="0" name="Picture 19" descr="file:/tmp/Checkout%20Flow%20Diagram_copy-m2doc14226501123629936369.jpg"/>
                     <pic:cNvPicPr>
                       <a:picLocks noChangeAspect="true"/>
                     </pic:cNvPicPr>
@@ -17894,7 +17894,7 @@
           </w:tcPr>
           <w:p>
             <w:r>
-              <w:t>InitialState</w:t>
+              <w:t>Initial State</w:t>
             </w:r>
           </w:p>
         </w:tc>
@@ -17927,7 +17927,7 @@
           </w:tcPr>
           <w:p>
             <w:r>
-              <w:t>DecisionState</w:t>
+              <w:t>Decision State</w:t>
             </w:r>
           </w:p>
         </w:tc>
@@ -17960,7 +17960,7 @@
           </w:tcPr>
           <w:p>
             <w:r>
-              <w:t>ViewState</w:t>
+              <w:t>View State</w:t>
             </w:r>
           </w:p>
         </w:tc>
@@ -17993,7 +17993,7 @@
           </w:tcPr>
           <w:p>
             <w:r>
-              <w:t>ViewState</w:t>
+              <w:t>View State</w:t>
             </w:r>
           </w:p>
         </w:tc>
@@ -18026,7 +18026,7 @@
           </w:tcPr>
           <w:p>
             <w:r>
-              <w:t>ActionState</w:t>
+              <w:t>Action State</w:t>
             </w:r>
           </w:p>
         </w:tc>
@@ -18059,7 +18059,7 @@
           </w:tcPr>
           <w:p>
             <w:r>
-              <w:t>SubflowState</w:t>
+              <w:t>Subflow State</w:t>
             </w:r>
           </w:p>
         </w:tc>
@@ -18092,7 +18092,7 @@
           </w:tcPr>
           <w:p>
             <w:r>
-              <w:t>ActionState</w:t>
+              <w:t>Action State</w:t>
             </w:r>
           </w:p>
         </w:tc>
@@ -18125,7 +18125,7 @@
           </w:tcPr>
           <w:p>
             <w:r>
-              <w:t>FinalState</w:t>
+              <w:t>Final State</w:t>
             </w:r>
           </w:p>
         </w:tc>
@@ -18158,7 +18158,7 @@
           </w:tcPr>
           <w:p>
             <w:r>
-              <w:t>FinalState</w:t>
+              <w:t>Final State</w:t>
             </w:r>
           </w:p>
         </w:tc>
@@ -18193,7 +18193,7 @@
           <w:i/>
           <w:u w:val="single"/>
         </w:rPr>
-        <w:t>InitialState</w:t>
+        <w:t>Initial State</w:t>
       </w:r>
       <w:r>
         <w:rPr>
@@ -18381,7 +18381,7 @@
           <w:i/>
           <w:u w:val="single"/>
         </w:rPr>
-        <w:t>DecisionState</w:t>
+        <w:t>Decision State</w:t>
       </w:r>
       <w:r>
         <w:rPr>
@@ -18569,7 +18569,7 @@
           <w:i/>
           <w:u w:val="single"/>
         </w:rPr>
-        <w:t>ViewState</w:t>
+        <w:t>View State</w:t>
       </w:r>
       <w:r>
         <w:rPr>
@@ -18759,7 +18759,7 @@
           <w:i/>
           <w:u w:val="single"/>
         </w:rPr>
-        <w:t>ViewState</w:t>
+        <w:t>View State</w:t>
       </w:r>
       <w:r>
         <w:rPr>
@@ -18949,7 +18949,7 @@
           <w:i/>
           <w:u w:val="single"/>
         </w:rPr>
-        <w:t>ActionState</w:t>
+        <w:t>Action State</w:t>
       </w:r>
       <w:r>
         <w:rPr>
@@ -19137,7 +19137,7 @@
           <w:i/>
           <w:u w:val="single"/>
         </w:rPr>
-        <w:t>SubflowState</w:t>
+        <w:t>Subflow State</w:t>
       </w:r>
       <w:r>
         <w:rPr>
@@ -19325,7 +19325,7 @@
           <w:i/>
           <w:u w:val="single"/>
         </w:rPr>
-        <w:t>ActionState</w:t>
+        <w:t>Action State</w:t>
       </w:r>
       <w:r>
         <w:rPr>
@@ -19513,7 +19513,7 @@
           <w:i/>
           <w:u w:val="single"/>
         </w:rPr>
-        <w:t>FinalState</w:t>
+        <w:t>Final State</w:t>
       </w:r>
       <w:r>
         <w:rPr>
@@ -19701,7 +19701,7 @@
           <w:i/>
           <w:u w:val="single"/>
         </w:rPr>
-        <w:t>FinalState</w:t>
+        <w:t>Final State</w:t>
       </w:r>
       <w:r>
         <w:rPr>
@@ -22296,12 +22296,12 @@
               <w:drawing>
                 <wp:inline distT="0" distR="0" distB="0" distL="0">
                   <wp:extent cx="203200" cy="203200"/>
-                  <wp:docPr id="20" name="Drawing 20" descr="file:/tmp/ViewContainer__48gaJBVIEeetFdz5pzgWAw600833693451756065.png"/>
+                  <wp:docPr id="20" name="Drawing 20" descr="file:/tmp/ViewContainer__48gaJBVIEeetFdz5pzgWAw6958102869204187978.png"/>
                   <a:graphic xmlns:a="http://schemas.openxmlformats.org/drawingml/2006/main">
                     <a:graphicData uri="http://schemas.openxmlformats.org/drawingml/2006/picture">
                       <pic:pic xmlns:pic="http://schemas.openxmlformats.org/drawingml/2006/picture">
                         <pic:nvPicPr>
-                          <pic:cNvPr id="0" name="Picture 20" descr="file:/tmp/ViewContainer__48gaJBVIEeetFdz5pzgWAw600833693451756065.png"/>
+                          <pic:cNvPr id="0" name="Picture 20" descr="file:/tmp/ViewContainer__48gaJBVIEeetFdz5pzgWAw6958102869204187978.png"/>
                           <pic:cNvPicPr>
                             <a:picLocks noChangeAspect="true"/>
                           </pic:cNvPicPr>
@@ -22356,12 +22356,12 @@
               <w:drawing>
                 <wp:inline distT="0" distR="0" distB="0" distL="0">
                   <wp:extent cx="203200" cy="203200"/>
-                  <wp:docPr id="21" name="Drawing 21" descr="file:/tmp/ViewContainer__48jdcBVIEeetFdz5pzgWAw10842737623758336518.png"/>
+                  <wp:docPr id="21" name="Drawing 21" descr="file:/tmp/ViewContainer__48jdcBVIEeetFdz5pzgWAw5385465760142408648.png"/>
                   <a:graphic xmlns:a="http://schemas.openxmlformats.org/drawingml/2006/main">
                     <a:graphicData uri="http://schemas.openxmlformats.org/drawingml/2006/picture">
                       <pic:pic xmlns:pic="http://schemas.openxmlformats.org/drawingml/2006/picture">
                         <pic:nvPicPr>
-                          <pic:cNvPr id="0" name="Picture 21" descr="file:/tmp/ViewContainer__48jdcBVIEeetFdz5pzgWAw10842737623758336518.png"/>
+                          <pic:cNvPr id="0" name="Picture 21" descr="file:/tmp/ViewContainer__48jdcBVIEeetFdz5pzgWAw5385465760142408648.png"/>
                           <pic:cNvPicPr>
                             <a:picLocks noChangeAspect="true"/>
                           </pic:cNvPicPr>
@@ -22416,12 +22416,12 @@
               <w:drawing>
                 <wp:inline distT="0" distR="0" distB="0" distL="0">
                   <wp:extent cx="203200" cy="203200"/>
-                  <wp:docPr id="22" name="Drawing 22" descr="file:/tmp/ViewContainer__48qLIBVIEeetFdz5pzgWAw4981420561559060790.png"/>
+                  <wp:docPr id="22" name="Drawing 22" descr="file:/tmp/ViewContainer__48qLIBVIEeetFdz5pzgWAw9571656690080389050.png"/>
                   <a:graphic xmlns:a="http://schemas.openxmlformats.org/drawingml/2006/main">
                     <a:graphicData uri="http://schemas.openxmlformats.org/drawingml/2006/picture">
                       <pic:pic xmlns:pic="http://schemas.openxmlformats.org/drawingml/2006/picture">
                         <pic:nvPicPr>
-                          <pic:cNvPr id="0" name="Picture 22" descr="file:/tmp/ViewContainer__48qLIBVIEeetFdz5pzgWAw4981420561559060790.png"/>
+                          <pic:cNvPr id="0" name="Picture 22" descr="file:/tmp/ViewContainer__48qLIBVIEeetFdz5pzgWAw9571656690080389050.png"/>
                           <pic:cNvPicPr>
                             <a:picLocks noChangeAspect="true"/>
                           </pic:cNvPicPr>
@@ -22476,12 +22476,12 @@
               <w:drawing>
                 <wp:inline distT="0" distR="0" distB="0" distL="0">
                   <wp:extent cx="203200" cy="203200"/>
-                  <wp:docPr id="23" name="Drawing 23" descr="file:/tmp/ViewContainer__48qLLxVIEeetFdz5pzgWAw2470240556484571616.png"/>
+                  <wp:docPr id="23" name="Drawing 23" descr="file:/tmp/ViewContainer__48qLLxVIEeetFdz5pzgWAw14209577778372088520.png"/>
                   <a:graphic xmlns:a="http://schemas.openxmlformats.org/drawingml/2006/main">
                     <a:graphicData uri="http://schemas.openxmlformats.org/drawingml/2006/picture">
                       <pic:pic xmlns:pic="http://schemas.openxmlformats.org/drawingml/2006/picture">
                         <pic:nvPicPr>
-                          <pic:cNvPr id="0" name="Picture 23" descr="file:/tmp/ViewContainer__48qLLxVIEeetFdz5pzgWAw2470240556484571616.png"/>
+                          <pic:cNvPr id="0" name="Picture 23" descr="file:/tmp/ViewContainer__48qLLxVIEeetFdz5pzgWAw14209577778372088520.png"/>
                           <pic:cNvPicPr>
                             <a:picLocks noChangeAspect="true"/>
                           </pic:cNvPicPr>
@@ -22536,12 +22536,12 @@
               <w:drawing>
                 <wp:inline distT="0" distR="0" distB="0" distL="0">
                   <wp:extent cx="203200" cy="177800"/>
-                  <wp:docPr id="24" name="Drawing 24" descr="file:/tmp/ViewElement__48qLLBVIEeetFdz5pzgWAw16000420206872999462.png"/>
+                  <wp:docPr id="24" name="Drawing 24" descr="file:/tmp/ViewElement__48qLLBVIEeetFdz5pzgWAw4668451497267834756.png"/>
                   <a:graphic xmlns:a="http://schemas.openxmlformats.org/drawingml/2006/main">
                     <a:graphicData uri="http://schemas.openxmlformats.org/drawingml/2006/picture">
                       <pic:pic xmlns:pic="http://schemas.openxmlformats.org/drawingml/2006/picture">
                         <pic:nvPicPr>
-                          <pic:cNvPr id="0" name="Picture 24" descr="file:/tmp/ViewElement__48qLLBVIEeetFdz5pzgWAw16000420206872999462.png"/>
+                          <pic:cNvPr id="0" name="Picture 24" descr="file:/tmp/ViewElement__48qLLBVIEeetFdz5pzgWAw4668451497267834756.png"/>
                           <pic:cNvPicPr>
                             <a:picLocks noChangeAspect="true"/>
                           </pic:cNvPicPr>
@@ -22643,12 +22643,12 @@
               <w:drawing>
                 <wp:inline distT="0" distR="0" distB="0" distL="0">
                   <wp:extent cx="203200" cy="203200"/>
-                  <wp:docPr id="25" name="Drawing 25" descr="file:/tmp/ViewContainer__48qLRRVIEeetFdz5pzgWAw17001092915427342643.png"/>
+                  <wp:docPr id="25" name="Drawing 25" descr="file:/tmp/ViewContainer__48qLRRVIEeetFdz5pzgWAw13772268404854301693.png"/>
                   <a:graphic xmlns:a="http://schemas.openxmlformats.org/drawingml/2006/main">
                     <a:graphicData uri="http://schemas.openxmlformats.org/drawingml/2006/picture">
                       <pic:pic xmlns:pic="http://schemas.openxmlformats.org/drawingml/2006/picture">
                         <pic:nvPicPr>
-                          <pic:cNvPr id="0" name="Picture 25" descr="file:/tmp/ViewContainer__48qLRRVIEeetFdz5pzgWAw17001092915427342643.png"/>
+                          <pic:cNvPr id="0" name="Picture 25" descr="file:/tmp/ViewContainer__48qLRRVIEeetFdz5pzgWAw13772268404854301693.png"/>
                           <pic:cNvPicPr>
                             <a:picLocks noChangeAspect="true"/>
                           </pic:cNvPicPr>
@@ -22703,12 +22703,12 @@
               <w:drawing>
                 <wp:inline distT="0" distR="0" distB="0" distL="0">
                   <wp:extent cx="203200" cy="177800"/>
-                  <wp:docPr id="26" name="Drawing 26" descr="file:/tmp/ViewElement__48qLRxVIEeetFdz5pzgWAw3634249319757339997.png"/>
+                  <wp:docPr id="26" name="Drawing 26" descr="file:/tmp/ViewElement__48qLRxVIEeetFdz5pzgWAw6301490764100725916.png"/>
                   <a:graphic xmlns:a="http://schemas.openxmlformats.org/drawingml/2006/main">
                     <a:graphicData uri="http://schemas.openxmlformats.org/drawingml/2006/picture">
                       <pic:pic xmlns:pic="http://schemas.openxmlformats.org/drawingml/2006/picture">
                         <pic:nvPicPr>
-                          <pic:cNvPr id="0" name="Picture 26" descr="file:/tmp/ViewElement__48qLRxVIEeetFdz5pzgWAw3634249319757339997.png"/>
+                          <pic:cNvPr id="0" name="Picture 26" descr="file:/tmp/ViewElement__48qLRxVIEeetFdz5pzgWAw6301490764100725916.png"/>
                           <pic:cNvPicPr>
                             <a:picLocks noChangeAspect="true"/>
                           </pic:cNvPicPr>
@@ -22763,12 +22763,12 @@
               <w:drawing>
                 <wp:inline distT="0" distR="0" distB="0" distL="0">
                   <wp:extent cx="203200" cy="203200"/>
-                  <wp:docPr id="27" name="Drawing 27" descr="file:/tmp/ViewElement__48qyMBVIEeetFdz5pzgWAw15949297441565367965.png"/>
+                  <wp:docPr id="27" name="Drawing 27" descr="file:/tmp/ViewElement__48qyMBVIEeetFdz5pzgWAw16482381456849494024.png"/>
                   <a:graphic xmlns:a="http://schemas.openxmlformats.org/drawingml/2006/main">
                     <a:graphicData uri="http://schemas.openxmlformats.org/drawingml/2006/picture">
                       <pic:pic xmlns:pic="http://schemas.openxmlformats.org/drawingml/2006/picture">
                         <pic:nvPicPr>
-                          <pic:cNvPr id="0" name="Picture 27" descr="file:/tmp/ViewElement__48qyMBVIEeetFdz5pzgWAw15949297441565367965.png"/>
+                          <pic:cNvPr id="0" name="Picture 27" descr="file:/tmp/ViewElement__48qyMBVIEeetFdz5pzgWAw16482381456849494024.png"/>
                           <pic:cNvPicPr>
                             <a:picLocks noChangeAspect="true"/>
                           </pic:cNvPicPr>
@@ -22823,12 +22823,12 @@
               <w:drawing>
                 <wp:inline distT="0" distR="0" distB="0" distL="0">
                   <wp:extent cx="203200" cy="177800"/>
-                  <wp:docPr id="28" name="Drawing 28" descr="file:/tmp/ViewElement__48qyMhVIEeetFdz5pzgWAw11156659566119111707.png"/>
+                  <wp:docPr id="28" name="Drawing 28" descr="file:/tmp/ViewElement__48qyMhVIEeetFdz5pzgWAw7857738189924401003.png"/>
                   <a:graphic xmlns:a="http://schemas.openxmlformats.org/drawingml/2006/main">
                     <a:graphicData uri="http://schemas.openxmlformats.org/drawingml/2006/picture">
                       <pic:pic xmlns:pic="http://schemas.openxmlformats.org/drawingml/2006/picture">
                         <pic:nvPicPr>
-                          <pic:cNvPr id="0" name="Picture 28" descr="file:/tmp/ViewElement__48qyMhVIEeetFdz5pzgWAw11156659566119111707.png"/>
+                          <pic:cNvPr id="0" name="Picture 28" descr="file:/tmp/ViewElement__48qyMhVIEeetFdz5pzgWAw7857738189924401003.png"/>
                           <pic:cNvPicPr>
                             <a:picLocks noChangeAspect="true"/>
                           </pic:cNvPicPr>
@@ -22883,12 +22883,12 @@
               <w:drawing>
                 <wp:inline distT="0" distR="0" distB="0" distL="0">
                   <wp:extent cx="203200" cy="190500"/>
-                  <wp:docPr id="29" name="Drawing 29" descr="file:/tmp/ViewElement__48qyNBVIEeetFdz5pzgWAw17124269529029826541.png"/>
+                  <wp:docPr id="29" name="Drawing 29" descr="file:/tmp/ViewElement__48qyNBVIEeetFdz5pzgWAw8526482828279546856.png"/>
                   <a:graphic xmlns:a="http://schemas.openxmlformats.org/drawingml/2006/main">
                     <a:graphicData uri="http://schemas.openxmlformats.org/drawingml/2006/picture">
                       <pic:pic xmlns:pic="http://schemas.openxmlformats.org/drawingml/2006/picture">
                         <pic:nvPicPr>
-                          <pic:cNvPr id="0" name="Picture 29" descr="file:/tmp/ViewElement__48qyNBVIEeetFdz5pzgWAw17124269529029826541.png"/>
+                          <pic:cNvPr id="0" name="Picture 29" descr="file:/tmp/ViewElement__48qyNBVIEeetFdz5pzgWAw8526482828279546856.png"/>
                           <pic:cNvPicPr>
                             <a:picLocks noChangeAspect="true"/>
                           </pic:cNvPicPr>
@@ -22943,12 +22943,12 @@
               <w:drawing>
                 <wp:inline distT="0" distR="0" distB="0" distL="0">
                   <wp:extent cx="203200" cy="190500"/>
-                  <wp:docPr id="30" name="Drawing 30" descr="file:/tmp/ViewElement__48qyOBVIEeetFdz5pzgWAw8386266495909962100.png"/>
+                  <wp:docPr id="30" name="Drawing 30" descr="file:/tmp/ViewElement__48qyOBVIEeetFdz5pzgWAw7350554893706284055.png"/>
                   <a:graphic xmlns:a="http://schemas.openxmlformats.org/drawingml/2006/main">
                     <a:graphicData uri="http://schemas.openxmlformats.org/drawingml/2006/picture">
                       <pic:pic xmlns:pic="http://schemas.openxmlformats.org/drawingml/2006/picture">
                         <pic:nvPicPr>
-                          <pic:cNvPr id="0" name="Picture 30" descr="file:/tmp/ViewElement__48qyOBVIEeetFdz5pzgWAw8386266495909962100.png"/>
+                          <pic:cNvPr id="0" name="Picture 30" descr="file:/tmp/ViewElement__48qyOBVIEeetFdz5pzgWAw7350554893706284055.png"/>
                           <pic:cNvPicPr>
                             <a:picLocks noChangeAspect="true"/>
                           </pic:cNvPicPr>
@@ -23050,12 +23050,12 @@
               <w:drawing>
                 <wp:inline distT="0" distR="0" distB="0" distL="0">
                   <wp:extent cx="203200" cy="203200"/>
-                  <wp:docPr id="31" name="Drawing 31" descr="file:/tmp/ViewContainer__48gaJBVIEeetFdz5pzgWAw1989786519872882759.png"/>
+                  <wp:docPr id="31" name="Drawing 31" descr="file:/tmp/ViewContainer__48gaJBVIEeetFdz5pzgWAw4955847409721672845.png"/>
                   <a:graphic xmlns:a="http://schemas.openxmlformats.org/drawingml/2006/main">
                     <a:graphicData uri="http://schemas.openxmlformats.org/drawingml/2006/picture">
                       <pic:pic xmlns:pic="http://schemas.openxmlformats.org/drawingml/2006/picture">
                         <pic:nvPicPr>
-                          <pic:cNvPr id="0" name="Picture 31" descr="file:/tmp/ViewContainer__48gaJBVIEeetFdz5pzgWAw1989786519872882759.png"/>
+                          <pic:cNvPr id="0" name="Picture 31" descr="file:/tmp/ViewContainer__48gaJBVIEeetFdz5pzgWAw4955847409721672845.png"/>
                           <pic:cNvPicPr>
                             <a:picLocks noChangeAspect="true"/>
                           </pic:cNvPicPr>
@@ -23110,12 +23110,12 @@
               <w:drawing>
                 <wp:inline distT="0" distR="0" distB="0" distL="0">
                   <wp:extent cx="203200" cy="203200"/>
-                  <wp:docPr id="32" name="Drawing 32" descr="file:/tmp/ViewContainer__48jdcBVIEeetFdz5pzgWAw8971646848075081010.png"/>
+                  <wp:docPr id="32" name="Drawing 32" descr="file:/tmp/ViewContainer__48jdcBVIEeetFdz5pzgWAw2786862132433838512.png"/>
                   <a:graphic xmlns:a="http://schemas.openxmlformats.org/drawingml/2006/main">
                     <a:graphicData uri="http://schemas.openxmlformats.org/drawingml/2006/picture">
                       <pic:pic xmlns:pic="http://schemas.openxmlformats.org/drawingml/2006/picture">
                         <pic:nvPicPr>
-                          <pic:cNvPr id="0" name="Picture 32" descr="file:/tmp/ViewContainer__48jdcBVIEeetFdz5pzgWAw8971646848075081010.png"/>
+                          <pic:cNvPr id="0" name="Picture 32" descr="file:/tmp/ViewContainer__48jdcBVIEeetFdz5pzgWAw2786862132433838512.png"/>
                           <pic:cNvPicPr>
                             <a:picLocks noChangeAspect="true"/>
                           </pic:cNvPicPr>
@@ -23170,12 +23170,12 @@
               <w:drawing>
                 <wp:inline distT="0" distR="0" distB="0" distL="0">
                   <wp:extent cx="203200" cy="203200"/>
-                  <wp:docPr id="33" name="Drawing 33" descr="file:/tmp/ViewContainer__48qLIBVIEeetFdz5pzgWAw2182143249353881776.png"/>
+                  <wp:docPr id="33" name="Drawing 33" descr="file:/tmp/ViewContainer__48qLIBVIEeetFdz5pzgWAw5689440058726802599.png"/>
                   <a:graphic xmlns:a="http://schemas.openxmlformats.org/drawingml/2006/main">
                     <a:graphicData uri="http://schemas.openxmlformats.org/drawingml/2006/picture">
                       <pic:pic xmlns:pic="http://schemas.openxmlformats.org/drawingml/2006/picture">
                         <pic:nvPicPr>
-                          <pic:cNvPr id="0" name="Picture 33" descr="file:/tmp/ViewContainer__48qLIBVIEeetFdz5pzgWAw2182143249353881776.png"/>
+                          <pic:cNvPr id="0" name="Picture 33" descr="file:/tmp/ViewContainer__48qLIBVIEeetFdz5pzgWAw5689440058726802599.png"/>
                           <pic:cNvPicPr>
                             <a:picLocks noChangeAspect="true"/>
                           </pic:cNvPicPr>
@@ -23230,12 +23230,12 @@
               <w:drawing>
                 <wp:inline distT="0" distR="0" distB="0" distL="0">
                   <wp:extent cx="203200" cy="203200"/>
-                  <wp:docPr id="34" name="Drawing 34" descr="file:/tmp/ViewContainer__48qLLxVIEeetFdz5pzgWAw2993624666611948614.png"/>
+                  <wp:docPr id="34" name="Drawing 34" descr="file:/tmp/ViewContainer__48qLLxVIEeetFdz5pzgWAw3776599039484580170.png"/>
                   <a:graphic xmlns:a="http://schemas.openxmlformats.org/drawingml/2006/main">
                     <a:graphicData uri="http://schemas.openxmlformats.org/drawingml/2006/picture">
                       <pic:pic xmlns:pic="http://schemas.openxmlformats.org/drawingml/2006/picture">
                         <pic:nvPicPr>
-                          <pic:cNvPr id="0" name="Picture 34" descr="file:/tmp/ViewContainer__48qLLxVIEeetFdz5pzgWAw2993624666611948614.png"/>
+                          <pic:cNvPr id="0" name="Picture 34" descr="file:/tmp/ViewContainer__48qLLxVIEeetFdz5pzgWAw3776599039484580170.png"/>
                           <pic:cNvPicPr>
                             <a:picLocks noChangeAspect="true"/>
                           </pic:cNvPicPr>
@@ -23290,12 +23290,12 @@
               <w:drawing>
                 <wp:inline distT="0" distR="0" distB="0" distL="0">
                   <wp:extent cx="203200" cy="177800"/>
-                  <wp:docPr id="35" name="Drawing 35" descr="file:/tmp/ViewElement__48qLLBVIEeetFdz5pzgWAw13965493424913402775.png"/>
+                  <wp:docPr id="35" name="Drawing 35" descr="file:/tmp/ViewElement__48qLLBVIEeetFdz5pzgWAw2435479564110338868.png"/>
                   <a:graphic xmlns:a="http://schemas.openxmlformats.org/drawingml/2006/main">
                     <a:graphicData uri="http://schemas.openxmlformats.org/drawingml/2006/picture">
                       <pic:pic xmlns:pic="http://schemas.openxmlformats.org/drawingml/2006/picture">
                         <pic:nvPicPr>
-                          <pic:cNvPr id="0" name="Picture 35" descr="file:/tmp/ViewElement__48qLLBVIEeetFdz5pzgWAw13965493424913402775.png"/>
+                          <pic:cNvPr id="0" name="Picture 35" descr="file:/tmp/ViewElement__48qLLBVIEeetFdz5pzgWAw2435479564110338868.png"/>
                           <pic:cNvPicPr>
                             <a:picLocks noChangeAspect="true"/>
                           </pic:cNvPicPr>
@@ -23397,12 +23397,12 @@
               <w:drawing>
                 <wp:inline distT="0" distR="0" distB="0" distL="0">
                   <wp:extent cx="203200" cy="203200"/>
-                  <wp:docPr id="36" name="Drawing 36" descr="file:/tmp/ViewContainer__48jdcBVIEeetFdz5pzgWAw11334277363925259317.png"/>
+                  <wp:docPr id="36" name="Drawing 36" descr="file:/tmp/ViewContainer__48jdcBVIEeetFdz5pzgWAw11904403308819352786.png"/>
                   <a:graphic xmlns:a="http://schemas.openxmlformats.org/drawingml/2006/main">
                     <a:graphicData uri="http://schemas.openxmlformats.org/drawingml/2006/picture">
                       <pic:pic xmlns:pic="http://schemas.openxmlformats.org/drawingml/2006/picture">
                         <pic:nvPicPr>
-                          <pic:cNvPr id="0" name="Picture 36" descr="file:/tmp/ViewContainer__48jdcBVIEeetFdz5pzgWAw11334277363925259317.png"/>
+                          <pic:cNvPr id="0" name="Picture 36" descr="file:/tmp/ViewContainer__48jdcBVIEeetFdz5pzgWAw11904403308819352786.png"/>
                           <pic:cNvPicPr>
                             <a:picLocks noChangeAspect="true"/>
                           </pic:cNvPicPr>
@@ -23457,12 +23457,12 @@
               <w:drawing>
                 <wp:inline distT="0" distR="0" distB="0" distL="0">
                   <wp:extent cx="203200" cy="190500"/>
-                  <wp:docPr id="37" name="Drawing 37" descr="file:/tmp/ViewElement__48jdchVIEeetFdz5pzgWAw3205550766330513007.png"/>
+                  <wp:docPr id="37" name="Drawing 37" descr="file:/tmp/ViewElement__48jdchVIEeetFdz5pzgWAw15115315975661045202.png"/>
                   <a:graphic xmlns:a="http://schemas.openxmlformats.org/drawingml/2006/main">
                     <a:graphicData uri="http://schemas.openxmlformats.org/drawingml/2006/picture">
                       <pic:pic xmlns:pic="http://schemas.openxmlformats.org/drawingml/2006/picture">
                         <pic:nvPicPr>
-                          <pic:cNvPr id="0" name="Picture 37" descr="file:/tmp/ViewElement__48jdchVIEeetFdz5pzgWAw3205550766330513007.png"/>
+                          <pic:cNvPr id="0" name="Picture 37" descr="file:/tmp/ViewElement__48jdchVIEeetFdz5pzgWAw15115315975661045202.png"/>
                           <pic:cNvPicPr>
                             <a:picLocks noChangeAspect="true"/>
                           </pic:cNvPicPr>
@@ -23517,12 +23517,12 @@
               <w:drawing>
                 <wp:inline distT="0" distR="0" distB="0" distL="0">
                   <wp:extent cx="203200" cy="190500"/>
-                  <wp:docPr id="38" name="Drawing 38" descr="file:/tmp/ViewElement__48jddBVIEeetFdz5pzgWAw5292431979156140475.png"/>
+                  <wp:docPr id="38" name="Drawing 38" descr="file:/tmp/ViewElement__48jddBVIEeetFdz5pzgWAw9124664081706332563.png"/>
                   <a:graphic xmlns:a="http://schemas.openxmlformats.org/drawingml/2006/main">
                     <a:graphicData uri="http://schemas.openxmlformats.org/drawingml/2006/picture">
                       <pic:pic xmlns:pic="http://schemas.openxmlformats.org/drawingml/2006/picture">
                         <pic:nvPicPr>
-                          <pic:cNvPr id="0" name="Picture 38" descr="file:/tmp/ViewElement__48jddBVIEeetFdz5pzgWAw5292431979156140475.png"/>
+                          <pic:cNvPr id="0" name="Picture 38" descr="file:/tmp/ViewElement__48jddBVIEeetFdz5pzgWAw9124664081706332563.png"/>
                           <pic:cNvPicPr>
                             <a:picLocks noChangeAspect="true"/>
                           </pic:cNvPicPr>
@@ -23577,12 +23577,12 @@
               <w:drawing>
                 <wp:inline distT="0" distR="0" distB="0" distL="0">
                   <wp:extent cx="203200" cy="177800"/>
-                  <wp:docPr id="39" name="Drawing 39" descr="file:/tmp/ViewElement__48jddhVIEeetFdz5pzgWAw1423926008512154495.png"/>
+                  <wp:docPr id="39" name="Drawing 39" descr="file:/tmp/ViewElement__48jddhVIEeetFdz5pzgWAw8371723256273699260.png"/>
                   <a:graphic xmlns:a="http://schemas.openxmlformats.org/drawingml/2006/main">
                     <a:graphicData uri="http://schemas.openxmlformats.org/drawingml/2006/picture">
                       <pic:pic xmlns:pic="http://schemas.openxmlformats.org/drawingml/2006/picture">
                         <pic:nvPicPr>
-                          <pic:cNvPr id="0" name="Picture 39" descr="file:/tmp/ViewElement__48jddhVIEeetFdz5pzgWAw1423926008512154495.png"/>
+                          <pic:cNvPr id="0" name="Picture 39" descr="file:/tmp/ViewElement__48jddhVIEeetFdz5pzgWAw8371723256273699260.png"/>
                           <pic:cNvPicPr>
                             <a:picLocks noChangeAspect="true"/>
                           </pic:cNvPicPr>
@@ -23637,12 +23637,12 @@
               <w:drawing>
                 <wp:inline distT="0" distR="0" distB="0" distL="0">
                   <wp:extent cx="203200" cy="190500"/>
-                  <wp:docPr id="40" name="Drawing 40" descr="file:/tmp/ViewElement__48jdeBVIEeetFdz5pzgWAw12096986594521713914.png"/>
+                  <wp:docPr id="40" name="Drawing 40" descr="file:/tmp/ViewElement__48jdeBVIEeetFdz5pzgWAw17601000385118820140.png"/>
                   <a:graphic xmlns:a="http://schemas.openxmlformats.org/drawingml/2006/main">
                     <a:graphicData uri="http://schemas.openxmlformats.org/drawingml/2006/picture">
                       <pic:pic xmlns:pic="http://schemas.openxmlformats.org/drawingml/2006/picture">
                         <pic:nvPicPr>
-                          <pic:cNvPr id="0" name="Picture 40" descr="file:/tmp/ViewElement__48jdeBVIEeetFdz5pzgWAw12096986594521713914.png"/>
+                          <pic:cNvPr id="0" name="Picture 40" descr="file:/tmp/ViewElement__48jdeBVIEeetFdz5pzgWAw17601000385118820140.png"/>
                           <pic:cNvPicPr>
                             <a:picLocks noChangeAspect="true"/>
                           </pic:cNvPicPr>
@@ -23744,12 +23744,12 @@
               <w:drawing>
                 <wp:inline distT="0" distR="0" distB="0" distL="0">
                   <wp:extent cx="203200" cy="203200"/>
-                  <wp:docPr id="41" name="Drawing 41" descr="file:/tmp/ViewContainer__48qLIBVIEeetFdz5pzgWAw6812335369467113674.png"/>
+                  <wp:docPr id="41" name="Drawing 41" descr="file:/tmp/ViewContainer__48qLIBVIEeetFdz5pzgWAw12389570091919535173.png"/>
                   <a:graphic xmlns:a="http://schemas.openxmlformats.org/drawingml/2006/main">
                     <a:graphicData uri="http://schemas.openxmlformats.org/drawingml/2006/picture">
                       <pic:pic xmlns:pic="http://schemas.openxmlformats.org/drawingml/2006/picture">
                         <pic:nvPicPr>
-                          <pic:cNvPr id="0" name="Picture 41" descr="file:/tmp/ViewContainer__48qLIBVIEeetFdz5pzgWAw6812335369467113674.png"/>
+                          <pic:cNvPr id="0" name="Picture 41" descr="file:/tmp/ViewContainer__48qLIBVIEeetFdz5pzgWAw12389570091919535173.png"/>
                           <pic:cNvPicPr>
                             <a:picLocks noChangeAspect="true"/>
                           </pic:cNvPicPr>
@@ -23804,12 +23804,12 @@
               <w:drawing>
                 <wp:inline distT="0" distR="0" distB="0" distL="0">
                   <wp:extent cx="203200" cy="190500"/>
-                  <wp:docPr id="42" name="Drawing 42" descr="file:/tmp/ViewElement__48qLIhVIEeetFdz5pzgWAw5441020397193791578.png"/>
+                  <wp:docPr id="42" name="Drawing 42" descr="file:/tmp/ViewElement__48qLIhVIEeetFdz5pzgWAw4876711506841308797.png"/>
                   <a:graphic xmlns:a="http://schemas.openxmlformats.org/drawingml/2006/main">
                     <a:graphicData uri="http://schemas.openxmlformats.org/drawingml/2006/picture">
                       <pic:pic xmlns:pic="http://schemas.openxmlformats.org/drawingml/2006/picture">
                         <pic:nvPicPr>
-                          <pic:cNvPr id="0" name="Picture 42" descr="file:/tmp/ViewElement__48qLIhVIEeetFdz5pzgWAw5441020397193791578.png"/>
+                          <pic:cNvPr id="0" name="Picture 42" descr="file:/tmp/ViewElement__48qLIhVIEeetFdz5pzgWAw4876711506841308797.png"/>
                           <pic:cNvPicPr>
                             <a:picLocks noChangeAspect="true"/>
                           </pic:cNvPicPr>
@@ -23864,12 +23864,12 @@
               <w:drawing>
                 <wp:inline distT="0" distR="0" distB="0" distL="0">
                   <wp:extent cx="203200" cy="190500"/>
-                  <wp:docPr id="43" name="Drawing 43" descr="file:/tmp/ViewElement__48qLJBVIEeetFdz5pzgWAw1060081422236175899.png"/>
+                  <wp:docPr id="43" name="Drawing 43" descr="file:/tmp/ViewElement__48qLJBVIEeetFdz5pzgWAw11365389658015402706.png"/>
                   <a:graphic xmlns:a="http://schemas.openxmlformats.org/drawingml/2006/main">
                     <a:graphicData uri="http://schemas.openxmlformats.org/drawingml/2006/picture">
                       <pic:pic xmlns:pic="http://schemas.openxmlformats.org/drawingml/2006/picture">
                         <pic:nvPicPr>
-                          <pic:cNvPr id="0" name="Picture 43" descr="file:/tmp/ViewElement__48qLJBVIEeetFdz5pzgWAw1060081422236175899.png"/>
+                          <pic:cNvPr id="0" name="Picture 43" descr="file:/tmp/ViewElement__48qLJBVIEeetFdz5pzgWAw11365389658015402706.png"/>
                           <pic:cNvPicPr>
                             <a:picLocks noChangeAspect="true"/>
                           </pic:cNvPicPr>
@@ -23924,12 +23924,12 @@
               <w:drawing>
                 <wp:inline distT="0" distR="0" distB="0" distL="0">
                   <wp:extent cx="203200" cy="190500"/>
-                  <wp:docPr id="44" name="Drawing 44" descr="file:/tmp/ViewElement__48qLJhVIEeetFdz5pzgWAw12195297123182887082.png"/>
+                  <wp:docPr id="44" name="Drawing 44" descr="file:/tmp/ViewElement__48qLJhVIEeetFdz5pzgWAw821557855510787712.png"/>
                   <a:graphic xmlns:a="http://schemas.openxmlformats.org/drawingml/2006/main">
                     <a:graphicData uri="http://schemas.openxmlformats.org/drawingml/2006/picture">
                       <pic:pic xmlns:pic="http://schemas.openxmlformats.org/drawingml/2006/picture">
                         <pic:nvPicPr>
-                          <pic:cNvPr id="0" name="Picture 44" descr="file:/tmp/ViewElement__48qLJhVIEeetFdz5pzgWAw12195297123182887082.png"/>
+                          <pic:cNvPr id="0" name="Picture 44" descr="file:/tmp/ViewElement__48qLJhVIEeetFdz5pzgWAw821557855510787712.png"/>
                           <pic:cNvPicPr>
                             <a:picLocks noChangeAspect="true"/>
                           </pic:cNvPicPr>
@@ -23984,12 +23984,12 @@
               <w:drawing>
                 <wp:inline distT="0" distR="0" distB="0" distL="0">
                   <wp:extent cx="203200" cy="177800"/>
-                  <wp:docPr id="45" name="Drawing 45" descr="file:/tmp/ViewElement__48qLKBVIEeetFdz5pzgWAw15095945313471581228.png"/>
+                  <wp:docPr id="45" name="Drawing 45" descr="file:/tmp/ViewElement__48qLKBVIEeetFdz5pzgWAw15470396449027975086.png"/>
                   <a:graphic xmlns:a="http://schemas.openxmlformats.org/drawingml/2006/main">
                     <a:graphicData uri="http://schemas.openxmlformats.org/drawingml/2006/picture">
                       <pic:pic xmlns:pic="http://schemas.openxmlformats.org/drawingml/2006/picture">
                         <pic:nvPicPr>
-                          <pic:cNvPr id="0" name="Picture 45" descr="file:/tmp/ViewElement__48qLKBVIEeetFdz5pzgWAw15095945313471581228.png"/>
+                          <pic:cNvPr id="0" name="Picture 45" descr="file:/tmp/ViewElement__48qLKBVIEeetFdz5pzgWAw15470396449027975086.png"/>
                           <pic:cNvPicPr>
                             <a:picLocks noChangeAspect="true"/>
                           </pic:cNvPicPr>
@@ -24091,12 +24091,12 @@
               <w:drawing>
                 <wp:inline distT="0" distR="0" distB="0" distL="0">
                   <wp:extent cx="203200" cy="203200"/>
-                  <wp:docPr id="46" name="Drawing 46" descr="file:/tmp/ViewContainer__48qLLxVIEeetFdz5pzgWAw4540089721807842812.png"/>
+                  <wp:docPr id="46" name="Drawing 46" descr="file:/tmp/ViewContainer__48qLLxVIEeetFdz5pzgWAw1384555128335762404.png"/>
                   <a:graphic xmlns:a="http://schemas.openxmlformats.org/drawingml/2006/main">
                     <a:graphicData uri="http://schemas.openxmlformats.org/drawingml/2006/picture">
                       <pic:pic xmlns:pic="http://schemas.openxmlformats.org/drawingml/2006/picture">
                         <pic:nvPicPr>
-                          <pic:cNvPr id="0" name="Picture 46" descr="file:/tmp/ViewContainer__48qLLxVIEeetFdz5pzgWAw4540089721807842812.png"/>
+                          <pic:cNvPr id="0" name="Picture 46" descr="file:/tmp/ViewContainer__48qLLxVIEeetFdz5pzgWAw1384555128335762404.png"/>
                           <pic:cNvPicPr>
                             <a:picLocks noChangeAspect="true"/>
                           </pic:cNvPicPr>
@@ -24151,12 +24151,12 @@
               <w:drawing>
                 <wp:inline distT="0" distR="0" distB="0" distL="0">
                   <wp:extent cx="203200" cy="203200"/>
-                  <wp:docPr id="47" name="Drawing 47" descr="file:/tmp/ViewContainer__48qLMRVIEeetFdz5pzgWAw10389678464156520121.png"/>
+                  <wp:docPr id="47" name="Drawing 47" descr="file:/tmp/ViewContainer__48qLMRVIEeetFdz5pzgWAw5995480480664615876.png"/>
                   <a:graphic xmlns:a="http://schemas.openxmlformats.org/drawingml/2006/main">
                     <a:graphicData uri="http://schemas.openxmlformats.org/drawingml/2006/picture">
                       <pic:pic xmlns:pic="http://schemas.openxmlformats.org/drawingml/2006/picture">
                         <pic:nvPicPr>
-                          <pic:cNvPr id="0" name="Picture 47" descr="file:/tmp/ViewContainer__48qLMRVIEeetFdz5pzgWAw10389678464156520121.png"/>
+                          <pic:cNvPr id="0" name="Picture 47" descr="file:/tmp/ViewContainer__48qLMRVIEeetFdz5pzgWAw5995480480664615876.png"/>
                           <pic:cNvPicPr>
                             <a:picLocks noChangeAspect="true"/>
                           </pic:cNvPicPr>
@@ -24211,12 +24211,12 @@
               <w:drawing>
                 <wp:inline distT="0" distR="0" distB="0" distL="0">
                   <wp:extent cx="203200" cy="190500"/>
-                  <wp:docPr id="48" name="Drawing 48" descr="file:/tmp/ViewElement__48qLPxVIEeetFdz5pzgWAw715354606584276310.png"/>
+                  <wp:docPr id="48" name="Drawing 48" descr="file:/tmp/ViewElement__48qLPxVIEeetFdz5pzgWAw5098833784020403041.png"/>
                   <a:graphic xmlns:a="http://schemas.openxmlformats.org/drawingml/2006/main">
                     <a:graphicData uri="http://schemas.openxmlformats.org/drawingml/2006/picture">
                       <pic:pic xmlns:pic="http://schemas.openxmlformats.org/drawingml/2006/picture">
                         <pic:nvPicPr>
-                          <pic:cNvPr id="0" name="Picture 48" descr="file:/tmp/ViewElement__48qLPxVIEeetFdz5pzgWAw715354606584276310.png"/>
+                          <pic:cNvPr id="0" name="Picture 48" descr="file:/tmp/ViewElement__48qLPxVIEeetFdz5pzgWAw5098833784020403041.png"/>
                           <pic:cNvPicPr>
                             <a:picLocks noChangeAspect="true"/>
                           </pic:cNvPicPr>
@@ -24318,12 +24318,12 @@
               <w:drawing>
                 <wp:inline distT="0" distR="0" distB="0" distL="0">
                   <wp:extent cx="203200" cy="203200"/>
-                  <wp:docPr id="49" name="Drawing 49" descr="file:/tmp/ViewContainer__48qLMRVIEeetFdz5pzgWAw14813556707818446984.png"/>
+                  <wp:docPr id="49" name="Drawing 49" descr="file:/tmp/ViewContainer__48qLMRVIEeetFdz5pzgWAw17635141302440091888.png"/>
                   <a:graphic xmlns:a="http://schemas.openxmlformats.org/drawingml/2006/main">
                     <a:graphicData uri="http://schemas.openxmlformats.org/drawingml/2006/picture">
                       <pic:pic xmlns:pic="http://schemas.openxmlformats.org/drawingml/2006/picture">
                         <pic:nvPicPr>
-                          <pic:cNvPr id="0" name="Picture 49" descr="file:/tmp/ViewContainer__48qLMRVIEeetFdz5pzgWAw14813556707818446984.png"/>
+                          <pic:cNvPr id="0" name="Picture 49" descr="file:/tmp/ViewContainer__48qLMRVIEeetFdz5pzgWAw17635141302440091888.png"/>
                           <pic:cNvPicPr>
                             <a:picLocks noChangeAspect="true"/>
                           </pic:cNvPicPr>
@@ -24378,12 +24378,12 @@
               <w:drawing>
                 <wp:inline distT="0" distR="0" distB="0" distL="0">
                   <wp:extent cx="203200" cy="190500"/>
-                  <wp:docPr id="50" name="Drawing 50" descr="file:/tmp/ViewElement__48qLMxVIEeetFdz5pzgWAw14456814438461675351.png"/>
+                  <wp:docPr id="50" name="Drawing 50" descr="file:/tmp/ViewElement__48qLMxVIEeetFdz5pzgWAw16434290599648923074.png"/>
                   <a:graphic xmlns:a="http://schemas.openxmlformats.org/drawingml/2006/main">
                     <a:graphicData uri="http://schemas.openxmlformats.org/drawingml/2006/picture">
                       <pic:pic xmlns:pic="http://schemas.openxmlformats.org/drawingml/2006/picture">
                         <pic:nvPicPr>
-                          <pic:cNvPr id="0" name="Picture 50" descr="file:/tmp/ViewElement__48qLMxVIEeetFdz5pzgWAw14456814438461675351.png"/>
+                          <pic:cNvPr id="0" name="Picture 50" descr="file:/tmp/ViewElement__48qLMxVIEeetFdz5pzgWAw16434290599648923074.png"/>
                           <pic:cNvPicPr>
                             <a:picLocks noChangeAspect="true"/>
                           </pic:cNvPicPr>
@@ -24438,12 +24438,12 @@
               <w:drawing>
                 <wp:inline distT="0" distR="0" distB="0" distL="0">
                   <wp:extent cx="203200" cy="190500"/>
-                  <wp:docPr id="51" name="Drawing 51" descr="file:/tmp/ViewElement__48qLNRVIEeetFdz5pzgWAw9642978183332711606.png"/>
+                  <wp:docPr id="51" name="Drawing 51" descr="file:/tmp/ViewElement__48qLNRVIEeetFdz5pzgWAw17057361181224538979.png"/>
                   <a:graphic xmlns:a="http://schemas.openxmlformats.org/drawingml/2006/main">
                     <a:graphicData uri="http://schemas.openxmlformats.org/drawingml/2006/picture">
                       <pic:pic xmlns:pic="http://schemas.openxmlformats.org/drawingml/2006/picture">
                         <pic:nvPicPr>
-                          <pic:cNvPr id="0" name="Picture 51" descr="file:/tmp/ViewElement__48qLNRVIEeetFdz5pzgWAw9642978183332711606.png"/>
+                          <pic:cNvPr id="0" name="Picture 51" descr="file:/tmp/ViewElement__48qLNRVIEeetFdz5pzgWAw17057361181224538979.png"/>
                           <pic:cNvPicPr>
                             <a:picLocks noChangeAspect="true"/>
                           </pic:cNvPicPr>
@@ -24498,12 +24498,12 @@
               <w:drawing>
                 <wp:inline distT="0" distR="0" distB="0" distL="0">
                   <wp:extent cx="203200" cy="190500"/>
-                  <wp:docPr id="52" name="Drawing 52" descr="file:/tmp/ViewElement__48qLNxVIEeetFdz5pzgWAw14048251673816449388.png"/>
+                  <wp:docPr id="52" name="Drawing 52" descr="file:/tmp/ViewElement__48qLNxVIEeetFdz5pzgWAw7967188688832488828.png"/>
                   <a:graphic xmlns:a="http://schemas.openxmlformats.org/drawingml/2006/main">
                     <a:graphicData uri="http://schemas.openxmlformats.org/drawingml/2006/picture">
                       <pic:pic xmlns:pic="http://schemas.openxmlformats.org/drawingml/2006/picture">
                         <pic:nvPicPr>
-                          <pic:cNvPr id="0" name="Picture 52" descr="file:/tmp/ViewElement__48qLNxVIEeetFdz5pzgWAw14048251673816449388.png"/>
+                          <pic:cNvPr id="0" name="Picture 52" descr="file:/tmp/ViewElement__48qLNxVIEeetFdz5pzgWAw7967188688832488828.png"/>
                           <pic:cNvPicPr>
                             <a:picLocks noChangeAspect="true"/>
                           </pic:cNvPicPr>
@@ -24558,12 +24558,12 @@
               <w:drawing>
                 <wp:inline distT="0" distR="0" distB="0" distL="0">
                   <wp:extent cx="203200" cy="177800"/>
-                  <wp:docPr id="53" name="Drawing 53" descr="file:/tmp/ViewElement__48qLORVIEeetFdz5pzgWAw12386150979555913277.png"/>
+                  <wp:docPr id="53" name="Drawing 53" descr="file:/tmp/ViewElement__48qLORVIEeetFdz5pzgWAw15895339844584063153.png"/>
                   <a:graphic xmlns:a="http://schemas.openxmlformats.org/drawingml/2006/main">
                     <a:graphicData uri="http://schemas.openxmlformats.org/drawingml/2006/picture">
                       <pic:pic xmlns:pic="http://schemas.openxmlformats.org/drawingml/2006/picture">
                         <pic:nvPicPr>
-                          <pic:cNvPr id="0" name="Picture 53" descr="file:/tmp/ViewElement__48qLORVIEeetFdz5pzgWAw12386150979555913277.png"/>
+                          <pic:cNvPr id="0" name="Picture 53" descr="file:/tmp/ViewElement__48qLORVIEeetFdz5pzgWAw15895339844584063153.png"/>
                           <pic:cNvPicPr>
                             <a:picLocks noChangeAspect="true"/>
                           </pic:cNvPicPr>
@@ -24618,12 +24618,12 @@
               <w:drawing>
                 <wp:inline distT="0" distR="0" distB="0" distL="0">
                   <wp:extent cx="203200" cy="190500"/>
-                  <wp:docPr id="54" name="Drawing 54" descr="file:/tmp/ViewElement__48qLOxVIEeetFdz5pzgWAw3394503358870393793.png"/>
+                  <wp:docPr id="54" name="Drawing 54" descr="file:/tmp/ViewElement__48qLOxVIEeetFdz5pzgWAw11068827040834006870.png"/>
                   <a:graphic xmlns:a="http://schemas.openxmlformats.org/drawingml/2006/main">
                     <a:graphicData uri="http://schemas.openxmlformats.org/drawingml/2006/picture">
                       <pic:pic xmlns:pic="http://schemas.openxmlformats.org/drawingml/2006/picture">
                         <pic:nvPicPr>
-                          <pic:cNvPr id="0" name="Picture 54" descr="file:/tmp/ViewElement__48qLOxVIEeetFdz5pzgWAw3394503358870393793.png"/>
+                          <pic:cNvPr id="0" name="Picture 54" descr="file:/tmp/ViewElement__48qLOxVIEeetFdz5pzgWAw11068827040834006870.png"/>
                           <pic:cNvPicPr>
                             <a:picLocks noChangeAspect="true"/>
                           </pic:cNvPicPr>
@@ -24725,12 +24725,12 @@
               <w:drawing>
                 <wp:inline distT="0" distR="0" distB="0" distL="0">
                   <wp:extent cx="203200" cy="203200"/>
-                  <wp:docPr id="55" name="Drawing 55" descr="file:/tmp/ViewContainer__48qLRRVIEeetFdz5pzgWAw5609500659465200396.png"/>
+                  <wp:docPr id="55" name="Drawing 55" descr="file:/tmp/ViewContainer__48qLRRVIEeetFdz5pzgWAw13785509907599647283.png"/>
                   <a:graphic xmlns:a="http://schemas.openxmlformats.org/drawingml/2006/main">
                     <a:graphicData uri="http://schemas.openxmlformats.org/drawingml/2006/picture">
                       <pic:pic xmlns:pic="http://schemas.openxmlformats.org/drawingml/2006/picture">
                         <pic:nvPicPr>
-                          <pic:cNvPr id="0" name="Picture 55" descr="file:/tmp/ViewContainer__48qLRRVIEeetFdz5pzgWAw5609500659465200396.png"/>
+                          <pic:cNvPr id="0" name="Picture 55" descr="file:/tmp/ViewContainer__48qLRRVIEeetFdz5pzgWAw13785509907599647283.png"/>
                           <pic:cNvPicPr>
                             <a:picLocks noChangeAspect="true"/>
                           </pic:cNvPicPr>
@@ -24785,12 +24785,12 @@
               <w:drawing>
                 <wp:inline distT="0" distR="0" distB="0" distL="0">
                   <wp:extent cx="203200" cy="177800"/>
-                  <wp:docPr id="56" name="Drawing 56" descr="file:/tmp/ViewElement__48qLRxVIEeetFdz5pzgWAw4939686700404657910.png"/>
+                  <wp:docPr id="56" name="Drawing 56" descr="file:/tmp/ViewElement__48qLRxVIEeetFdz5pzgWAw17922335395346809387.png"/>
                   <a:graphic xmlns:a="http://schemas.openxmlformats.org/drawingml/2006/main">
                     <a:graphicData uri="http://schemas.openxmlformats.org/drawingml/2006/picture">
                       <pic:pic xmlns:pic="http://schemas.openxmlformats.org/drawingml/2006/picture">
                         <pic:nvPicPr>
-                          <pic:cNvPr id="0" name="Picture 56" descr="file:/tmp/ViewElement__48qLRxVIEeetFdz5pzgWAw4939686700404657910.png"/>
+                          <pic:cNvPr id="0" name="Picture 56" descr="file:/tmp/ViewElement__48qLRxVIEeetFdz5pzgWAw17922335395346809387.png"/>
                           <pic:cNvPicPr>
                             <a:picLocks noChangeAspect="true"/>
                           </pic:cNvPicPr>
@@ -24845,12 +24845,12 @@
               <w:drawing>
                 <wp:inline distT="0" distR="0" distB="0" distL="0">
                   <wp:extent cx="203200" cy="203200"/>
-                  <wp:docPr id="57" name="Drawing 57" descr="file:/tmp/ViewElement__48qyMBVIEeetFdz5pzgWAw7163269211901735468.png"/>
+                  <wp:docPr id="57" name="Drawing 57" descr="file:/tmp/ViewElement__48qyMBVIEeetFdz5pzgWAw10453185680176944197.png"/>
                   <a:graphic xmlns:a="http://schemas.openxmlformats.org/drawingml/2006/main">
                     <a:graphicData uri="http://schemas.openxmlformats.org/drawingml/2006/picture">
                       <pic:pic xmlns:pic="http://schemas.openxmlformats.org/drawingml/2006/picture">
                         <pic:nvPicPr>
-                          <pic:cNvPr id="0" name="Picture 57" descr="file:/tmp/ViewElement__48qyMBVIEeetFdz5pzgWAw7163269211901735468.png"/>
+                          <pic:cNvPr id="0" name="Picture 57" descr="file:/tmp/ViewElement__48qyMBVIEeetFdz5pzgWAw10453185680176944197.png"/>
                           <pic:cNvPicPr>
                             <a:picLocks noChangeAspect="true"/>
                           </pic:cNvPicPr>
@@ -24905,12 +24905,12 @@
               <w:drawing>
                 <wp:inline distT="0" distR="0" distB="0" distL="0">
                   <wp:extent cx="203200" cy="177800"/>
-                  <wp:docPr id="58" name="Drawing 58" descr="file:/tmp/ViewElement__48qyMhVIEeetFdz5pzgWAw8232227678203019537.png"/>
+                  <wp:docPr id="58" name="Drawing 58" descr="file:/tmp/ViewElement__48qyMhVIEeetFdz5pzgWAw13404298959776520642.png"/>
                   <a:graphic xmlns:a="http://schemas.openxmlformats.org/drawingml/2006/main">
                     <a:graphicData uri="http://schemas.openxmlformats.org/drawingml/2006/picture">
                       <pic:pic xmlns:pic="http://schemas.openxmlformats.org/drawingml/2006/picture">
                         <pic:nvPicPr>
-                          <pic:cNvPr id="0" name="Picture 58" descr="file:/tmp/ViewElement__48qyMhVIEeetFdz5pzgWAw8232227678203019537.png"/>
+                          <pic:cNvPr id="0" name="Picture 58" descr="file:/tmp/ViewElement__48qyMhVIEeetFdz5pzgWAw13404298959776520642.png"/>
                           <pic:cNvPicPr>
                             <a:picLocks noChangeAspect="true"/>
                           </pic:cNvPicPr>
@@ -24965,12 +24965,12 @@
               <w:drawing>
                 <wp:inline distT="0" distR="0" distB="0" distL="0">
                   <wp:extent cx="203200" cy="190500"/>
-                  <wp:docPr id="59" name="Drawing 59" descr="file:/tmp/ViewElement__48qyNBVIEeetFdz5pzgWAw15146895729404637779.png"/>
+                  <wp:docPr id="59" name="Drawing 59" descr="file:/tmp/ViewElement__48qyNBVIEeetFdz5pzgWAw17895150871195425333.png"/>
                   <a:graphic xmlns:a="http://schemas.openxmlformats.org/drawingml/2006/main">
                     <a:graphicData uri="http://schemas.openxmlformats.org/drawingml/2006/picture">
                       <pic:pic xmlns:pic="http://schemas.openxmlformats.org/drawingml/2006/picture">
                         <pic:nvPicPr>
-                          <pic:cNvPr id="0" name="Picture 59" descr="file:/tmp/ViewElement__48qyNBVIEeetFdz5pzgWAw15146895729404637779.png"/>
+                          <pic:cNvPr id="0" name="Picture 59" descr="file:/tmp/ViewElement__48qyNBVIEeetFdz5pzgWAw17895150871195425333.png"/>
                           <pic:cNvPicPr>
                             <a:picLocks noChangeAspect="true"/>
                           </pic:cNvPicPr>
@@ -25025,12 +25025,12 @@
               <w:drawing>
                 <wp:inline distT="0" distR="0" distB="0" distL="0">
                   <wp:extent cx="203200" cy="190500"/>
-                  <wp:docPr id="60" name="Drawing 60" descr="file:/tmp/ViewElement__48qyOBVIEeetFdz5pzgWAw5389464366977781354.png"/>
+                  <wp:docPr id="60" name="Drawing 60" descr="file:/tmp/ViewElement__48qyOBVIEeetFdz5pzgWAw14925693430866677016.png"/>
                   <a:graphic xmlns:a="http://schemas.openxmlformats.org/drawingml/2006/main">
                     <a:graphicData uri="http://schemas.openxmlformats.org/drawingml/2006/picture">
                       <pic:pic xmlns:pic="http://schemas.openxmlformats.org/drawingml/2006/picture">
                         <pic:nvPicPr>
-                          <pic:cNvPr id="0" name="Picture 60" descr="file:/tmp/ViewElement__48qyOBVIEeetFdz5pzgWAw5389464366977781354.png"/>
+                          <pic:cNvPr id="0" name="Picture 60" descr="file:/tmp/ViewElement__48qyOBVIEeetFdz5pzgWAw14925693430866677016.png"/>
                           <pic:cNvPicPr>
                             <a:picLocks noChangeAspect="true"/>
                           </pic:cNvPicPr>
@@ -25132,12 +25132,12 @@
               <w:drawing>
                 <wp:inline distT="0" distR="0" distB="0" distL="0">
                   <wp:extent cx="203200" cy="203200"/>
-                  <wp:docPr id="61" name="Drawing 61" descr="file:/tmp/ViewContainer__48vDrhVIEeetFdz5pzgWAw17683175812735203450.png"/>
+                  <wp:docPr id="61" name="Drawing 61" descr="file:/tmp/ViewContainer__48vDrhVIEeetFdz5pzgWAw9355452468413700180.png"/>
                   <a:graphic xmlns:a="http://schemas.openxmlformats.org/drawingml/2006/main">
                     <a:graphicData uri="http://schemas.openxmlformats.org/drawingml/2006/picture">
                       <pic:pic xmlns:pic="http://schemas.openxmlformats.org/drawingml/2006/picture">
                         <pic:nvPicPr>
-                          <pic:cNvPr id="0" name="Picture 61" descr="file:/tmp/ViewContainer__48vDrhVIEeetFdz5pzgWAw17683175812735203450.png"/>
+                          <pic:cNvPr id="0" name="Picture 61" descr="file:/tmp/ViewContainer__48vDrhVIEeetFdz5pzgWAw9355452468413700180.png"/>
                           <pic:cNvPicPr>
                             <a:picLocks noChangeAspect="true"/>
                           </pic:cNvPicPr>
@@ -25192,12 +25192,12 @@
               <w:drawing>
                 <wp:inline distT="0" distR="0" distB="0" distL="0">
                   <wp:extent cx="203200" cy="177800"/>
-                  <wp:docPr id="62" name="Drawing 62" descr="file:/tmp/ViewElement__48vDsBVIEeetFdz5pzgWAw9972735714637813655.png"/>
+                  <wp:docPr id="62" name="Drawing 62" descr="file:/tmp/ViewElement__48vDsBVIEeetFdz5pzgWAw6749632363422228398.png"/>
                   <a:graphic xmlns:a="http://schemas.openxmlformats.org/drawingml/2006/main">
                     <a:graphicData uri="http://schemas.openxmlformats.org/drawingml/2006/picture">
                       <pic:pic xmlns:pic="http://schemas.openxmlformats.org/drawingml/2006/picture">
                         <pic:nvPicPr>
-                          <pic:cNvPr id="0" name="Picture 62" descr="file:/tmp/ViewElement__48vDsBVIEeetFdz5pzgWAw9972735714637813655.png"/>
+                          <pic:cNvPr id="0" name="Picture 62" descr="file:/tmp/ViewElement__48vDsBVIEeetFdz5pzgWAw6749632363422228398.png"/>
                           <pic:cNvPicPr>
                             <a:picLocks noChangeAspect="true"/>
                           </pic:cNvPicPr>
@@ -25252,12 +25252,12 @@
               <w:drawing>
                 <wp:inline distT="0" distR="0" distB="0" distL="0">
                   <wp:extent cx="203200" cy="203200"/>
-                  <wp:docPr id="63" name="Drawing 63" descr="file:/tmp/ViewElement__48vDshVIEeetFdz5pzgWAw9525264284419161381.png"/>
+                  <wp:docPr id="63" name="Drawing 63" descr="file:/tmp/ViewElement__48vDshVIEeetFdz5pzgWAw14647829853575218540.png"/>
                   <a:graphic xmlns:a="http://schemas.openxmlformats.org/drawingml/2006/main">
                     <a:graphicData uri="http://schemas.openxmlformats.org/drawingml/2006/picture">
                       <pic:pic xmlns:pic="http://schemas.openxmlformats.org/drawingml/2006/picture">
                         <pic:nvPicPr>
-                          <pic:cNvPr id="0" name="Picture 63" descr="file:/tmp/ViewElement__48vDshVIEeetFdz5pzgWAw9525264284419161381.png"/>
+                          <pic:cNvPr id="0" name="Picture 63" descr="file:/tmp/ViewElement__48vDshVIEeetFdz5pzgWAw14647829853575218540.png"/>
                           <pic:cNvPicPr>
                             <a:picLocks noChangeAspect="true"/>
                           </pic:cNvPicPr>
@@ -25312,12 +25312,12 @@
               <w:drawing>
                 <wp:inline distT="0" distR="0" distB="0" distL="0">
                   <wp:extent cx="203200" cy="190500"/>
-                  <wp:docPr id="64" name="Drawing 64" descr="file:/tmp/ViewElement__48vDtBVIEeetFdz5pzgWAw11620670644241241539.png"/>
+                  <wp:docPr id="64" name="Drawing 64" descr="file:/tmp/ViewElement__48vDtBVIEeetFdz5pzgWAw11401645151138966564.png"/>
                   <a:graphic xmlns:a="http://schemas.openxmlformats.org/drawingml/2006/main">
                     <a:graphicData uri="http://schemas.openxmlformats.org/drawingml/2006/picture">
                       <pic:pic xmlns:pic="http://schemas.openxmlformats.org/drawingml/2006/picture">
                         <pic:nvPicPr>
-                          <pic:cNvPr id="0" name="Picture 64" descr="file:/tmp/ViewElement__48vDtBVIEeetFdz5pzgWAw11620670644241241539.png"/>
+                          <pic:cNvPr id="0" name="Picture 64" descr="file:/tmp/ViewElement__48vDtBVIEeetFdz5pzgWAw11401645151138966564.png"/>
                           <pic:cNvPicPr>
                             <a:picLocks noChangeAspect="true"/>
                           </pic:cNvPicPr>
@@ -25372,12 +25372,12 @@
               <w:drawing>
                 <wp:inline distT="0" distR="0" distB="0" distL="0">
                   <wp:extent cx="203200" cy="190500"/>
-                  <wp:docPr id="65" name="Drawing 65" descr="file:/tmp/ViewElement__48vDuBVIEeetFdz5pzgWAw5517032725234521913.png"/>
+                  <wp:docPr id="65" name="Drawing 65" descr="file:/tmp/ViewElement__48vDuBVIEeetFdz5pzgWAw10301766309436710385.png"/>
                   <a:graphic xmlns:a="http://schemas.openxmlformats.org/drawingml/2006/main">
                     <a:graphicData uri="http://schemas.openxmlformats.org/drawingml/2006/picture">
                       <pic:pic xmlns:pic="http://schemas.openxmlformats.org/drawingml/2006/picture">
                         <pic:nvPicPr>
-                          <pic:cNvPr id="0" name="Picture 65" descr="file:/tmp/ViewElement__48vDuBVIEeetFdz5pzgWAw5517032725234521913.png"/>
+                          <pic:cNvPr id="0" name="Picture 65" descr="file:/tmp/ViewElement__48vDuBVIEeetFdz5pzgWAw10301766309436710385.png"/>
                           <pic:cNvPicPr>
                             <a:picLocks noChangeAspect="true"/>
                           </pic:cNvPicPr>
@@ -25432,12 +25432,12 @@
               <w:drawing>
                 <wp:inline distT="0" distR="0" distB="0" distL="0">
                   <wp:extent cx="203200" cy="177800"/>
-                  <wp:docPr id="66" name="Drawing 66" descr="file:/tmp/ViewElement__48vDvBVIEeetFdz5pzgWAw12221278636999564968.png"/>
+                  <wp:docPr id="66" name="Drawing 66" descr="file:/tmp/ViewElement__48vDvBVIEeetFdz5pzgWAw12923759806285109238.png"/>
                   <a:graphic xmlns:a="http://schemas.openxmlformats.org/drawingml/2006/main">
                     <a:graphicData uri="http://schemas.openxmlformats.org/drawingml/2006/picture">
                       <pic:pic xmlns:pic="http://schemas.openxmlformats.org/drawingml/2006/picture">
                         <pic:nvPicPr>
-                          <pic:cNvPr id="0" name="Picture 66" descr="file:/tmp/ViewElement__48vDvBVIEeetFdz5pzgWAw12221278636999564968.png"/>
+                          <pic:cNvPr id="0" name="Picture 66" descr="file:/tmp/ViewElement__48vDvBVIEeetFdz5pzgWAw12923759806285109238.png"/>
                           <pic:cNvPicPr>
                             <a:picLocks noChangeAspect="true"/>
                           </pic:cNvPicPr>
@@ -25539,12 +25539,12 @@
               <w:drawing>
                 <wp:inline distT="0" distR="0" distB="0" distL="0">
                   <wp:extent cx="203200" cy="203200"/>
-                  <wp:docPr id="67" name="Drawing 67" descr="file:/tmp/ViewContainer__48vDwBVIEeetFdz5pzgWAw6692370827179843188.png"/>
+                  <wp:docPr id="67" name="Drawing 67" descr="file:/tmp/ViewContainer__48vDwBVIEeetFdz5pzgWAw12592397758674036829.png"/>
                   <a:graphic xmlns:a="http://schemas.openxmlformats.org/drawingml/2006/main">
                     <a:graphicData uri="http://schemas.openxmlformats.org/drawingml/2006/picture">
                       <pic:pic xmlns:pic="http://schemas.openxmlformats.org/drawingml/2006/picture">
                         <pic:nvPicPr>
-                          <pic:cNvPr id="0" name="Picture 67" descr="file:/tmp/ViewContainer__48vDwBVIEeetFdz5pzgWAw6692370827179843188.png"/>
+                          <pic:cNvPr id="0" name="Picture 67" descr="file:/tmp/ViewContainer__48vDwBVIEeetFdz5pzgWAw12592397758674036829.png"/>
                           <pic:cNvPicPr>
                             <a:picLocks noChangeAspect="true"/>
                           </pic:cNvPicPr>
@@ -25599,12 +25599,12 @@
               <w:drawing>
                 <wp:inline distT="0" distR="0" distB="0" distL="0">
                   <wp:extent cx="203200" cy="177800"/>
-                  <wp:docPr id="68" name="Drawing 68" descr="file:/tmp/ViewElement__48vDwhVIEeetFdz5pzgWAw1619031671787570619.png"/>
+                  <wp:docPr id="68" name="Drawing 68" descr="file:/tmp/ViewElement__48vDwhVIEeetFdz5pzgWAw2272310703113293800.png"/>
                   <a:graphic xmlns:a="http://schemas.openxmlformats.org/drawingml/2006/main">
                     <a:graphicData uri="http://schemas.openxmlformats.org/drawingml/2006/picture">
                       <pic:pic xmlns:pic="http://schemas.openxmlformats.org/drawingml/2006/picture">
                         <pic:nvPicPr>
-                          <pic:cNvPr id="0" name="Picture 68" descr="file:/tmp/ViewElement__48vDwhVIEeetFdz5pzgWAw1619031671787570619.png"/>
+                          <pic:cNvPr id="0" name="Picture 68" descr="file:/tmp/ViewElement__48vDwhVIEeetFdz5pzgWAw2272310703113293800.png"/>
                           <pic:cNvPicPr>
                             <a:picLocks noChangeAspect="true"/>
                           </pic:cNvPicPr>
@@ -25659,12 +25659,12 @@
               <w:drawing>
                 <wp:inline distT="0" distR="0" distB="0" distL="0">
                   <wp:extent cx="203200" cy="177800"/>
-                  <wp:docPr id="69" name="Drawing 69" descr="file:/tmp/ViewElement__48vDxBVIEeetFdz5pzgWAw2451894357258490171.png"/>
+                  <wp:docPr id="69" name="Drawing 69" descr="file:/tmp/ViewElement__48vDxBVIEeetFdz5pzgWAw2771163007522341826.png"/>
                   <a:graphic xmlns:a="http://schemas.openxmlformats.org/drawingml/2006/main">
                     <a:graphicData uri="http://schemas.openxmlformats.org/drawingml/2006/picture">
                       <pic:pic xmlns:pic="http://schemas.openxmlformats.org/drawingml/2006/picture">
                         <pic:nvPicPr>
-                          <pic:cNvPr id="0" name="Picture 69" descr="file:/tmp/ViewElement__48vDxBVIEeetFdz5pzgWAw2451894357258490171.png"/>
+                          <pic:cNvPr id="0" name="Picture 69" descr="file:/tmp/ViewElement__48vDxBVIEeetFdz5pzgWAw2771163007522341826.png"/>
                           <pic:cNvPicPr>
                             <a:picLocks noChangeAspect="true"/>
                           </pic:cNvPicPr>
@@ -25719,12 +25719,12 @@
               <w:drawing>
                 <wp:inline distT="0" distR="0" distB="0" distL="0">
                   <wp:extent cx="203200" cy="177800"/>
-                  <wp:docPr id="70" name="Drawing 70" descr="file:/tmp/ViewElement__48vDxhVIEeetFdz5pzgWAw3053166383561164226.png"/>
+                  <wp:docPr id="70" name="Drawing 70" descr="file:/tmp/ViewElement__48vDxhVIEeetFdz5pzgWAw12899894596035890401.png"/>
                   <a:graphic xmlns:a="http://schemas.openxmlformats.org/drawingml/2006/main">
                     <a:graphicData uri="http://schemas.openxmlformats.org/drawingml/2006/picture">
                       <pic:pic xmlns:pic="http://schemas.openxmlformats.org/drawingml/2006/picture">
                         <pic:nvPicPr>
-                          <pic:cNvPr id="0" name="Picture 70" descr="file:/tmp/ViewElement__48vDxhVIEeetFdz5pzgWAw3053166383561164226.png"/>
+                          <pic:cNvPr id="0" name="Picture 70" descr="file:/tmp/ViewElement__48vDxhVIEeetFdz5pzgWAw12899894596035890401.png"/>
                           <pic:cNvPicPr>
                             <a:picLocks noChangeAspect="true"/>
                           </pic:cNvPicPr>
@@ -25779,12 +25779,12 @@
               <w:drawing>
                 <wp:inline distT="0" distR="0" distB="0" distL="0">
                   <wp:extent cx="203200" cy="190500"/>
-                  <wp:docPr id="71" name="Drawing 71" descr="file:/tmp/ViewElement__48vDyBVIEeetFdz5pzgWAw1322419776846618431.png"/>
+                  <wp:docPr id="71" name="Drawing 71" descr="file:/tmp/ViewElement__48vDyBVIEeetFdz5pzgWAw12346963205887033042.png"/>
                   <a:graphic xmlns:a="http://schemas.openxmlformats.org/drawingml/2006/main">
                     <a:graphicData uri="http://schemas.openxmlformats.org/drawingml/2006/picture">
                       <pic:pic xmlns:pic="http://schemas.openxmlformats.org/drawingml/2006/picture">
                         <pic:nvPicPr>
-                          <pic:cNvPr id="0" name="Picture 71" descr="file:/tmp/ViewElement__48vDyBVIEeetFdz5pzgWAw1322419776846618431.png"/>
+                          <pic:cNvPr id="0" name="Picture 71" descr="file:/tmp/ViewElement__48vDyBVIEeetFdz5pzgWAw12346963205887033042.png"/>
                           <pic:cNvPicPr>
                             <a:picLocks noChangeAspect="true"/>
                           </pic:cNvPicPr>
@@ -25839,12 +25839,12 @@
               <w:drawing>
                 <wp:inline distT="0" distR="0" distB="0" distL="0">
                   <wp:extent cx="203200" cy="190500"/>
-                  <wp:docPr id="72" name="Drawing 72" descr="file:/tmp/ViewElement__48vDzBVIEeetFdz5pzgWAw154242135002376637.png"/>
+                  <wp:docPr id="72" name="Drawing 72" descr="file:/tmp/ViewElement__48vDzBVIEeetFdz5pzgWAw8061451783944092138.png"/>
                   <a:graphic xmlns:a="http://schemas.openxmlformats.org/drawingml/2006/main">
                     <a:graphicData uri="http://schemas.openxmlformats.org/drawingml/2006/picture">
                       <pic:pic xmlns:pic="http://schemas.openxmlformats.org/drawingml/2006/picture">
                         <pic:nvPicPr>
-                          <pic:cNvPr id="0" name="Picture 72" descr="file:/tmp/ViewElement__48vDzBVIEeetFdz5pzgWAw154242135002376637.png"/>
+                          <pic:cNvPr id="0" name="Picture 72" descr="file:/tmp/ViewElement__48vDzBVIEeetFdz5pzgWAw8061451783944092138.png"/>
                           <pic:cNvPicPr>
                             <a:picLocks noChangeAspect="true"/>
                           </pic:cNvPicPr>
@@ -25946,12 +25946,12 @@
               <w:drawing>
                 <wp:inline distT="0" distR="0" distB="0" distL="0">
                   <wp:extent cx="203200" cy="203200"/>
-                  <wp:docPr id="73" name="Drawing 73" descr="file:/tmp/ViewContainer__48vDrhVIEeetFdz5pzgWAw4656430655936428834.png"/>
+                  <wp:docPr id="73" name="Drawing 73" descr="file:/tmp/ViewContainer__48vDrhVIEeetFdz5pzgWAw2312758188048387673.png"/>
                   <a:graphic xmlns:a="http://schemas.openxmlformats.org/drawingml/2006/main">
                     <a:graphicData uri="http://schemas.openxmlformats.org/drawingml/2006/picture">
                       <pic:pic xmlns:pic="http://schemas.openxmlformats.org/drawingml/2006/picture">
                         <pic:nvPicPr>
-                          <pic:cNvPr id="0" name="Picture 73" descr="file:/tmp/ViewContainer__48vDrhVIEeetFdz5pzgWAw4656430655936428834.png"/>
+                          <pic:cNvPr id="0" name="Picture 73" descr="file:/tmp/ViewContainer__48vDrhVIEeetFdz5pzgWAw2312758188048387673.png"/>
                           <pic:cNvPicPr>
                             <a:picLocks noChangeAspect="true"/>
                           </pic:cNvPicPr>
@@ -26006,12 +26006,12 @@
               <w:drawing>
                 <wp:inline distT="0" distR="0" distB="0" distL="0">
                   <wp:extent cx="203200" cy="177800"/>
-                  <wp:docPr id="74" name="Drawing 74" descr="file:/tmp/ViewElement__48vDsBVIEeetFdz5pzgWAw15806978803302864098.png"/>
+                  <wp:docPr id="74" name="Drawing 74" descr="file:/tmp/ViewElement__48vDsBVIEeetFdz5pzgWAw14608519882151813419.png"/>
                   <a:graphic xmlns:a="http://schemas.openxmlformats.org/drawingml/2006/main">
                     <a:graphicData uri="http://schemas.openxmlformats.org/drawingml/2006/picture">
                       <pic:pic xmlns:pic="http://schemas.openxmlformats.org/drawingml/2006/picture">
                         <pic:nvPicPr>
-                          <pic:cNvPr id="0" name="Picture 74" descr="file:/tmp/ViewElement__48vDsBVIEeetFdz5pzgWAw15806978803302864098.png"/>
+                          <pic:cNvPr id="0" name="Picture 74" descr="file:/tmp/ViewElement__48vDsBVIEeetFdz5pzgWAw14608519882151813419.png"/>
                           <pic:cNvPicPr>
                             <a:picLocks noChangeAspect="true"/>
                           </pic:cNvPicPr>
@@ -26066,12 +26066,12 @@
               <w:drawing>
                 <wp:inline distT="0" distR="0" distB="0" distL="0">
                   <wp:extent cx="203200" cy="203200"/>
-                  <wp:docPr id="75" name="Drawing 75" descr="file:/tmp/ViewElement__48vDshVIEeetFdz5pzgWAw8568800544294448876.png"/>
+                  <wp:docPr id="75" name="Drawing 75" descr="file:/tmp/ViewElement__48vDshVIEeetFdz5pzgWAw2390043565135477331.png"/>
                   <a:graphic xmlns:a="http://schemas.openxmlformats.org/drawingml/2006/main">
                     <a:graphicData uri="http://schemas.openxmlformats.org/drawingml/2006/picture">
                       <pic:pic xmlns:pic="http://schemas.openxmlformats.org/drawingml/2006/picture">
                         <pic:nvPicPr>
-                          <pic:cNvPr id="0" name="Picture 75" descr="file:/tmp/ViewElement__48vDshVIEeetFdz5pzgWAw8568800544294448876.png"/>
+                          <pic:cNvPr id="0" name="Picture 75" descr="file:/tmp/ViewElement__48vDshVIEeetFdz5pzgWAw2390043565135477331.png"/>
                           <pic:cNvPicPr>
                             <a:picLocks noChangeAspect="true"/>
                           </pic:cNvPicPr>
@@ -26126,12 +26126,12 @@
               <w:drawing>
                 <wp:inline distT="0" distR="0" distB="0" distL="0">
                   <wp:extent cx="203200" cy="190500"/>
-                  <wp:docPr id="76" name="Drawing 76" descr="file:/tmp/ViewElement__48vDtBVIEeetFdz5pzgWAw17481143917103043092.png"/>
+                  <wp:docPr id="76" name="Drawing 76" descr="file:/tmp/ViewElement__48vDtBVIEeetFdz5pzgWAw1466402457335299526.png"/>
                   <a:graphic xmlns:a="http://schemas.openxmlformats.org/drawingml/2006/main">
                     <a:graphicData uri="http://schemas.openxmlformats.org/drawingml/2006/picture">
                       <pic:pic xmlns:pic="http://schemas.openxmlformats.org/drawingml/2006/picture">
                         <pic:nvPicPr>
-                          <pic:cNvPr id="0" name="Picture 76" descr="file:/tmp/ViewElement__48vDtBVIEeetFdz5pzgWAw17481143917103043092.png"/>
+                          <pic:cNvPr id="0" name="Picture 76" descr="file:/tmp/ViewElement__48vDtBVIEeetFdz5pzgWAw1466402457335299526.png"/>
                           <pic:cNvPicPr>
                             <a:picLocks noChangeAspect="true"/>
                           </pic:cNvPicPr>
@@ -26186,12 +26186,12 @@
               <w:drawing>
                 <wp:inline distT="0" distR="0" distB="0" distL="0">
                   <wp:extent cx="203200" cy="190500"/>
-                  <wp:docPr id="77" name="Drawing 77" descr="file:/tmp/ViewElement__48vDuBVIEeetFdz5pzgWAw415426640830551128.png"/>
+                  <wp:docPr id="77" name="Drawing 77" descr="file:/tmp/ViewElement__48vDuBVIEeetFdz5pzgWAw2753325094218711897.png"/>
                   <a:graphic xmlns:a="http://schemas.openxmlformats.org/drawingml/2006/main">
                     <a:graphicData uri="http://schemas.openxmlformats.org/drawingml/2006/picture">
                       <pic:pic xmlns:pic="http://schemas.openxmlformats.org/drawingml/2006/picture">
                         <pic:nvPicPr>
-                          <pic:cNvPr id="0" name="Picture 77" descr="file:/tmp/ViewElement__48vDuBVIEeetFdz5pzgWAw415426640830551128.png"/>
+                          <pic:cNvPr id="0" name="Picture 77" descr="file:/tmp/ViewElement__48vDuBVIEeetFdz5pzgWAw2753325094218711897.png"/>
                           <pic:cNvPicPr>
                             <a:picLocks noChangeAspect="true"/>
                           </pic:cNvPicPr>
@@ -26246,12 +26246,12 @@
               <w:drawing>
                 <wp:inline distT="0" distR="0" distB="0" distL="0">
                   <wp:extent cx="203200" cy="177800"/>
-                  <wp:docPr id="78" name="Drawing 78" descr="file:/tmp/ViewElement__48vDvBVIEeetFdz5pzgWAw2597862241352539727.png"/>
+                  <wp:docPr id="78" name="Drawing 78" descr="file:/tmp/ViewElement__48vDvBVIEeetFdz5pzgWAw16930845205177967763.png"/>
                   <a:graphic xmlns:a="http://schemas.openxmlformats.org/drawingml/2006/main">
                     <a:graphicData uri="http://schemas.openxmlformats.org/drawingml/2006/picture">
                       <pic:pic xmlns:pic="http://schemas.openxmlformats.org/drawingml/2006/picture">
                         <pic:nvPicPr>
-                          <pic:cNvPr id="0" name="Picture 78" descr="file:/tmp/ViewElement__48vDvBVIEeetFdz5pzgWAw2597862241352539727.png"/>
+                          <pic:cNvPr id="0" name="Picture 78" descr="file:/tmp/ViewElement__48vDvBVIEeetFdz5pzgWAw16930845205177967763.png"/>
                           <pic:cNvPicPr>
                             <a:picLocks noChangeAspect="true"/>
                           </pic:cNvPicPr>
@@ -26353,12 +26353,12 @@
               <w:drawing>
                 <wp:inline distT="0" distR="0" distB="0" distL="0">
                   <wp:extent cx="203200" cy="203200"/>
-                  <wp:docPr id="79" name="Drawing 79" descr="file:/tmp/ViewContainer__48vDwBVIEeetFdz5pzgWAw10703313197312491899.png"/>
+                  <wp:docPr id="79" name="Drawing 79" descr="file:/tmp/ViewContainer__48vDwBVIEeetFdz5pzgWAw2937808080379025462.png"/>
                   <a:graphic xmlns:a="http://schemas.openxmlformats.org/drawingml/2006/main">
                     <a:graphicData uri="http://schemas.openxmlformats.org/drawingml/2006/picture">
                       <pic:pic xmlns:pic="http://schemas.openxmlformats.org/drawingml/2006/picture">
                         <pic:nvPicPr>
-                          <pic:cNvPr id="0" name="Picture 79" descr="file:/tmp/ViewContainer__48vDwBVIEeetFdz5pzgWAw10703313197312491899.png"/>
+                          <pic:cNvPr id="0" name="Picture 79" descr="file:/tmp/ViewContainer__48vDwBVIEeetFdz5pzgWAw2937808080379025462.png"/>
                           <pic:cNvPicPr>
                             <a:picLocks noChangeAspect="true"/>
                           </pic:cNvPicPr>
@@ -26413,12 +26413,12 @@
               <w:drawing>
                 <wp:inline distT="0" distR="0" distB="0" distL="0">
                   <wp:extent cx="203200" cy="177800"/>
-                  <wp:docPr id="80" name="Drawing 80" descr="file:/tmp/ViewElement__48vDwhVIEeetFdz5pzgWAw5767673027084592550.png"/>
+                  <wp:docPr id="80" name="Drawing 80" descr="file:/tmp/ViewElement__48vDwhVIEeetFdz5pzgWAw15770858472393753899.png"/>
                   <a:graphic xmlns:a="http://schemas.openxmlformats.org/drawingml/2006/main">
                     <a:graphicData uri="http://schemas.openxmlformats.org/drawingml/2006/picture">
                       <pic:pic xmlns:pic="http://schemas.openxmlformats.org/drawingml/2006/picture">
                         <pic:nvPicPr>
-                          <pic:cNvPr id="0" name="Picture 80" descr="file:/tmp/ViewElement__48vDwhVIEeetFdz5pzgWAw5767673027084592550.png"/>
+                          <pic:cNvPr id="0" name="Picture 80" descr="file:/tmp/ViewElement__48vDwhVIEeetFdz5pzgWAw15770858472393753899.png"/>
                           <pic:cNvPicPr>
                             <a:picLocks noChangeAspect="true"/>
                           </pic:cNvPicPr>
@@ -26473,12 +26473,12 @@
               <w:drawing>
                 <wp:inline distT="0" distR="0" distB="0" distL="0">
                   <wp:extent cx="203200" cy="177800"/>
-                  <wp:docPr id="81" name="Drawing 81" descr="file:/tmp/ViewElement__48vDxBVIEeetFdz5pzgWAw12347469551901079493.png"/>
+                  <wp:docPr id="81" name="Drawing 81" descr="file:/tmp/ViewElement__48vDxBVIEeetFdz5pzgWAw1070248259891127210.png"/>
                   <a:graphic xmlns:a="http://schemas.openxmlformats.org/drawingml/2006/main">
                     <a:graphicData uri="http://schemas.openxmlformats.org/drawingml/2006/picture">
                       <pic:pic xmlns:pic="http://schemas.openxmlformats.org/drawingml/2006/picture">
                         <pic:nvPicPr>
-                          <pic:cNvPr id="0" name="Picture 81" descr="file:/tmp/ViewElement__48vDxBVIEeetFdz5pzgWAw12347469551901079493.png"/>
+                          <pic:cNvPr id="0" name="Picture 81" descr="file:/tmp/ViewElement__48vDxBVIEeetFdz5pzgWAw1070248259891127210.png"/>
                           <pic:cNvPicPr>
                             <a:picLocks noChangeAspect="true"/>
                           </pic:cNvPicPr>
@@ -26533,12 +26533,12 @@
               <w:drawing>
                 <wp:inline distT="0" distR="0" distB="0" distL="0">
                   <wp:extent cx="203200" cy="177800"/>
-                  <wp:docPr id="82" name="Drawing 82" descr="file:/tmp/ViewElement__48vDxhVIEeetFdz5pzgWAw2015197134271891646.png"/>
+                  <wp:docPr id="82" name="Drawing 82" descr="file:/tmp/ViewElement__48vDxhVIEeetFdz5pzgWAw8495084182501680419.png"/>
                   <a:graphic xmlns:a="http://schemas.openxmlformats.org/drawingml/2006/main">
                     <a:graphicData uri="http://schemas.openxmlformats.org/drawingml/2006/picture">
                       <pic:pic xmlns:pic="http://schemas.openxmlformats.org/drawingml/2006/picture">
                         <pic:nvPicPr>
-                          <pic:cNvPr id="0" name="Picture 82" descr="file:/tmp/ViewElement__48vDxhVIEeetFdz5pzgWAw2015197134271891646.png"/>
+                          <pic:cNvPr id="0" name="Picture 82" descr="file:/tmp/ViewElement__48vDxhVIEeetFdz5pzgWAw8495084182501680419.png"/>
                           <pic:cNvPicPr>
                             <a:picLocks noChangeAspect="true"/>
                           </pic:cNvPicPr>
@@ -26593,12 +26593,12 @@
               <w:drawing>
                 <wp:inline distT="0" distR="0" distB="0" distL="0">
                   <wp:extent cx="203200" cy="190500"/>
-                  <wp:docPr id="83" name="Drawing 83" descr="file:/tmp/ViewElement__48vDyBVIEeetFdz5pzgWAw3684479240844910004.png"/>
+                  <wp:docPr id="83" name="Drawing 83" descr="file:/tmp/ViewElement__48vDyBVIEeetFdz5pzgWAw963073821406745315.png"/>
                   <a:graphic xmlns:a="http://schemas.openxmlformats.org/drawingml/2006/main">
                     <a:graphicData uri="http://schemas.openxmlformats.org/drawingml/2006/picture">
                       <pic:pic xmlns:pic="http://schemas.openxmlformats.org/drawingml/2006/picture">
                         <pic:nvPicPr>
-                          <pic:cNvPr id="0" name="Picture 83" descr="file:/tmp/ViewElement__48vDyBVIEeetFdz5pzgWAw3684479240844910004.png"/>
+                          <pic:cNvPr id="0" name="Picture 83" descr="file:/tmp/ViewElement__48vDyBVIEeetFdz5pzgWAw963073821406745315.png"/>
                           <pic:cNvPicPr>
                             <a:picLocks noChangeAspect="true"/>
                           </pic:cNvPicPr>
@@ -26653,12 +26653,12 @@
               <w:drawing>
                 <wp:inline distT="0" distR="0" distB="0" distL="0">
                   <wp:extent cx="203200" cy="190500"/>
-                  <wp:docPr id="84" name="Drawing 84" descr="file:/tmp/ViewElement__48vDzBVIEeetFdz5pzgWAw12088432899288681985.png"/>
+                  <wp:docPr id="84" name="Drawing 84" descr="file:/tmp/ViewElement__48vDzBVIEeetFdz5pzgWAw4209445003261584157.png"/>
                   <a:graphic xmlns:a="http://schemas.openxmlformats.org/drawingml/2006/main">
                     <a:graphicData uri="http://schemas.openxmlformats.org/drawingml/2006/picture">
                       <pic:pic xmlns:pic="http://schemas.openxmlformats.org/drawingml/2006/picture">
                         <pic:nvPicPr>
-                          <pic:cNvPr id="0" name="Picture 84" descr="file:/tmp/ViewElement__48vDzBVIEeetFdz5pzgWAw12088432899288681985.png"/>
+                          <pic:cNvPr id="0" name="Picture 84" descr="file:/tmp/ViewElement__48vDzBVIEeetFdz5pzgWAw4209445003261584157.png"/>
                           <pic:cNvPicPr>
                             <a:picLocks noChangeAspect="true"/>
                           </pic:cNvPicPr>

</xml_diff>